<commit_message>
assessments(s1-cl1): tidy AT presentation + reflect KE requirements on student assessment
Tidy the presentation of the S1 CL1 AT1/AT2/AT3 assessment instruments and
exemplars, and ensure Knowledge Evidence requirements are correctly reflected
in step with the student templates students complete for assessment.

Co-Authored-By: Claude Opus 4.8 (1M context) <noreply@anthropic.com>
</commit_message>
<xml_diff>
--- a/S1-CL1-Cloud-Design-Build/assessments/AT1/AT1-BusinessCase-Student.docx
+++ b/S1-CL1-Cloud-Design-Build/assessments/AT1/AT1-BusinessCase-Student.docx
@@ -1,6 +1,6 @@
 
 <file path=word/document.xml><?xml version="1.0" encoding="utf-8"?>
-<w:document xmlns:wpc="http://schemas.microsoft.com/office/word/2010/wordprocessingCanvas" xmlns:cx="http://schemas.microsoft.com/office/drawing/2014/chartex" xmlns:cx1="http://schemas.microsoft.com/office/drawing/2015/9/8/chartex" xmlns:cx2="http://schemas.microsoft.com/office/drawing/2015/10/21/chartex" xmlns:cx3="http://schemas.microsoft.com/office/drawing/2016/5/9/chartex" xmlns:cx4="http://schemas.microsoft.com/office/drawing/2016/5/10/chartex" xmlns:cx5="http://schemas.microsoft.com/office/drawing/2016/5/11/chartex" xmlns:cx6="http://schemas.microsoft.com/office/drawing/2016/5/12/chartex" xmlns:cx7="http://schemas.microsoft.com/office/drawing/2016/5/13/chartex" xmlns:cx8="http://schemas.microsoft.com/office/drawing/2016/5/14/chartex" xmlns:mc="http://schemas.openxmlformats.org/markup-compatibility/2006" xmlns:aink="http://schemas.microsoft.com/office/drawing/2016/ink" xmlns:am3d="http://schemas.microsoft.com/office/drawing/2017/model3d" xmlns:o="urn:schemas-microsoft-com:office:office" xmlns:oel="http://schemas.microsoft.com/office/2019/extlst" xmlns:r="http://schemas.openxmlformats.org/officeDocument/2006/relationships" xmlns:m="http://schemas.openxmlformats.org/officeDocument/2006/math" xmlns:v="urn:schemas-microsoft-com:vml" xmlns:wp14="http://schemas.microsoft.com/office/word/2010/wordprocessingDrawing" xmlns:wp="http://schemas.openxmlformats.org/drawingml/2006/wordprocessingDrawing" xmlns:w10="urn:schemas-microsoft-com:office:word" xmlns:w="http://schemas.openxmlformats.org/wordprocessingml/2006/main" xmlns:w14="http://schemas.microsoft.com/office/word/2010/wordml" xmlns:w15="http://schemas.microsoft.com/office/word/2012/wordml" xmlns:w16cex="http://schemas.microsoft.com/office/word/2018/wordml/cex" xmlns:w16cid="http://schemas.microsoft.com/office/word/2016/wordml/cid" xmlns:w16="http://schemas.microsoft.com/office/word/2018/wordml" xmlns:w16sdtdh="http://schemas.microsoft.com/office/word/2020/wordml/sdtdatahash" xmlns:w16se="http://schemas.microsoft.com/office/word/2015/wordml/symex" xmlns:wpg="http://schemas.microsoft.com/office/word/2010/wordprocessingGroup" xmlns:wpi="http://schemas.microsoft.com/office/word/2010/wordprocessingInk" xmlns:wne="http://schemas.microsoft.com/office/word/2006/wordml" xmlns:wps="http://schemas.microsoft.com/office/word/2010/wordprocessingShape" mc:Ignorable="w14 w15 w16se w16cid w16 w16cex w16sdtdh wp14">
+<w:document xmlns:wpc="http://schemas.microsoft.com/office/word/2010/wordprocessingCanvas" xmlns:cx="http://schemas.microsoft.com/office/drawing/2014/chartex" xmlns:cx1="http://schemas.microsoft.com/office/drawing/2015/9/8/chartex" xmlns:cx2="http://schemas.microsoft.com/office/drawing/2015/10/21/chartex" xmlns:cx3="http://schemas.microsoft.com/office/drawing/2016/5/9/chartex" xmlns:cx4="http://schemas.microsoft.com/office/drawing/2016/5/10/chartex" xmlns:cx5="http://schemas.microsoft.com/office/drawing/2016/5/11/chartex" xmlns:cx6="http://schemas.microsoft.com/office/drawing/2016/5/12/chartex" xmlns:cx7="http://schemas.microsoft.com/office/drawing/2016/5/13/chartex" xmlns:cx8="http://schemas.microsoft.com/office/drawing/2016/5/14/chartex" xmlns:mc="http://schemas.openxmlformats.org/markup-compatibility/2006" xmlns:m="http://schemas.openxmlformats.org/officeDocument/2006/math" xmlns:aink="http://schemas.microsoft.com/office/drawing/2016/ink" xmlns:am3d="http://schemas.microsoft.com/office/drawing/2017/model3d" xmlns:oel="http://schemas.microsoft.com/office/2019/extlst" xmlns:r="http://schemas.openxmlformats.org/officeDocument/2006/relationships" xmlns:wp14="http://schemas.microsoft.com/office/word/2010/wordprocessingDrawing" xmlns:wp="http://schemas.openxmlformats.org/drawingml/2006/wordprocessingDrawing" xmlns:wpg="http://schemas.microsoft.com/office/word/2010/wordprocessingGroup" xmlns:wpi="http://schemas.microsoft.com/office/word/2010/wordprocessingInk" xmlns:wps="http://schemas.microsoft.com/office/word/2010/wordprocessingShape" xmlns:o="urn:schemas-microsoft-com:office:office" xmlns:v="urn:schemas-microsoft-com:vml" xmlns:w10="urn:schemas-microsoft-com:office:word" xmlns:w="http://schemas.openxmlformats.org/wordprocessingml/2006/main" xmlns:w14="http://schemas.microsoft.com/office/word/2010/wordml" xmlns:w15="http://schemas.microsoft.com/office/word/2012/wordml" xmlns:w16cex="http://schemas.microsoft.com/office/word/2018/wordml/cex" xmlns:w16cid="http://schemas.microsoft.com/office/word/2016/wordml/cid" xmlns:w16="http://schemas.microsoft.com/office/word/2018/wordml" xmlns:w16sdtdh="http://schemas.microsoft.com/office/word/2020/wordml/sdtdatahash" xmlns:w16sdtfl="http://schemas.microsoft.com/office/word/2024/wordml/sdtformatlock" xmlns:w16se="http://schemas.microsoft.com/office/word/2015/wordml/symex" xmlns:w16du="http://schemas.microsoft.com/office/word/2023/wordml/word16du" xmlns:wne="http://schemas.microsoft.com/office/word/2006/wordml" mc:Ignorable="w14 w15 w16se w16cid w16 w16cex w16sdtdh w16sdtfl w16du wp14">
   <w:body>
     <w:p>
       <w:pPr>
@@ -240,15 +240,21 @@
             </w:r>
           </w:p>
           <w:p>
-            <w:pPr/>
             <w:r>
               <w:t>ICTCLD401 Configure cloud services</w:t>
             </w:r>
           </w:p>
           <w:p>
-            <w:pPr/>
-            <w:r>
-              <w:t>ICTCLD502 Design and implement highly-available cloud infrastructure</w:t>
+            <w:r>
+              <w:t xml:space="preserve">ICTCLD502 Design and implement </w:t>
+            </w:r>
+            <w:proofErr w:type="gramStart"/>
+            <w:r>
+              <w:t>highly-available</w:t>
+            </w:r>
+            <w:proofErr w:type="gramEnd"/>
+            <w:r>
+              <w:t xml:space="preserve"> cloud infrastructure</w:t>
             </w:r>
           </w:p>
         </w:tc>
@@ -516,72 +522,241 @@
           <w:p>
             <w:pPr>
               <w:pStyle w:val="Assessortext"/>
-            </w:pPr>
-            <w:r>
+              <w:rPr>
+                <w:color w:val="000000" w:themeColor="text1"/>
+                <w:sz w:val="20"/>
+                <w:szCs w:val="20"/>
+              </w:rPr>
+            </w:pPr>
+            <w:r>
+              <w:rPr>
+                <w:color w:val="000000" w:themeColor="text1"/>
+                <w:sz w:val="20"/>
+                <w:szCs w:val="20"/>
+              </w:rPr>
               <w:t>You are being assessed on the production and presentation of a Business Case for the YAT LMS Cloud Migration. The assessment is split into two parts (Parts A and B — see Task(s) to be assessed below):</w:t>
             </w:r>
           </w:p>
           <w:p>
             <w:pPr>
               <w:pStyle w:val="Assessortext"/>
-            </w:pPr>
-            <w:r>
+              <w:rPr>
+                <w:color w:val="000000" w:themeColor="text1"/>
+                <w:sz w:val="20"/>
+                <w:szCs w:val="20"/>
+              </w:rPr>
+            </w:pPr>
+          </w:p>
+          <w:p>
+            <w:pPr>
+              <w:pStyle w:val="Assessortext"/>
+              <w:rPr>
+                <w:color w:val="000000" w:themeColor="text1"/>
+                <w:sz w:val="20"/>
+                <w:szCs w:val="20"/>
+              </w:rPr>
+            </w:pPr>
+            <w:r>
+              <w:rPr>
+                <w:color w:val="000000" w:themeColor="text1"/>
+                <w:sz w:val="20"/>
+                <w:szCs w:val="20"/>
+              </w:rPr>
               <w:t>Part A (written): the Business Case document, including all four appendices (CBA detail, Knowledge Evidence responses, supporting research, Feedback Record)</w:t>
             </w:r>
           </w:p>
           <w:p>
             <w:pPr>
               <w:pStyle w:val="Assessortext"/>
-            </w:pPr>
-            <w:r>
+              <w:rPr>
+                <w:color w:val="000000" w:themeColor="text1"/>
+                <w:sz w:val="20"/>
+                <w:szCs w:val="20"/>
+              </w:rPr>
+            </w:pPr>
+          </w:p>
+          <w:p>
+            <w:pPr>
+              <w:pStyle w:val="Assessortext"/>
+              <w:rPr>
+                <w:color w:val="000000" w:themeColor="text1"/>
+                <w:sz w:val="20"/>
+                <w:szCs w:val="20"/>
+              </w:rPr>
+            </w:pPr>
+            <w:r>
+              <w:rPr>
+                <w:color w:val="000000" w:themeColor="text1"/>
+                <w:sz w:val="20"/>
+                <w:szCs w:val="20"/>
+              </w:rPr>
               <w:t>Part B (observed): the Business Case presentation delivered to the role-played YAT board, with sign-off captured from the role-played YAT ICT Manager</w:t>
             </w:r>
           </w:p>
           <w:p>
             <w:pPr>
               <w:pStyle w:val="Assessortext"/>
-            </w:pPr>
-            <w:r>
+              <w:rPr>
+                <w:color w:val="000000" w:themeColor="text1"/>
+                <w:sz w:val="20"/>
+                <w:szCs w:val="20"/>
+              </w:rPr>
+            </w:pPr>
+          </w:p>
+          <w:p>
+            <w:pPr>
+              <w:pStyle w:val="Assessortext"/>
+              <w:rPr>
+                <w:color w:val="000000" w:themeColor="text1"/>
+                <w:sz w:val="20"/>
+                <w:szCs w:val="20"/>
+              </w:rPr>
+            </w:pPr>
+            <w:r>
+              <w:rPr>
+                <w:color w:val="000000" w:themeColor="text1"/>
+                <w:sz w:val="20"/>
+                <w:szCs w:val="20"/>
+              </w:rPr>
               <w:t>This is an open-book assessment. You may use the YAT intranet, the AWS Pricing Calculator, AWS Academy lab environments, course reference materials, and external research (which must be cited) throughout. Where the Business Case requires synthesis (e.g. the current-state summary in §4), you must produce content in your own words — verbatim reproduction of intranet material is not satisfactory.</w:t>
             </w:r>
           </w:p>
           <w:p>
             <w:pPr>
               <w:pStyle w:val="Assessortext"/>
-            </w:pPr>
-            <w:r>
+              <w:rPr>
+                <w:color w:val="000000" w:themeColor="text1"/>
+                <w:sz w:val="20"/>
+                <w:szCs w:val="20"/>
+              </w:rPr>
+            </w:pPr>
+          </w:p>
+          <w:p>
+            <w:pPr>
+              <w:pStyle w:val="Assessortext"/>
+              <w:rPr>
+                <w:color w:val="000000" w:themeColor="text1"/>
+                <w:sz w:val="20"/>
+                <w:szCs w:val="20"/>
+              </w:rPr>
+            </w:pPr>
+            <w:r>
+              <w:rPr>
+                <w:color w:val="000000" w:themeColor="text1"/>
+                <w:sz w:val="20"/>
+                <w:szCs w:val="20"/>
+              </w:rPr>
               <w:t>Reasonable adjustment for this assessment may include extending the time allowed, varying the location or format of the presentation event (e.g. in-person vs video conference), allowing you to present to a recorded audience for asynchronous assessment where appropriate, or providing one-on-one verbal explanation of board questions where needed.</w:t>
             </w:r>
           </w:p>
           <w:p>
             <w:pPr>
               <w:pStyle w:val="Assessortext"/>
-            </w:pPr>
-            <w:r>
+              <w:rPr>
+                <w:color w:val="000000" w:themeColor="text1"/>
+                <w:sz w:val="20"/>
+                <w:szCs w:val="20"/>
+              </w:rPr>
+            </w:pPr>
+          </w:p>
+          <w:p>
+            <w:pPr>
+              <w:pStyle w:val="Assessortext"/>
+              <w:rPr>
+                <w:color w:val="000000" w:themeColor="text1"/>
+                <w:sz w:val="20"/>
+                <w:szCs w:val="20"/>
+              </w:rPr>
+            </w:pPr>
+            <w:r>
+              <w:rPr>
+                <w:color w:val="000000" w:themeColor="text1"/>
+                <w:sz w:val="20"/>
+                <w:szCs w:val="20"/>
+              </w:rPr>
               <w:t>Teacher/assessor support level: the teacher/assessor may clarify task requirements and the scenario but must not guide you to specific recommendations or correct answers. During the presentation, the teacher/assessor (in the role of the YAT ICT Manager) may ask substantive questions but must not coach you through your responses.</w:t>
             </w:r>
           </w:p>
           <w:p>
             <w:pPr>
               <w:pStyle w:val="Assessortext"/>
-            </w:pPr>
-            <w:r>
+              <w:rPr>
+                <w:color w:val="000000" w:themeColor="text1"/>
+                <w:sz w:val="20"/>
+                <w:szCs w:val="20"/>
+              </w:rPr>
+            </w:pPr>
+          </w:p>
+          <w:p>
+            <w:pPr>
+              <w:pStyle w:val="Assessortext"/>
+              <w:rPr>
+                <w:color w:val="000000" w:themeColor="text1"/>
+                <w:sz w:val="20"/>
+                <w:szCs w:val="20"/>
+              </w:rPr>
+            </w:pPr>
+            <w:r>
+              <w:rPr>
+                <w:color w:val="000000" w:themeColor="text1"/>
+                <w:sz w:val="20"/>
+                <w:szCs w:val="20"/>
+              </w:rPr>
               <w:t>Submission: Part A (Business Case) is submitted via the LMS as a .docx with all four appendices populated. Part B (presentation deck) is submitted via the LMS as a .pptx. The completed Feedback Record and the signed Sign-off block are attached to Part A.</w:t>
             </w:r>
           </w:p>
           <w:p>
             <w:pPr>
               <w:pStyle w:val="Assessortext"/>
-            </w:pPr>
-            <w:r>
+              <w:rPr>
+                <w:color w:val="000000" w:themeColor="text1"/>
+                <w:sz w:val="20"/>
+                <w:szCs w:val="20"/>
+              </w:rPr>
+            </w:pPr>
+          </w:p>
+          <w:p>
+            <w:pPr>
+              <w:pStyle w:val="Assessortext"/>
+              <w:rPr>
+                <w:color w:val="000000" w:themeColor="text1"/>
+                <w:sz w:val="20"/>
+                <w:szCs w:val="20"/>
+              </w:rPr>
+            </w:pPr>
+            <w:r>
+              <w:rPr>
+                <w:color w:val="000000" w:themeColor="text1"/>
+                <w:sz w:val="20"/>
+                <w:szCs w:val="20"/>
+              </w:rPr>
               <w:t>The assessment will not proceed if for any reason it is not safe to do so. The assessor must advise you of the reason for suspending the assessment, and what safety action should be taken and of revised arrangements for the assessment when it is safe to do so.</w:t>
             </w:r>
           </w:p>
           <w:p>
             <w:pPr>
               <w:pStyle w:val="Assessortext"/>
-            </w:pPr>
-            <w:r>
+              <w:rPr>
+                <w:color w:val="000000" w:themeColor="text1"/>
+                <w:sz w:val="20"/>
+                <w:szCs w:val="20"/>
+              </w:rPr>
+            </w:pPr>
+          </w:p>
+          <w:p>
+            <w:pPr>
+              <w:pStyle w:val="Assessortext"/>
+              <w:rPr>
+                <w:sz w:val="20"/>
+                <w:szCs w:val="20"/>
+              </w:rPr>
+            </w:pPr>
+            <w:r>
+              <w:rPr>
+                <w:color w:val="000000" w:themeColor="text1"/>
+                <w:sz w:val="18"/>
+                <w:szCs w:val="18"/>
+              </w:rPr>
               <w:t>There is a zero tolerance for plagiarism, cheating and collusion. You will be expected to make a declaration that all work is your own prior to submission. Refer to the Training and Assessment Policy for further information.</w:t>
             </w:r>
           </w:p>
@@ -604,6 +779,7 @@
               <w:pStyle w:val="Heading3"/>
             </w:pPr>
             <w:r>
+              <w:lastRenderedPageBreak/>
               <w:t>Task(s) to be assessed</w:t>
             </w:r>
           </w:p>
@@ -619,40 +795,120 @@
           <w:p>
             <w:pPr>
               <w:pStyle w:val="Assessortext"/>
-            </w:pPr>
-            <w:r>
+              <w:rPr>
+                <w:color w:val="000000" w:themeColor="text1"/>
+                <w:sz w:val="20"/>
+                <w:szCs w:val="20"/>
+              </w:rPr>
+            </w:pPr>
+            <w:r>
+              <w:rPr>
+                <w:color w:val="000000" w:themeColor="text1"/>
+                <w:sz w:val="20"/>
+                <w:szCs w:val="20"/>
+              </w:rPr>
               <w:t>In this project, you take on the role of a consultant from MP Tech Solutions (MTS) engaged by YAT College to lead a migration of their mission-critical Learning Management System (LMS) to the cloud. AT1 is the analysis and planning phase of that engagement — you will produce a Business Case for the migration and present it to the YAT board for approval of the action plan.</w:t>
             </w:r>
           </w:p>
           <w:p>
             <w:pPr>
               <w:pStyle w:val="Assessortext"/>
-            </w:pPr>
-            <w:r>
+              <w:rPr>
+                <w:color w:val="000000" w:themeColor="text1"/>
+                <w:sz w:val="20"/>
+                <w:szCs w:val="20"/>
+              </w:rPr>
+            </w:pPr>
+          </w:p>
+          <w:p>
+            <w:pPr>
+              <w:pStyle w:val="Assessortext"/>
+              <w:rPr>
+                <w:color w:val="000000" w:themeColor="text1"/>
+                <w:sz w:val="20"/>
+                <w:szCs w:val="20"/>
+              </w:rPr>
+            </w:pPr>
+            <w:r>
+              <w:rPr>
+                <w:color w:val="000000" w:themeColor="text1"/>
+                <w:sz w:val="20"/>
+                <w:szCs w:val="20"/>
+              </w:rPr>
               <w:t>There are two parts to this assessment (Parts A and B). Each part is individually assessed as Satisfactory / Not Yet Satisfactory.</w:t>
             </w:r>
           </w:p>
           <w:p>
             <w:pPr>
               <w:pStyle w:val="Assessortext"/>
-            </w:pPr>
-            <w:r>
+              <w:rPr>
+                <w:color w:val="000000" w:themeColor="text1"/>
+                <w:sz w:val="20"/>
+                <w:szCs w:val="20"/>
+              </w:rPr>
+            </w:pPr>
+          </w:p>
+          <w:p>
+            <w:pPr>
+              <w:pStyle w:val="Assessortext"/>
+              <w:rPr>
+                <w:color w:val="000000" w:themeColor="text1"/>
+                <w:sz w:val="20"/>
+                <w:szCs w:val="20"/>
+              </w:rPr>
+            </w:pPr>
+            <w:r>
+              <w:rPr>
+                <w:color w:val="000000" w:themeColor="text1"/>
+                <w:sz w:val="20"/>
+                <w:szCs w:val="20"/>
+              </w:rPr>
               <w:t>Part A — Business Case</w:t>
             </w:r>
           </w:p>
           <w:p>
             <w:pPr>
               <w:pStyle w:val="Assessortext"/>
-            </w:pPr>
-            <w:r>
+              <w:rPr>
+                <w:color w:val="000000" w:themeColor="text1"/>
+                <w:sz w:val="20"/>
+                <w:szCs w:val="20"/>
+              </w:rPr>
+            </w:pPr>
+            <w:r>
+              <w:rPr>
+                <w:color w:val="000000" w:themeColor="text1"/>
+                <w:sz w:val="20"/>
+                <w:szCs w:val="20"/>
+              </w:rPr>
               <w:t>Produce a written Business Case for the YAT LMS Cloud Migration using YAT's standard Business Case template.</w:t>
             </w:r>
           </w:p>
           <w:p>
             <w:pPr>
               <w:pStyle w:val="Assessortext"/>
-            </w:pPr>
-            <w:r>
+              <w:rPr>
+                <w:color w:val="000000" w:themeColor="text1"/>
+                <w:sz w:val="20"/>
+                <w:szCs w:val="20"/>
+              </w:rPr>
+            </w:pPr>
+          </w:p>
+          <w:p>
+            <w:pPr>
+              <w:pStyle w:val="Assessortext"/>
+              <w:rPr>
+                <w:color w:val="000000" w:themeColor="text1"/>
+                <w:sz w:val="20"/>
+                <w:szCs w:val="20"/>
+              </w:rPr>
+            </w:pPr>
+            <w:r>
+              <w:rPr>
+                <w:color w:val="000000" w:themeColor="text1"/>
+                <w:sz w:val="20"/>
+                <w:szCs w:val="20"/>
+              </w:rPr>
               <w:t>Part B — Presentation to the YAT board</w:t>
             </w:r>
           </w:p>
@@ -661,6 +917,11 @@
               <w:pStyle w:val="Assessortext"/>
             </w:pPr>
             <w:r>
+              <w:rPr>
+                <w:color w:val="000000" w:themeColor="text1"/>
+                <w:sz w:val="20"/>
+                <w:szCs w:val="20"/>
+              </w:rPr>
               <w:t>Prepare a slide deck and present your Business Case to the YAT board to seek approval of the action plan in Business Case §10.</w:t>
             </w:r>
           </w:p>
@@ -683,7 +944,6 @@
               <w:pStyle w:val="Heading3"/>
             </w:pPr>
             <w:r>
-              <w:lastRenderedPageBreak/>
               <w:t>Time allowed</w:t>
             </w:r>
           </w:p>
@@ -700,7 +960,6 @@
             <w:pPr>
               <w:pStyle w:val="Assessortext"/>
             </w:pPr>
-            <w:r/>
           </w:p>
         </w:tc>
       </w:tr>
@@ -737,7 +996,6 @@
             <w:pPr>
               <w:pStyle w:val="Assessortext"/>
             </w:pPr>
-            <w:r/>
           </w:p>
         </w:tc>
       </w:tr>
@@ -773,49 +1031,161 @@
           <w:p>
             <w:pPr>
               <w:pStyle w:val="Assessortext"/>
-            </w:pPr>
-            <w:r>
+              <w:rPr>
+                <w:b/>
+                <w:bCs/>
+                <w:color w:val="000000" w:themeColor="text1"/>
+                <w:sz w:val="20"/>
+                <w:szCs w:val="20"/>
+              </w:rPr>
+            </w:pPr>
+            <w:r>
+              <w:rPr>
+                <w:b/>
+                <w:bCs/>
+                <w:color w:val="000000" w:themeColor="text1"/>
+                <w:sz w:val="20"/>
+                <w:szCs w:val="20"/>
+              </w:rPr>
               <w:t>Teacher/assessor supplied resources</w:t>
             </w:r>
           </w:p>
           <w:p>
             <w:pPr>
               <w:pStyle w:val="Assessortext"/>
-            </w:pPr>
-            <w:r>
+              <w:rPr>
+                <w:color w:val="000000" w:themeColor="text1"/>
+                <w:sz w:val="20"/>
+                <w:szCs w:val="20"/>
+              </w:rPr>
+            </w:pPr>
+            <w:r>
+              <w:rPr>
+                <w:color w:val="000000" w:themeColor="text1"/>
+                <w:sz w:val="20"/>
+                <w:szCs w:val="20"/>
+              </w:rPr>
               <w:t>Access to the YAT intranet — provided as the engagement's reference site</w:t>
             </w:r>
           </w:p>
           <w:p>
             <w:pPr>
               <w:pStyle w:val="Assessortext"/>
-            </w:pPr>
-            <w:r>
-              <w:t>AWS Academy lab access — Cloud Foundations [104469] + Cloud Architecting [172221]</w:t>
+              <w:rPr>
+                <w:color w:val="000000" w:themeColor="text1"/>
+                <w:sz w:val="20"/>
+                <w:szCs w:val="20"/>
+              </w:rPr>
+            </w:pPr>
+            <w:r>
+              <w:rPr>
+                <w:color w:val="000000" w:themeColor="text1"/>
+                <w:sz w:val="20"/>
+                <w:szCs w:val="20"/>
+              </w:rPr>
+              <w:t>AWS Academy lab access — Cloud Foundations + Cloud Architecting + Learner Lab</w:t>
             </w:r>
           </w:p>
           <w:p>
             <w:pPr>
               <w:pStyle w:val="Assessortext"/>
-            </w:pPr>
-            <w:r>
-              <w:t>Student supplied resources</w:t>
+              <w:rPr>
+                <w:color w:val="000000" w:themeColor="text1"/>
+                <w:sz w:val="20"/>
+                <w:szCs w:val="20"/>
+              </w:rPr>
+            </w:pPr>
+            <w:r>
+              <w:rPr>
+                <w:color w:val="000000" w:themeColor="text1"/>
+                <w:sz w:val="20"/>
+                <w:szCs w:val="20"/>
+              </w:rPr>
+              <w:t>People to present to (Sam Walker — YAT ICT Manager; Pat Lin — MTS Senior Consultant)</w:t>
             </w:r>
           </w:p>
           <w:p>
             <w:pPr>
               <w:pStyle w:val="Assessortext"/>
-            </w:pPr>
-            <w:r>
-              <w:t>Computer with web browser</w:t>
+              <w:rPr>
+                <w:color w:val="000000" w:themeColor="text1"/>
+                <w:sz w:val="20"/>
+                <w:szCs w:val="20"/>
+              </w:rPr>
+            </w:pPr>
+            <w:r>
+              <w:rPr>
+                <w:color w:val="000000" w:themeColor="text1"/>
+                <w:sz w:val="20"/>
+                <w:szCs w:val="20"/>
+              </w:rPr>
+              <w:t>Presentation observation rubric (later in this document) for marking the presentation event</w:t>
             </w:r>
           </w:p>
           <w:p>
             <w:pPr>
               <w:pStyle w:val="Assessortext"/>
-            </w:pPr>
-            <w:r>
+              <w:rPr>
+                <w:color w:val="000000" w:themeColor="text1"/>
+                <w:sz w:val="20"/>
+                <w:szCs w:val="20"/>
+              </w:rPr>
+            </w:pPr>
+            <w:r>
+              <w:rPr>
+                <w:color w:val="000000" w:themeColor="text1"/>
+                <w:sz w:val="20"/>
+                <w:szCs w:val="20"/>
+              </w:rPr>
+              <w:t>Computer with web browser &amp; internet connection</w:t>
+            </w:r>
+          </w:p>
+          <w:p>
+            <w:pPr>
+              <w:pStyle w:val="Assessortext"/>
+            </w:pPr>
+            <w:r>
+              <w:rPr>
+                <w:color w:val="000000" w:themeColor="text1"/>
+                <w:sz w:val="20"/>
+                <w:szCs w:val="20"/>
+              </w:rPr>
               <w:t>Word-processing and presentation software (e.g. Microsoft Word + PowerPoint, or equivalents)</w:t>
+            </w:r>
+            <w:r>
+              <w:rPr>
+                <w:color w:val="000000" w:themeColor="text1"/>
+                <w:sz w:val="20"/>
+                <w:szCs w:val="20"/>
+              </w:rPr>
+              <w:br/>
+            </w:r>
+            <w:r>
+              <w:rPr>
+                <w:b/>
+                <w:bCs/>
+                <w:color w:val="000000" w:themeColor="text1"/>
+                <w:sz w:val="20"/>
+                <w:szCs w:val="20"/>
+              </w:rPr>
+              <w:t>Student supplied</w:t>
+            </w:r>
+            <w:r>
+              <w:rPr>
+                <w:color w:val="000000" w:themeColor="text1"/>
+                <w:sz w:val="20"/>
+                <w:szCs w:val="20"/>
+              </w:rPr>
+              <w:t xml:space="preserve"> </w:t>
+            </w:r>
+            <w:r>
+              <w:rPr>
+                <w:color w:val="000000" w:themeColor="text1"/>
+                <w:sz w:val="20"/>
+                <w:szCs w:val="20"/>
+              </w:rPr>
+              <w:br/>
+              <w:t>Nil - for online assessment segments students are welcome (but not required to) to come into campus and use BKI library computer, internet &amp; software</w:t>
             </w:r>
           </w:p>
         </w:tc>
@@ -853,49 +1223,116 @@
             <w:vAlign w:val="center"/>
           </w:tcPr>
           <w:p>
-            <w:r>
+            <w:pPr>
+              <w:rPr>
+                <w:sz w:val="20"/>
+                <w:szCs w:val="20"/>
+              </w:rPr>
+            </w:pPr>
+            <w:r>
+              <w:rPr>
+                <w:sz w:val="20"/>
+                <w:szCs w:val="20"/>
+              </w:rPr>
               <w:t>To receive a Satisfactory outcome for this assessment you must:</w:t>
             </w:r>
           </w:p>
           <w:p>
-            <w:pPr/>
-            <w:r>
+            <w:pPr>
+              <w:rPr>
+                <w:sz w:val="20"/>
+                <w:szCs w:val="20"/>
+              </w:rPr>
+            </w:pPr>
+            <w:r>
+              <w:rPr>
+                <w:sz w:val="20"/>
+                <w:szCs w:val="20"/>
+              </w:rPr>
               <w:t>Achieve Satisfactory on every criterion in the Part A Marking Guide (Business Case — covers Business Case sections §1–§11, Sign-off, and Appendices 1–4)</w:t>
             </w:r>
           </w:p>
           <w:p>
-            <w:pPr/>
-            <w:r>
+            <w:pPr>
+              <w:rPr>
+                <w:sz w:val="20"/>
+                <w:szCs w:val="20"/>
+              </w:rPr>
+            </w:pPr>
+            <w:r>
+              <w:rPr>
+                <w:sz w:val="20"/>
+                <w:szCs w:val="20"/>
+              </w:rPr>
               <w:t>Achieve Satisfactory on every criterion in the Part B Marking Guide (Presentation — covers the observed presentation event including Q&amp;A, feedback capture, and sign-off)</w:t>
             </w:r>
           </w:p>
           <w:p>
-            <w:pPr/>
-            <w:r>
+            <w:pPr>
+              <w:rPr>
+                <w:sz w:val="20"/>
+                <w:szCs w:val="20"/>
+              </w:rPr>
+            </w:pPr>
+            <w:r>
+              <w:rPr>
+                <w:sz w:val="20"/>
+                <w:szCs w:val="20"/>
+              </w:rPr>
               <w:t>Submit all required artefacts:</w:t>
             </w:r>
           </w:p>
           <w:p>
-            <w:pPr/>
-            <w:r>
+            <w:pPr>
+              <w:rPr>
+                <w:sz w:val="20"/>
+                <w:szCs w:val="20"/>
+              </w:rPr>
+            </w:pPr>
+            <w:r>
+              <w:rPr>
+                <w:sz w:val="20"/>
+                <w:szCs w:val="20"/>
+              </w:rPr>
               <w:t>Completed Business Case (.docx) with all four appendices populated</w:t>
             </w:r>
           </w:p>
           <w:p>
-            <w:pPr/>
-            <w:r>
+            <w:pPr>
+              <w:rPr>
+                <w:sz w:val="20"/>
+                <w:szCs w:val="20"/>
+              </w:rPr>
+            </w:pPr>
+            <w:r>
+              <w:rPr>
+                <w:sz w:val="20"/>
+                <w:szCs w:val="20"/>
+              </w:rPr>
               <w:t>Presentation deck (.pptx) with populated speaker notes</w:t>
             </w:r>
           </w:p>
           <w:p>
-            <w:pPr/>
-            <w:r>
+            <w:pPr>
+              <w:rPr>
+                <w:sz w:val="20"/>
+                <w:szCs w:val="20"/>
+              </w:rPr>
+            </w:pPr>
+            <w:r>
+              <w:rPr>
+                <w:sz w:val="20"/>
+                <w:szCs w:val="20"/>
+              </w:rPr>
               <w:t>Completed Feedback Record (attached as Business Case Appendix 4)</w:t>
             </w:r>
           </w:p>
           <w:p>
-            <w:pPr/>
-            <w:r>
+            <w:r>
+              <w:rPr>
+                <w:sz w:val="20"/>
+                <w:szCs w:val="20"/>
+              </w:rPr>
               <w:t>Signed Sign-off block from the role-played YAT ICT Manager (within the Business Case)</w:t>
             </w:r>
           </w:p>
@@ -935,6 +1372,11 @@
               <w:pStyle w:val="Assessortext"/>
             </w:pPr>
             <w:r>
+              <w:rPr>
+                <w:color w:val="000000" w:themeColor="text1"/>
+                <w:sz w:val="20"/>
+                <w:szCs w:val="20"/>
+              </w:rPr>
               <w:t>If you are deemed not satisfactory for any of the observations, you will be given one (1) more attempt at this assessment (or part thereof) or your teacher/assessor will negotiate a further assessment with you. The second attempt must be completed within 10 working days from the date your feedback is given.</w:t>
             </w:r>
           </w:p>
@@ -971,6 +1413,10 @@
           </w:tcPr>
           <w:p>
             <w:r>
+              <w:rPr>
+                <w:sz w:val="20"/>
+                <w:szCs w:val="20"/>
+              </w:rPr>
               <w:t>You can access further information regarding assessment, including Recognition of Prior Learning, Reasonable Adjustment and Assessment Appeals in the Student handbook which can be found on the MyLearning portal.</w:t>
             </w:r>
           </w:p>
@@ -979,7 +1425,7 @@
       <w:tr>
         <w:tc>
           <w:tcPr>
-            <w:tcW w:type="dxa" w:w="2807"/>
+            <w:tcW w:w="2807" w:type="dxa"/>
           </w:tcPr>
           <w:p>
             <w:r>
@@ -992,22 +1438,51 @@
         </w:tc>
         <w:tc>
           <w:tcPr>
-            <w:tcW w:type="dxa" w:w="7938"/>
-          </w:tcPr>
-          <w:p>
-            <w:r>
+            <w:tcW w:w="7938" w:type="dxa"/>
+          </w:tcPr>
+          <w:p>
+            <w:pPr>
+              <w:rPr>
+                <w:sz w:val="20"/>
+                <w:szCs w:val="20"/>
+              </w:rPr>
+            </w:pPr>
+            <w:r>
+              <w:rPr>
+                <w:sz w:val="20"/>
+                <w:szCs w:val="20"/>
+              </w:rPr>
               <w:t>Part A is submitted to the LMS as the populated Business Case (.docx) with all four appendices completed.</w:t>
             </w:r>
           </w:p>
           <w:p>
-            <w:pPr/>
-            <w:r>
+            <w:pPr>
+              <w:rPr>
+                <w:sz w:val="20"/>
+                <w:szCs w:val="20"/>
+              </w:rPr>
+            </w:pPr>
+          </w:p>
+          <w:p>
+            <w:r>
+              <w:rPr>
+                <w:sz w:val="20"/>
+                <w:szCs w:val="20"/>
+              </w:rPr>
               <w:t>Part B is submitted to the LMS as the presentation deck (.pptx or equivalent) with populated speaker notes. The completed Feedback Record and the signed Sign-off block are attached to the Business Case (as Appendix 4 and the Sign-off block respectively).</w:t>
             </w:r>
           </w:p>
         </w:tc>
       </w:tr>
     </w:tbl>
+    <w:p>
+      <w:pPr>
+        <w:pStyle w:val="NoSpacing"/>
+        <w:rPr>
+          <w:color w:val="4F81BD" w:themeColor="accent1"/>
+        </w:rPr>
+      </w:pPr>
+    </w:p>
     <w:p>
       <w:pPr>
         <w:pStyle w:val="NoSpacing"/>
@@ -1055,9 +1530,16 @@
               <w:pStyle w:val="Heading2"/>
               <w:rPr>
                 <w:color w:val="365F91" w:themeColor="accent1" w:themeShade="BF"/>
-              </w:rPr>
-            </w:pPr>
-            <w:r>
+                <w:sz w:val="21"/>
+                <w:szCs w:val="21"/>
+              </w:rPr>
+            </w:pPr>
+            <w:r>
+              <w:rPr>
+                <w:sz w:val="21"/>
+                <w:szCs w:val="21"/>
+              </w:rPr>
+              <w:lastRenderedPageBreak/>
               <w:t>Assessment criteria</w:t>
             </w:r>
           </w:p>
@@ -1097,8 +1579,16 @@
           <w:p>
             <w:pPr>
               <w:pStyle w:val="Heading3"/>
-            </w:pPr>
-            <w:r>
+              <w:rPr>
+                <w:sz w:val="21"/>
+                <w:szCs w:val="21"/>
+              </w:rPr>
+            </w:pPr>
+            <w:r>
+              <w:rPr>
+                <w:sz w:val="21"/>
+                <w:szCs w:val="21"/>
+              </w:rPr>
               <w:t>Satisfactory?</w:t>
             </w:r>
           </w:p>
@@ -1107,12 +1597,20 @@
       <w:tr>
         <w:tc>
           <w:tcPr>
-            <w:tcW w:type="dxa" w:w="8797"/>
-          </w:tcPr>
-          <w:p>
+            <w:tcW w:w="8797" w:type="dxa"/>
+          </w:tcPr>
+          <w:p>
+            <w:pPr>
+              <w:rPr>
+                <w:sz w:val="20"/>
+                <w:szCs w:val="20"/>
+              </w:rPr>
+            </w:pPr>
             <w:r>
               <w:rPr>
                 <w:b/>
+                <w:sz w:val="20"/>
+                <w:szCs w:val="20"/>
               </w:rPr>
               <w:t>Part A – Business Case</w:t>
             </w:r>
@@ -1120,31 +1618,72 @@
         </w:tc>
         <w:tc>
           <w:tcPr>
-            <w:tcW w:type="dxa" w:w="1943"/>
-          </w:tcPr>
-          <w:p>
-            <w:r/>
+            <w:tcW w:w="1943" w:type="dxa"/>
+          </w:tcPr>
+          <w:p>
+            <w:pPr>
+              <w:rPr>
+                <w:sz w:val="21"/>
+                <w:szCs w:val="21"/>
+              </w:rPr>
+            </w:pPr>
           </w:p>
         </w:tc>
       </w:tr>
       <w:tr>
         <w:tc>
           <w:tcPr>
-            <w:tcW w:type="dxa" w:w="8797"/>
-          </w:tcPr>
-          <w:p>
-            <w:r>
+            <w:tcW w:w="8797" w:type="dxa"/>
+          </w:tcPr>
+          <w:p>
+            <w:pPr>
+              <w:rPr>
+                <w:sz w:val="20"/>
+                <w:szCs w:val="20"/>
+              </w:rPr>
+            </w:pPr>
+            <w:r>
+              <w:rPr>
+                <w:sz w:val="20"/>
+                <w:szCs w:val="20"/>
+              </w:rPr>
               <w:t xml:space="preserve">A1 - Strategic Alignment Analysis — you analysed YAT's ICT Strategic Plan against the industry environment and organisational objectives, with citations </w:t>
             </w:r>
           </w:p>
         </w:tc>
         <w:tc>
           <w:tcPr>
-            <w:tcW w:type="dxa" w:w="1943"/>
-          </w:tcPr>
-          <w:p>
-            <w:r>
-              <w:t>☐ Yes  ☐ No</w:t>
+            <w:tcW w:w="1943" w:type="dxa"/>
+          </w:tcPr>
+          <w:p>
+            <w:pPr>
+              <w:rPr>
+                <w:sz w:val="21"/>
+                <w:szCs w:val="21"/>
+              </w:rPr>
+            </w:pPr>
+            <w:r>
+              <w:rPr>
+                <w:sz w:val="21"/>
+                <w:szCs w:val="21"/>
+              </w:rPr>
+              <w:t xml:space="preserve">☐ </w:t>
+            </w:r>
+            <w:proofErr w:type="gramStart"/>
+            <w:r>
+              <w:rPr>
+                <w:sz w:val="21"/>
+                <w:szCs w:val="21"/>
+              </w:rPr>
+              <w:t>Yes  ☐</w:t>
+            </w:r>
+            <w:proofErr w:type="gramEnd"/>
+            <w:r>
+              <w:rPr>
+                <w:sz w:val="21"/>
+                <w:szCs w:val="21"/>
+              </w:rPr>
+              <w:t xml:space="preserve"> No</w:t>
             </w:r>
           </w:p>
         </w:tc>
@@ -1152,21 +1691,57 @@
       <w:tr>
         <w:tc>
           <w:tcPr>
-            <w:tcW w:type="dxa" w:w="8797"/>
-          </w:tcPr>
-          <w:p>
-            <w:r>
+            <w:tcW w:w="8797" w:type="dxa"/>
+          </w:tcPr>
+          <w:p>
+            <w:pPr>
+              <w:rPr>
+                <w:sz w:val="20"/>
+                <w:szCs w:val="20"/>
+              </w:rPr>
+            </w:pPr>
+            <w:r>
+              <w:rPr>
+                <w:sz w:val="20"/>
+                <w:szCs w:val="20"/>
+              </w:rPr>
               <w:t xml:space="preserve">A2 -Current State of YAT's ICT — you produced a synthesised summary of YAT's current ICT systems and practices in your own words (not verbatim from the intranet) </w:t>
             </w:r>
           </w:p>
         </w:tc>
         <w:tc>
           <w:tcPr>
-            <w:tcW w:type="dxa" w:w="1943"/>
-          </w:tcPr>
-          <w:p>
-            <w:r>
-              <w:t>☐ Yes  ☐ No</w:t>
+            <w:tcW w:w="1943" w:type="dxa"/>
+          </w:tcPr>
+          <w:p>
+            <w:pPr>
+              <w:rPr>
+                <w:sz w:val="21"/>
+                <w:szCs w:val="21"/>
+              </w:rPr>
+            </w:pPr>
+            <w:r>
+              <w:rPr>
+                <w:sz w:val="21"/>
+                <w:szCs w:val="21"/>
+              </w:rPr>
+              <w:t xml:space="preserve">☐ </w:t>
+            </w:r>
+            <w:proofErr w:type="gramStart"/>
+            <w:r>
+              <w:rPr>
+                <w:sz w:val="21"/>
+                <w:szCs w:val="21"/>
+              </w:rPr>
+              <w:t>Yes  ☐</w:t>
+            </w:r>
+            <w:proofErr w:type="gramEnd"/>
+            <w:r>
+              <w:rPr>
+                <w:sz w:val="21"/>
+                <w:szCs w:val="21"/>
+              </w:rPr>
+              <w:t xml:space="preserve"> No</w:t>
             </w:r>
           </w:p>
         </w:tc>
@@ -1174,21 +1749,57 @@
       <w:tr>
         <w:tc>
           <w:tcPr>
-            <w:tcW w:type="dxa" w:w="8797"/>
-          </w:tcPr>
-          <w:p>
-            <w:r>
+            <w:tcW w:w="8797" w:type="dxa"/>
+          </w:tcPr>
+          <w:p>
+            <w:pPr>
+              <w:rPr>
+                <w:sz w:val="20"/>
+                <w:szCs w:val="20"/>
+              </w:rPr>
+            </w:pPr>
+            <w:r>
+              <w:rPr>
+                <w:sz w:val="20"/>
+                <w:szCs w:val="20"/>
+              </w:rPr>
               <w:t>A3 - Gap Analysis — you compared YAT's strategic plan objectives against the current state and identifies gaps, improvement opportunities, and proposed changes</w:t>
             </w:r>
           </w:p>
         </w:tc>
         <w:tc>
           <w:tcPr>
-            <w:tcW w:type="dxa" w:w="1943"/>
-          </w:tcPr>
-          <w:p>
-            <w:r>
-              <w:t>☐ Yes  ☐ No</w:t>
+            <w:tcW w:w="1943" w:type="dxa"/>
+          </w:tcPr>
+          <w:p>
+            <w:pPr>
+              <w:rPr>
+                <w:sz w:val="21"/>
+                <w:szCs w:val="21"/>
+              </w:rPr>
+            </w:pPr>
+            <w:r>
+              <w:rPr>
+                <w:sz w:val="21"/>
+                <w:szCs w:val="21"/>
+              </w:rPr>
+              <w:t xml:space="preserve">☐ </w:t>
+            </w:r>
+            <w:proofErr w:type="gramStart"/>
+            <w:r>
+              <w:rPr>
+                <w:sz w:val="21"/>
+                <w:szCs w:val="21"/>
+              </w:rPr>
+              <w:t>Yes  ☐</w:t>
+            </w:r>
+            <w:proofErr w:type="gramEnd"/>
+            <w:r>
+              <w:rPr>
+                <w:sz w:val="21"/>
+                <w:szCs w:val="21"/>
+              </w:rPr>
+              <w:t xml:space="preserve"> No</w:t>
             </w:r>
           </w:p>
         </w:tc>
@@ -1196,21 +1807,57 @@
       <w:tr>
         <w:tc>
           <w:tcPr>
-            <w:tcW w:type="dxa" w:w="8797"/>
-          </w:tcPr>
-          <w:p>
-            <w:r>
+            <w:tcW w:w="8797" w:type="dxa"/>
+          </w:tcPr>
+          <w:p>
+            <w:pPr>
+              <w:rPr>
+                <w:sz w:val="20"/>
+                <w:szCs w:val="20"/>
+              </w:rPr>
+            </w:pPr>
+            <w:r>
+              <w:rPr>
+                <w:sz w:val="20"/>
+                <w:szCs w:val="20"/>
+              </w:rPr>
               <w:t>A4 - Options Considered and Evaluation — you defined the LMS workload, considers both options (in-house renewal vs cloud migration to AWS), names and justifies the evaluation method, and produces an initial impact + difficulty assessment for both options</w:t>
             </w:r>
           </w:p>
         </w:tc>
         <w:tc>
           <w:tcPr>
-            <w:tcW w:type="dxa" w:w="1943"/>
-          </w:tcPr>
-          <w:p>
-            <w:r>
-              <w:t>☐ Yes  ☐ No</w:t>
+            <w:tcW w:w="1943" w:type="dxa"/>
+          </w:tcPr>
+          <w:p>
+            <w:pPr>
+              <w:rPr>
+                <w:sz w:val="21"/>
+                <w:szCs w:val="21"/>
+              </w:rPr>
+            </w:pPr>
+            <w:r>
+              <w:rPr>
+                <w:sz w:val="21"/>
+                <w:szCs w:val="21"/>
+              </w:rPr>
+              <w:t xml:space="preserve">☐ </w:t>
+            </w:r>
+            <w:proofErr w:type="gramStart"/>
+            <w:r>
+              <w:rPr>
+                <w:sz w:val="21"/>
+                <w:szCs w:val="21"/>
+              </w:rPr>
+              <w:t>Yes  ☐</w:t>
+            </w:r>
+            <w:proofErr w:type="gramEnd"/>
+            <w:r>
+              <w:rPr>
+                <w:sz w:val="21"/>
+                <w:szCs w:val="21"/>
+              </w:rPr>
+              <w:t xml:space="preserve"> No</w:t>
             </w:r>
           </w:p>
         </w:tc>
@@ -1218,21 +1865,57 @@
       <w:tr>
         <w:tc>
           <w:tcPr>
-            <w:tcW w:type="dxa" w:w="8797"/>
-          </w:tcPr>
-          <w:p>
-            <w:r>
+            <w:tcW w:w="8797" w:type="dxa"/>
+          </w:tcPr>
+          <w:p>
+            <w:pPr>
+              <w:rPr>
+                <w:sz w:val="20"/>
+                <w:szCs w:val="20"/>
+              </w:rPr>
+            </w:pPr>
+            <w:r>
+              <w:rPr>
+                <w:sz w:val="20"/>
+                <w:szCs w:val="20"/>
+              </w:rPr>
               <w:t xml:space="preserve">A5 - Appendix 1 Cost-Benefit Analysis — you completed the 5-year CBA covering both options with line-item detail in Appendix 1; assumptions stated; year-by-year projections; comparison summary; avoided-downtime benefit; Year-1 cash-flow comparison; sensitivity analysis. AWS Pricing Calculator export attached in Appendix 3. Numbers reconcile between Appendix 1 detail, summary, and Executive Summary </w:t>
             </w:r>
           </w:p>
         </w:tc>
         <w:tc>
           <w:tcPr>
-            <w:tcW w:type="dxa" w:w="1943"/>
-          </w:tcPr>
-          <w:p>
-            <w:r>
-              <w:t>☐ Yes  ☐ No</w:t>
+            <w:tcW w:w="1943" w:type="dxa"/>
+          </w:tcPr>
+          <w:p>
+            <w:pPr>
+              <w:rPr>
+                <w:sz w:val="21"/>
+                <w:szCs w:val="21"/>
+              </w:rPr>
+            </w:pPr>
+            <w:r>
+              <w:rPr>
+                <w:sz w:val="21"/>
+                <w:szCs w:val="21"/>
+              </w:rPr>
+              <w:t xml:space="preserve">☐ </w:t>
+            </w:r>
+            <w:proofErr w:type="gramStart"/>
+            <w:r>
+              <w:rPr>
+                <w:sz w:val="21"/>
+                <w:szCs w:val="21"/>
+              </w:rPr>
+              <w:t>Yes  ☐</w:t>
+            </w:r>
+            <w:proofErr w:type="gramEnd"/>
+            <w:r>
+              <w:rPr>
+                <w:sz w:val="21"/>
+                <w:szCs w:val="21"/>
+              </w:rPr>
+              <w:t xml:space="preserve"> No</w:t>
             </w:r>
           </w:p>
         </w:tc>
@@ -1240,21 +1923,57 @@
       <w:tr>
         <w:tc>
           <w:tcPr>
-            <w:tcW w:type="dxa" w:w="8797"/>
-          </w:tcPr>
-          <w:p>
-            <w:r>
+            <w:tcW w:w="8797" w:type="dxa"/>
+          </w:tcPr>
+          <w:p>
+            <w:pPr>
+              <w:rPr>
+                <w:sz w:val="20"/>
+                <w:szCs w:val="20"/>
+              </w:rPr>
+            </w:pPr>
+            <w:r>
+              <w:rPr>
+                <w:sz w:val="20"/>
+                <w:szCs w:val="20"/>
+              </w:rPr>
               <w:t xml:space="preserve">A6 - Risk and Impact Assessment — you populated intangibles comparison for both options (honest about trade-offs of the recommended option) and produces a risk register for the recommended option </w:t>
             </w:r>
           </w:p>
         </w:tc>
         <w:tc>
           <w:tcPr>
-            <w:tcW w:type="dxa" w:w="1943"/>
-          </w:tcPr>
-          <w:p>
-            <w:r>
-              <w:t>☐ Yes  ☐ No</w:t>
+            <w:tcW w:w="1943" w:type="dxa"/>
+          </w:tcPr>
+          <w:p>
+            <w:pPr>
+              <w:rPr>
+                <w:sz w:val="21"/>
+                <w:szCs w:val="21"/>
+              </w:rPr>
+            </w:pPr>
+            <w:r>
+              <w:rPr>
+                <w:sz w:val="21"/>
+                <w:szCs w:val="21"/>
+              </w:rPr>
+              <w:t xml:space="preserve">☐ </w:t>
+            </w:r>
+            <w:proofErr w:type="gramStart"/>
+            <w:r>
+              <w:rPr>
+                <w:sz w:val="21"/>
+                <w:szCs w:val="21"/>
+              </w:rPr>
+              <w:t>Yes  ☐</w:t>
+            </w:r>
+            <w:proofErr w:type="gramEnd"/>
+            <w:r>
+              <w:rPr>
+                <w:sz w:val="21"/>
+                <w:szCs w:val="21"/>
+              </w:rPr>
+              <w:t xml:space="preserve"> No</w:t>
             </w:r>
           </w:p>
         </w:tc>
@@ -1262,21 +1981,57 @@
       <w:tr>
         <w:tc>
           <w:tcPr>
-            <w:tcW w:type="dxa" w:w="8797"/>
-          </w:tcPr>
-          <w:p>
-            <w:r>
+            <w:tcW w:w="8797" w:type="dxa"/>
+          </w:tcPr>
+          <w:p>
+            <w:pPr>
+              <w:rPr>
+                <w:sz w:val="20"/>
+                <w:szCs w:val="20"/>
+              </w:rPr>
+            </w:pPr>
+            <w:r>
+              <w:rPr>
+                <w:sz w:val="20"/>
+                <w:szCs w:val="20"/>
+              </w:rPr>
               <w:t>A7 - Recommendation — you state a clear recommendation with rationale connecting back to the CBA findings, intangibles, and risk register</w:t>
             </w:r>
           </w:p>
         </w:tc>
         <w:tc>
           <w:tcPr>
-            <w:tcW w:type="dxa" w:w="1943"/>
-          </w:tcPr>
-          <w:p>
-            <w:r>
-              <w:t>☐ Yes  ☐ No</w:t>
+            <w:tcW w:w="1943" w:type="dxa"/>
+          </w:tcPr>
+          <w:p>
+            <w:pPr>
+              <w:rPr>
+                <w:sz w:val="21"/>
+                <w:szCs w:val="21"/>
+              </w:rPr>
+            </w:pPr>
+            <w:r>
+              <w:rPr>
+                <w:sz w:val="21"/>
+                <w:szCs w:val="21"/>
+              </w:rPr>
+              <w:t xml:space="preserve">☐ </w:t>
+            </w:r>
+            <w:proofErr w:type="gramStart"/>
+            <w:r>
+              <w:rPr>
+                <w:sz w:val="21"/>
+                <w:szCs w:val="21"/>
+              </w:rPr>
+              <w:t>Yes  ☐</w:t>
+            </w:r>
+            <w:proofErr w:type="gramEnd"/>
+            <w:r>
+              <w:rPr>
+                <w:sz w:val="21"/>
+                <w:szCs w:val="21"/>
+              </w:rPr>
+              <w:t xml:space="preserve"> No</w:t>
             </w:r>
           </w:p>
         </w:tc>
@@ -1284,21 +2039,57 @@
       <w:tr>
         <w:tc>
           <w:tcPr>
-            <w:tcW w:type="dxa" w:w="8797"/>
-          </w:tcPr>
-          <w:p>
-            <w:r>
+            <w:tcW w:w="8797" w:type="dxa"/>
+          </w:tcPr>
+          <w:p>
+            <w:pPr>
+              <w:rPr>
+                <w:sz w:val="20"/>
+                <w:szCs w:val="20"/>
+              </w:rPr>
+            </w:pPr>
+            <w:r>
+              <w:rPr>
+                <w:sz w:val="20"/>
+                <w:szCs w:val="20"/>
+              </w:rPr>
               <w:t>A8 - Action Plan — you developed a phased action plan with prioritised changes, implementation schedule with dependencies, standards / targets / success metrics, implementation methods, alignment with YAT's change-management procedure, and an action-plan risk register</w:t>
             </w:r>
           </w:p>
         </w:tc>
         <w:tc>
           <w:tcPr>
-            <w:tcW w:type="dxa" w:w="1943"/>
-          </w:tcPr>
-          <w:p>
-            <w:r>
-              <w:t>☐ Yes  ☐ No</w:t>
+            <w:tcW w:w="1943" w:type="dxa"/>
+          </w:tcPr>
+          <w:p>
+            <w:pPr>
+              <w:rPr>
+                <w:sz w:val="21"/>
+                <w:szCs w:val="21"/>
+              </w:rPr>
+            </w:pPr>
+            <w:r>
+              <w:rPr>
+                <w:sz w:val="21"/>
+                <w:szCs w:val="21"/>
+              </w:rPr>
+              <w:t xml:space="preserve">☐ </w:t>
+            </w:r>
+            <w:proofErr w:type="gramStart"/>
+            <w:r>
+              <w:rPr>
+                <w:sz w:val="21"/>
+                <w:szCs w:val="21"/>
+              </w:rPr>
+              <w:t>Yes  ☐</w:t>
+            </w:r>
+            <w:proofErr w:type="gramEnd"/>
+            <w:r>
+              <w:rPr>
+                <w:sz w:val="21"/>
+                <w:szCs w:val="21"/>
+              </w:rPr>
+              <w:t xml:space="preserve"> No</w:t>
             </w:r>
           </w:p>
         </w:tc>
@@ -1306,21 +2097,57 @@
       <w:tr>
         <w:tc>
           <w:tcPr>
-            <w:tcW w:type="dxa" w:w="8797"/>
-          </w:tcPr>
-          <w:p>
-            <w:r>
+            <w:tcW w:w="8797" w:type="dxa"/>
+          </w:tcPr>
+          <w:p>
+            <w:pPr>
+              <w:rPr>
+                <w:sz w:val="20"/>
+                <w:szCs w:val="20"/>
+              </w:rPr>
+            </w:pPr>
+            <w:r>
+              <w:rPr>
+                <w:sz w:val="20"/>
+                <w:szCs w:val="20"/>
+              </w:rPr>
               <w:t>A9 - Next Steps and Decision Requested — you explicitly named what the board is being asked to approve today and what is deferred to later sign-off gates</w:t>
             </w:r>
           </w:p>
         </w:tc>
         <w:tc>
           <w:tcPr>
-            <w:tcW w:type="dxa" w:w="1943"/>
-          </w:tcPr>
-          <w:p>
-            <w:r>
-              <w:t>☐ Yes  ☐ No</w:t>
+            <w:tcW w:w="1943" w:type="dxa"/>
+          </w:tcPr>
+          <w:p>
+            <w:pPr>
+              <w:rPr>
+                <w:sz w:val="21"/>
+                <w:szCs w:val="21"/>
+              </w:rPr>
+            </w:pPr>
+            <w:r>
+              <w:rPr>
+                <w:sz w:val="21"/>
+                <w:szCs w:val="21"/>
+              </w:rPr>
+              <w:t xml:space="preserve">☐ </w:t>
+            </w:r>
+            <w:proofErr w:type="gramStart"/>
+            <w:r>
+              <w:rPr>
+                <w:sz w:val="21"/>
+                <w:szCs w:val="21"/>
+              </w:rPr>
+              <w:t>Yes  ☐</w:t>
+            </w:r>
+            <w:proofErr w:type="gramEnd"/>
+            <w:r>
+              <w:rPr>
+                <w:sz w:val="21"/>
+                <w:szCs w:val="21"/>
+              </w:rPr>
+              <w:t xml:space="preserve"> No</w:t>
             </w:r>
           </w:p>
         </w:tc>
@@ -1328,21 +2155,57 @@
       <w:tr>
         <w:tc>
           <w:tcPr>
-            <w:tcW w:type="dxa" w:w="8797"/>
-          </w:tcPr>
-          <w:p>
-            <w:r>
+            <w:tcW w:w="8797" w:type="dxa"/>
+          </w:tcPr>
+          <w:p>
+            <w:pPr>
+              <w:rPr>
+                <w:sz w:val="20"/>
+                <w:szCs w:val="20"/>
+              </w:rPr>
+            </w:pPr>
+            <w:r>
+              <w:rPr>
+                <w:sz w:val="20"/>
+                <w:szCs w:val="20"/>
+              </w:rPr>
               <w:t>A10 - Executive Summary — one-page summary covering the recommendation, 5-year cost position, top 2–3 risks of the recommended option, and the asked-for decision. Numbers reconcile with A5</w:t>
             </w:r>
           </w:p>
         </w:tc>
         <w:tc>
           <w:tcPr>
-            <w:tcW w:type="dxa" w:w="1943"/>
-          </w:tcPr>
-          <w:p>
-            <w:r>
-              <w:t>☐ Yes  ☐ No</w:t>
+            <w:tcW w:w="1943" w:type="dxa"/>
+          </w:tcPr>
+          <w:p>
+            <w:pPr>
+              <w:rPr>
+                <w:sz w:val="21"/>
+                <w:szCs w:val="21"/>
+              </w:rPr>
+            </w:pPr>
+            <w:r>
+              <w:rPr>
+                <w:sz w:val="21"/>
+                <w:szCs w:val="21"/>
+              </w:rPr>
+              <w:t xml:space="preserve">☐ </w:t>
+            </w:r>
+            <w:proofErr w:type="gramStart"/>
+            <w:r>
+              <w:rPr>
+                <w:sz w:val="21"/>
+                <w:szCs w:val="21"/>
+              </w:rPr>
+              <w:t>Yes  ☐</w:t>
+            </w:r>
+            <w:proofErr w:type="gramEnd"/>
+            <w:r>
+              <w:rPr>
+                <w:sz w:val="21"/>
+                <w:szCs w:val="21"/>
+              </w:rPr>
+              <w:t xml:space="preserve"> No</w:t>
             </w:r>
           </w:p>
         </w:tc>
@@ -1350,21 +2213,57 @@
       <w:tr>
         <w:tc>
           <w:tcPr>
-            <w:tcW w:type="dxa" w:w="8797"/>
-          </w:tcPr>
-          <w:p>
-            <w:r>
+            <w:tcW w:w="8797" w:type="dxa"/>
+          </w:tcPr>
+          <w:p>
+            <w:pPr>
+              <w:rPr>
+                <w:sz w:val="20"/>
+                <w:szCs w:val="20"/>
+              </w:rPr>
+            </w:pPr>
+            <w:r>
+              <w:rPr>
+                <w:sz w:val="20"/>
+                <w:szCs w:val="20"/>
+              </w:rPr>
               <w:t>A11 - Appendix 2 Knowledge Evidence — you answered all 9 KE questions (5 selection-style + 4 demonstration-style) with reference to specific sections of your own Business Case (not generic textbook answers)</w:t>
             </w:r>
           </w:p>
         </w:tc>
         <w:tc>
           <w:tcPr>
-            <w:tcW w:type="dxa" w:w="1943"/>
-          </w:tcPr>
-          <w:p>
-            <w:r>
-              <w:t>☐ Yes  ☐ No</w:t>
+            <w:tcW w:w="1943" w:type="dxa"/>
+          </w:tcPr>
+          <w:p>
+            <w:pPr>
+              <w:rPr>
+                <w:sz w:val="21"/>
+                <w:szCs w:val="21"/>
+              </w:rPr>
+            </w:pPr>
+            <w:r>
+              <w:rPr>
+                <w:sz w:val="21"/>
+                <w:szCs w:val="21"/>
+              </w:rPr>
+              <w:t xml:space="preserve">☐ </w:t>
+            </w:r>
+            <w:proofErr w:type="gramStart"/>
+            <w:r>
+              <w:rPr>
+                <w:sz w:val="21"/>
+                <w:szCs w:val="21"/>
+              </w:rPr>
+              <w:t>Yes  ☐</w:t>
+            </w:r>
+            <w:proofErr w:type="gramEnd"/>
+            <w:r>
+              <w:rPr>
+                <w:sz w:val="21"/>
+                <w:szCs w:val="21"/>
+              </w:rPr>
+              <w:t xml:space="preserve"> No</w:t>
             </w:r>
           </w:p>
         </w:tc>
@@ -1372,21 +2271,57 @@
       <w:tr>
         <w:tc>
           <w:tcPr>
-            <w:tcW w:type="dxa" w:w="8797"/>
-          </w:tcPr>
-          <w:p>
-            <w:r>
+            <w:tcW w:w="8797" w:type="dxa"/>
+          </w:tcPr>
+          <w:p>
+            <w:pPr>
+              <w:rPr>
+                <w:sz w:val="20"/>
+                <w:szCs w:val="20"/>
+              </w:rPr>
+            </w:pPr>
+            <w:r>
+              <w:rPr>
+                <w:sz w:val="20"/>
+                <w:szCs w:val="20"/>
+              </w:rPr>
               <w:t>A12 - Appendix 3 Supporting Research — AWS Pricing Calculator export attached; external research sources cited with URLs and access dates</w:t>
             </w:r>
           </w:p>
         </w:tc>
         <w:tc>
           <w:tcPr>
-            <w:tcW w:type="dxa" w:w="1943"/>
-          </w:tcPr>
-          <w:p>
-            <w:r>
-              <w:t>☐ Yes  ☐ No</w:t>
+            <w:tcW w:w="1943" w:type="dxa"/>
+          </w:tcPr>
+          <w:p>
+            <w:pPr>
+              <w:rPr>
+                <w:sz w:val="21"/>
+                <w:szCs w:val="21"/>
+              </w:rPr>
+            </w:pPr>
+            <w:r>
+              <w:rPr>
+                <w:sz w:val="21"/>
+                <w:szCs w:val="21"/>
+              </w:rPr>
+              <w:t xml:space="preserve">☐ </w:t>
+            </w:r>
+            <w:proofErr w:type="gramStart"/>
+            <w:r>
+              <w:rPr>
+                <w:sz w:val="21"/>
+                <w:szCs w:val="21"/>
+              </w:rPr>
+              <w:t>Yes  ☐</w:t>
+            </w:r>
+            <w:proofErr w:type="gramEnd"/>
+            <w:r>
+              <w:rPr>
+                <w:sz w:val="21"/>
+                <w:szCs w:val="21"/>
+              </w:rPr>
+              <w:t xml:space="preserve"> No</w:t>
             </w:r>
           </w:p>
         </w:tc>
@@ -1394,21 +2329,57 @@
       <w:tr>
         <w:tc>
           <w:tcPr>
-            <w:tcW w:type="dxa" w:w="8797"/>
-          </w:tcPr>
-          <w:p>
-            <w:r>
+            <w:tcW w:w="8797" w:type="dxa"/>
+          </w:tcPr>
+          <w:p>
+            <w:pPr>
+              <w:rPr>
+                <w:sz w:val="20"/>
+                <w:szCs w:val="20"/>
+              </w:rPr>
+            </w:pPr>
+            <w:r>
+              <w:rPr>
+                <w:sz w:val="20"/>
+                <w:szCs w:val="20"/>
+              </w:rPr>
               <w:t>A13 - Appendix 4 Feedback Record — completed during/after the Part B presentation event using the YAT Feedback Record template; captures actual board feedback</w:t>
             </w:r>
           </w:p>
         </w:tc>
         <w:tc>
           <w:tcPr>
-            <w:tcW w:type="dxa" w:w="1943"/>
-          </w:tcPr>
-          <w:p>
-            <w:r>
-              <w:t>☐ Yes  ☐ No</w:t>
+            <w:tcW w:w="1943" w:type="dxa"/>
+          </w:tcPr>
+          <w:p>
+            <w:pPr>
+              <w:rPr>
+                <w:sz w:val="21"/>
+                <w:szCs w:val="21"/>
+              </w:rPr>
+            </w:pPr>
+            <w:r>
+              <w:rPr>
+                <w:sz w:val="21"/>
+                <w:szCs w:val="21"/>
+              </w:rPr>
+              <w:t xml:space="preserve">☐ </w:t>
+            </w:r>
+            <w:proofErr w:type="gramStart"/>
+            <w:r>
+              <w:rPr>
+                <w:sz w:val="21"/>
+                <w:szCs w:val="21"/>
+              </w:rPr>
+              <w:t>Yes  ☐</w:t>
+            </w:r>
+            <w:proofErr w:type="gramEnd"/>
+            <w:r>
+              <w:rPr>
+                <w:sz w:val="21"/>
+                <w:szCs w:val="21"/>
+              </w:rPr>
+              <w:t xml:space="preserve"> No</w:t>
             </w:r>
           </w:p>
         </w:tc>
@@ -1416,21 +2387,57 @@
       <w:tr>
         <w:tc>
           <w:tcPr>
-            <w:tcW w:type="dxa" w:w="8797"/>
-          </w:tcPr>
-          <w:p>
-            <w:r>
+            <w:tcW w:w="8797" w:type="dxa"/>
+          </w:tcPr>
+          <w:p>
+            <w:pPr>
+              <w:rPr>
+                <w:sz w:val="20"/>
+                <w:szCs w:val="20"/>
+              </w:rPr>
+            </w:pPr>
+            <w:r>
+              <w:rPr>
+                <w:sz w:val="20"/>
+                <w:szCs w:val="20"/>
+              </w:rPr>
               <w:t>A14 - Sign-off block — signed by the role-played YAT ICT Manager at the end of the Part B presentation event</w:t>
             </w:r>
           </w:p>
         </w:tc>
         <w:tc>
           <w:tcPr>
-            <w:tcW w:type="dxa" w:w="1943"/>
-          </w:tcPr>
-          <w:p>
-            <w:r>
-              <w:t>☐ Yes  ☐ No</w:t>
+            <w:tcW w:w="1943" w:type="dxa"/>
+          </w:tcPr>
+          <w:p>
+            <w:pPr>
+              <w:rPr>
+                <w:sz w:val="21"/>
+                <w:szCs w:val="21"/>
+              </w:rPr>
+            </w:pPr>
+            <w:r>
+              <w:rPr>
+                <w:sz w:val="21"/>
+                <w:szCs w:val="21"/>
+              </w:rPr>
+              <w:t xml:space="preserve">☐ </w:t>
+            </w:r>
+            <w:proofErr w:type="gramStart"/>
+            <w:r>
+              <w:rPr>
+                <w:sz w:val="21"/>
+                <w:szCs w:val="21"/>
+              </w:rPr>
+              <w:t>Yes  ☐</w:t>
+            </w:r>
+            <w:proofErr w:type="gramEnd"/>
+            <w:r>
+              <w:rPr>
+                <w:sz w:val="21"/>
+                <w:szCs w:val="21"/>
+              </w:rPr>
+              <w:t xml:space="preserve"> No</w:t>
             </w:r>
           </w:p>
         </w:tc>
@@ -1438,21 +2445,57 @@
       <w:tr>
         <w:tc>
           <w:tcPr>
-            <w:tcW w:type="dxa" w:w="8797"/>
-          </w:tcPr>
-          <w:p>
-            <w:r>
+            <w:tcW w:w="8797" w:type="dxa"/>
+          </w:tcPr>
+          <w:p>
+            <w:pPr>
+              <w:rPr>
+                <w:sz w:val="20"/>
+                <w:szCs w:val="20"/>
+              </w:rPr>
+            </w:pPr>
+            <w:r>
+              <w:rPr>
+                <w:sz w:val="20"/>
+                <w:szCs w:val="20"/>
+              </w:rPr>
               <w:t>A15 - Document quality — Business Case uses plain English, appropriate vocabulary, terminology, diagrams, numerical information, formatting and structure relevant to a professional consulting deliverable for an RTO client</w:t>
             </w:r>
           </w:p>
         </w:tc>
         <w:tc>
           <w:tcPr>
-            <w:tcW w:type="dxa" w:w="1943"/>
-          </w:tcPr>
-          <w:p>
-            <w:r>
-              <w:t>☐ Yes  ☐ No</w:t>
+            <w:tcW w:w="1943" w:type="dxa"/>
+          </w:tcPr>
+          <w:p>
+            <w:pPr>
+              <w:rPr>
+                <w:sz w:val="21"/>
+                <w:szCs w:val="21"/>
+              </w:rPr>
+            </w:pPr>
+            <w:r>
+              <w:rPr>
+                <w:sz w:val="21"/>
+                <w:szCs w:val="21"/>
+              </w:rPr>
+              <w:t xml:space="preserve">☐ </w:t>
+            </w:r>
+            <w:proofErr w:type="gramStart"/>
+            <w:r>
+              <w:rPr>
+                <w:sz w:val="21"/>
+                <w:szCs w:val="21"/>
+              </w:rPr>
+              <w:t>Yes  ☐</w:t>
+            </w:r>
+            <w:proofErr w:type="gramEnd"/>
+            <w:r>
+              <w:rPr>
+                <w:sz w:val="21"/>
+                <w:szCs w:val="21"/>
+              </w:rPr>
+              <w:t xml:space="preserve"> No</w:t>
             </w:r>
           </w:p>
         </w:tc>
@@ -1460,12 +2503,20 @@
       <w:tr>
         <w:tc>
           <w:tcPr>
-            <w:tcW w:type="dxa" w:w="8797"/>
-          </w:tcPr>
-          <w:p>
+            <w:tcW w:w="8797" w:type="dxa"/>
+          </w:tcPr>
+          <w:p>
+            <w:pPr>
+              <w:rPr>
+                <w:sz w:val="20"/>
+                <w:szCs w:val="20"/>
+              </w:rPr>
+            </w:pPr>
             <w:r>
               <w:rPr>
                 <w:b/>
+                <w:sz w:val="20"/>
+                <w:szCs w:val="20"/>
               </w:rPr>
               <w:t>Part B - Presentation</w:t>
             </w:r>
@@ -1473,31 +2524,72 @@
         </w:tc>
         <w:tc>
           <w:tcPr>
-            <w:tcW w:type="dxa" w:w="1943"/>
-          </w:tcPr>
-          <w:p>
-            <w:r/>
+            <w:tcW w:w="1943" w:type="dxa"/>
+          </w:tcPr>
+          <w:p>
+            <w:pPr>
+              <w:rPr>
+                <w:sz w:val="21"/>
+                <w:szCs w:val="21"/>
+              </w:rPr>
+            </w:pPr>
           </w:p>
         </w:tc>
       </w:tr>
       <w:tr>
         <w:tc>
           <w:tcPr>
-            <w:tcW w:type="dxa" w:w="8797"/>
-          </w:tcPr>
-          <w:p>
-            <w:r>
+            <w:tcW w:w="8797" w:type="dxa"/>
+          </w:tcPr>
+          <w:p>
+            <w:pPr>
+              <w:rPr>
+                <w:sz w:val="20"/>
+                <w:szCs w:val="20"/>
+              </w:rPr>
+            </w:pPr>
+            <w:r>
+              <w:rPr>
+                <w:sz w:val="20"/>
+                <w:szCs w:val="20"/>
+              </w:rPr>
               <w:t>B1 - You reported on proposed changes, gaps and improvement opportunities to the role-played superior during the meeting (walks the board through the relevant Business Case content)</w:t>
             </w:r>
           </w:p>
         </w:tc>
         <w:tc>
           <w:tcPr>
-            <w:tcW w:type="dxa" w:w="1943"/>
-          </w:tcPr>
-          <w:p>
-            <w:r>
-              <w:t>☐ Yes  ☐ No</w:t>
+            <w:tcW w:w="1943" w:type="dxa"/>
+          </w:tcPr>
+          <w:p>
+            <w:pPr>
+              <w:rPr>
+                <w:sz w:val="21"/>
+                <w:szCs w:val="21"/>
+              </w:rPr>
+            </w:pPr>
+            <w:r>
+              <w:rPr>
+                <w:sz w:val="21"/>
+                <w:szCs w:val="21"/>
+              </w:rPr>
+              <w:t xml:space="preserve">☐ </w:t>
+            </w:r>
+            <w:proofErr w:type="gramStart"/>
+            <w:r>
+              <w:rPr>
+                <w:sz w:val="21"/>
+                <w:szCs w:val="21"/>
+              </w:rPr>
+              <w:t>Yes  ☐</w:t>
+            </w:r>
+            <w:proofErr w:type="gramEnd"/>
+            <w:r>
+              <w:rPr>
+                <w:sz w:val="21"/>
+                <w:szCs w:val="21"/>
+              </w:rPr>
+              <w:t xml:space="preserve"> No</w:t>
             </w:r>
           </w:p>
         </w:tc>
@@ -1505,21 +2597,57 @@
       <w:tr>
         <w:tc>
           <w:tcPr>
-            <w:tcW w:type="dxa" w:w="8797"/>
-          </w:tcPr>
-          <w:p>
-            <w:r>
+            <w:tcW w:w="8797" w:type="dxa"/>
+          </w:tcPr>
+          <w:p>
+            <w:pPr>
+              <w:rPr>
+                <w:sz w:val="20"/>
+                <w:szCs w:val="20"/>
+              </w:rPr>
+            </w:pPr>
+            <w:r>
+              <w:rPr>
+                <w:sz w:val="20"/>
+                <w:szCs w:val="20"/>
+              </w:rPr>
               <w:t xml:space="preserve">B2 - The documented evaluation process is provided to the superior at/before the meeting; you walked the superior through it for feedback during the meeting </w:t>
             </w:r>
           </w:p>
         </w:tc>
         <w:tc>
           <w:tcPr>
-            <w:tcW w:type="dxa" w:w="1943"/>
-          </w:tcPr>
-          <w:p>
-            <w:r>
-              <w:t>☐ Yes  ☐ No</w:t>
+            <w:tcW w:w="1943" w:type="dxa"/>
+          </w:tcPr>
+          <w:p>
+            <w:pPr>
+              <w:rPr>
+                <w:sz w:val="21"/>
+                <w:szCs w:val="21"/>
+              </w:rPr>
+            </w:pPr>
+            <w:r>
+              <w:rPr>
+                <w:sz w:val="21"/>
+                <w:szCs w:val="21"/>
+              </w:rPr>
+              <w:t xml:space="preserve">☐ </w:t>
+            </w:r>
+            <w:proofErr w:type="gramStart"/>
+            <w:r>
+              <w:rPr>
+                <w:sz w:val="21"/>
+                <w:szCs w:val="21"/>
+              </w:rPr>
+              <w:t>Yes  ☐</w:t>
+            </w:r>
+            <w:proofErr w:type="gramEnd"/>
+            <w:r>
+              <w:rPr>
+                <w:sz w:val="21"/>
+                <w:szCs w:val="21"/>
+              </w:rPr>
+              <w:t xml:space="preserve"> No</w:t>
             </w:r>
           </w:p>
         </w:tc>
@@ -1527,21 +2655,57 @@
       <w:tr>
         <w:tc>
           <w:tcPr>
-            <w:tcW w:type="dxa" w:w="8797"/>
-          </w:tcPr>
-          <w:p>
-            <w:r>
+            <w:tcW w:w="8797" w:type="dxa"/>
+          </w:tcPr>
+          <w:p>
+            <w:pPr>
+              <w:rPr>
+                <w:sz w:val="20"/>
+                <w:szCs w:val="20"/>
+              </w:rPr>
+            </w:pPr>
+            <w:r>
+              <w:rPr>
+                <w:sz w:val="20"/>
+                <w:szCs w:val="20"/>
+              </w:rPr>
               <w:t>B3 - Action plan is provided to the superior during the meeting; you explicitly sought the superior's feedback and approval on it</w:t>
             </w:r>
           </w:p>
         </w:tc>
         <w:tc>
           <w:tcPr>
-            <w:tcW w:type="dxa" w:w="1943"/>
-          </w:tcPr>
-          <w:p>
-            <w:r>
-              <w:t>☐ Yes  ☐ No</w:t>
+            <w:tcW w:w="1943" w:type="dxa"/>
+          </w:tcPr>
+          <w:p>
+            <w:pPr>
+              <w:rPr>
+                <w:sz w:val="21"/>
+                <w:szCs w:val="21"/>
+              </w:rPr>
+            </w:pPr>
+            <w:r>
+              <w:rPr>
+                <w:sz w:val="21"/>
+                <w:szCs w:val="21"/>
+              </w:rPr>
+              <w:t xml:space="preserve">☐ </w:t>
+            </w:r>
+            <w:proofErr w:type="gramStart"/>
+            <w:r>
+              <w:rPr>
+                <w:sz w:val="21"/>
+                <w:szCs w:val="21"/>
+              </w:rPr>
+              <w:t>Yes  ☐</w:t>
+            </w:r>
+            <w:proofErr w:type="gramEnd"/>
+            <w:r>
+              <w:rPr>
+                <w:sz w:val="21"/>
+                <w:szCs w:val="21"/>
+              </w:rPr>
+              <w:t xml:space="preserve"> No</w:t>
             </w:r>
           </w:p>
         </w:tc>
@@ -1549,21 +2713,57 @@
       <w:tr>
         <w:tc>
           <w:tcPr>
-            <w:tcW w:type="dxa" w:w="8797"/>
-          </w:tcPr>
-          <w:p>
-            <w:r>
+            <w:tcW w:w="8797" w:type="dxa"/>
+          </w:tcPr>
+          <w:p>
+            <w:pPr>
+              <w:rPr>
+                <w:sz w:val="20"/>
+                <w:szCs w:val="20"/>
+              </w:rPr>
+            </w:pPr>
+            <w:r>
+              <w:rPr>
+                <w:sz w:val="20"/>
+                <w:szCs w:val="20"/>
+              </w:rPr>
               <w:t>B4 - You document and communicate the work through the presentation event (deck + verbal delivery to the role-played stakeholder)</w:t>
             </w:r>
           </w:p>
         </w:tc>
         <w:tc>
           <w:tcPr>
-            <w:tcW w:type="dxa" w:w="1943"/>
-          </w:tcPr>
-          <w:p>
-            <w:r>
-              <w:t>☐ Yes  ☐ No</w:t>
+            <w:tcW w:w="1943" w:type="dxa"/>
+          </w:tcPr>
+          <w:p>
+            <w:pPr>
+              <w:rPr>
+                <w:sz w:val="21"/>
+                <w:szCs w:val="21"/>
+              </w:rPr>
+            </w:pPr>
+            <w:r>
+              <w:rPr>
+                <w:sz w:val="21"/>
+                <w:szCs w:val="21"/>
+              </w:rPr>
+              <w:t xml:space="preserve">☐ </w:t>
+            </w:r>
+            <w:proofErr w:type="gramStart"/>
+            <w:r>
+              <w:rPr>
+                <w:sz w:val="21"/>
+                <w:szCs w:val="21"/>
+              </w:rPr>
+              <w:t>Yes  ☐</w:t>
+            </w:r>
+            <w:proofErr w:type="gramEnd"/>
+            <w:r>
+              <w:rPr>
+                <w:sz w:val="21"/>
+                <w:szCs w:val="21"/>
+              </w:rPr>
+              <w:t xml:space="preserve"> No</w:t>
             </w:r>
           </w:p>
         </w:tc>
@@ -1571,21 +2771,58 @@
       <w:tr>
         <w:tc>
           <w:tcPr>
-            <w:tcW w:type="dxa" w:w="8797"/>
-          </w:tcPr>
-          <w:p>
-            <w:r>
+            <w:tcW w:w="8797" w:type="dxa"/>
+          </w:tcPr>
+          <w:p>
+            <w:pPr>
+              <w:rPr>
+                <w:sz w:val="20"/>
+                <w:szCs w:val="20"/>
+              </w:rPr>
+            </w:pPr>
+            <w:r>
+              <w:rPr>
+                <w:sz w:val="20"/>
+                <w:szCs w:val="20"/>
+              </w:rPr>
+              <w:lastRenderedPageBreak/>
               <w:t>B5 – You seek feedback during Q&amp;A and respond substantively to feedback received</w:t>
             </w:r>
           </w:p>
         </w:tc>
         <w:tc>
           <w:tcPr>
-            <w:tcW w:type="dxa" w:w="1943"/>
-          </w:tcPr>
-          <w:p>
-            <w:r>
-              <w:t>☐ Yes  ☐ No</w:t>
+            <w:tcW w:w="1943" w:type="dxa"/>
+          </w:tcPr>
+          <w:p>
+            <w:pPr>
+              <w:rPr>
+                <w:sz w:val="21"/>
+                <w:szCs w:val="21"/>
+              </w:rPr>
+            </w:pPr>
+            <w:r>
+              <w:rPr>
+                <w:sz w:val="21"/>
+                <w:szCs w:val="21"/>
+              </w:rPr>
+              <w:t xml:space="preserve">☐ </w:t>
+            </w:r>
+            <w:proofErr w:type="gramStart"/>
+            <w:r>
+              <w:rPr>
+                <w:sz w:val="21"/>
+                <w:szCs w:val="21"/>
+              </w:rPr>
+              <w:t>Yes  ☐</w:t>
+            </w:r>
+            <w:proofErr w:type="gramEnd"/>
+            <w:r>
+              <w:rPr>
+                <w:sz w:val="21"/>
+                <w:szCs w:val="21"/>
+              </w:rPr>
+              <w:t xml:space="preserve"> No</w:t>
             </w:r>
           </w:p>
         </w:tc>
@@ -1593,21 +2830,57 @@
       <w:tr>
         <w:tc>
           <w:tcPr>
-            <w:tcW w:type="dxa" w:w="8797"/>
-          </w:tcPr>
-          <w:p>
-            <w:r>
+            <w:tcW w:w="8797" w:type="dxa"/>
+          </w:tcPr>
+          <w:p>
+            <w:pPr>
+              <w:rPr>
+                <w:sz w:val="20"/>
+                <w:szCs w:val="20"/>
+              </w:rPr>
+            </w:pPr>
+            <w:r>
+              <w:rPr>
+                <w:sz w:val="20"/>
+                <w:szCs w:val="20"/>
+              </w:rPr>
               <w:t>B6 – You confirm, seek, and respond to feedback with the role-played superior</w:t>
             </w:r>
           </w:p>
         </w:tc>
         <w:tc>
           <w:tcPr>
-            <w:tcW w:type="dxa" w:w="1943"/>
-          </w:tcPr>
-          <w:p>
-            <w:r>
-              <w:t>☐ Yes  ☐ No</w:t>
+            <w:tcW w:w="1943" w:type="dxa"/>
+          </w:tcPr>
+          <w:p>
+            <w:pPr>
+              <w:rPr>
+                <w:sz w:val="21"/>
+                <w:szCs w:val="21"/>
+              </w:rPr>
+            </w:pPr>
+            <w:r>
+              <w:rPr>
+                <w:sz w:val="21"/>
+                <w:szCs w:val="21"/>
+              </w:rPr>
+              <w:t xml:space="preserve">☐ </w:t>
+            </w:r>
+            <w:proofErr w:type="gramStart"/>
+            <w:r>
+              <w:rPr>
+                <w:sz w:val="21"/>
+                <w:szCs w:val="21"/>
+              </w:rPr>
+              <w:t>Yes  ☐</w:t>
+            </w:r>
+            <w:proofErr w:type="gramEnd"/>
+            <w:r>
+              <w:rPr>
+                <w:sz w:val="21"/>
+                <w:szCs w:val="21"/>
+              </w:rPr>
+              <w:t xml:space="preserve"> No</w:t>
             </w:r>
           </w:p>
         </w:tc>
@@ -1615,21 +2888,57 @@
       <w:tr>
         <w:tc>
           <w:tcPr>
-            <w:tcW w:type="dxa" w:w="8797"/>
-          </w:tcPr>
-          <w:p>
-            <w:r>
+            <w:tcW w:w="8797" w:type="dxa"/>
+          </w:tcPr>
+          <w:p>
+            <w:pPr>
+              <w:rPr>
+                <w:sz w:val="20"/>
+                <w:szCs w:val="20"/>
+              </w:rPr>
+            </w:pPr>
+            <w:r>
+              <w:rPr>
+                <w:sz w:val="20"/>
+                <w:szCs w:val="20"/>
+              </w:rPr>
               <w:t xml:space="preserve">B7 – You use plain English and translate technical terminology when necessary, communicating with the role-played superior to articulate ideas, requirements, and plans </w:t>
             </w:r>
           </w:p>
         </w:tc>
         <w:tc>
           <w:tcPr>
-            <w:tcW w:type="dxa" w:w="1943"/>
-          </w:tcPr>
-          <w:p>
-            <w:r>
-              <w:t>☐ Yes  ☐ No</w:t>
+            <w:tcW w:w="1943" w:type="dxa"/>
+          </w:tcPr>
+          <w:p>
+            <w:pPr>
+              <w:rPr>
+                <w:sz w:val="21"/>
+                <w:szCs w:val="21"/>
+              </w:rPr>
+            </w:pPr>
+            <w:r>
+              <w:rPr>
+                <w:sz w:val="21"/>
+                <w:szCs w:val="21"/>
+              </w:rPr>
+              <w:t xml:space="preserve">☐ </w:t>
+            </w:r>
+            <w:proofErr w:type="gramStart"/>
+            <w:r>
+              <w:rPr>
+                <w:sz w:val="21"/>
+                <w:szCs w:val="21"/>
+              </w:rPr>
+              <w:t>Yes  ☐</w:t>
+            </w:r>
+            <w:proofErr w:type="gramEnd"/>
+            <w:r>
+              <w:rPr>
+                <w:sz w:val="21"/>
+                <w:szCs w:val="21"/>
+              </w:rPr>
+              <w:t xml:space="preserve"> No</w:t>
             </w:r>
           </w:p>
         </w:tc>
@@ -1637,21 +2946,57 @@
       <w:tr>
         <w:tc>
           <w:tcPr>
-            <w:tcW w:type="dxa" w:w="8797"/>
-          </w:tcPr>
-          <w:p>
-            <w:r>
+            <w:tcW w:w="8797" w:type="dxa"/>
+          </w:tcPr>
+          <w:p>
+            <w:pPr>
+              <w:rPr>
+                <w:sz w:val="20"/>
+                <w:szCs w:val="20"/>
+              </w:rPr>
+            </w:pPr>
+            <w:r>
+              <w:rPr>
+                <w:sz w:val="20"/>
+                <w:szCs w:val="20"/>
+              </w:rPr>
               <w:t>B8 - You elicit information using effective listening and questioning techniques during the Q&amp;A</w:t>
             </w:r>
           </w:p>
         </w:tc>
         <w:tc>
           <w:tcPr>
-            <w:tcW w:type="dxa" w:w="1943"/>
-          </w:tcPr>
-          <w:p>
-            <w:r>
-              <w:t>☐ Yes  ☐ No</w:t>
+            <w:tcW w:w="1943" w:type="dxa"/>
+          </w:tcPr>
+          <w:p>
+            <w:pPr>
+              <w:rPr>
+                <w:sz w:val="21"/>
+                <w:szCs w:val="21"/>
+              </w:rPr>
+            </w:pPr>
+            <w:r>
+              <w:rPr>
+                <w:sz w:val="21"/>
+                <w:szCs w:val="21"/>
+              </w:rPr>
+              <w:t xml:space="preserve">☐ </w:t>
+            </w:r>
+            <w:proofErr w:type="gramStart"/>
+            <w:r>
+              <w:rPr>
+                <w:sz w:val="21"/>
+                <w:szCs w:val="21"/>
+              </w:rPr>
+              <w:t>Yes  ☐</w:t>
+            </w:r>
+            <w:proofErr w:type="gramEnd"/>
+            <w:r>
+              <w:rPr>
+                <w:sz w:val="21"/>
+                <w:szCs w:val="21"/>
+              </w:rPr>
+              <w:t xml:space="preserve"> No</w:t>
             </w:r>
           </w:p>
         </w:tc>
@@ -1659,32 +3004,63 @@
       <w:tr>
         <w:tc>
           <w:tcPr>
-            <w:tcW w:type="dxa" w:w="8797"/>
-          </w:tcPr>
-          <w:p>
-            <w:r>
+            <w:tcW w:w="8797" w:type="dxa"/>
+          </w:tcPr>
+          <w:p>
+            <w:pPr>
+              <w:rPr>
+                <w:sz w:val="20"/>
+                <w:szCs w:val="20"/>
+              </w:rPr>
+            </w:pPr>
+            <w:r>
+              <w:rPr>
+                <w:sz w:val="20"/>
+                <w:szCs w:val="20"/>
+              </w:rPr>
               <w:t>B9 – You use listening and questioning techniques to articulate complex concepts and requirements using industry language for the intended audience</w:t>
             </w:r>
           </w:p>
         </w:tc>
         <w:tc>
           <w:tcPr>
-            <w:tcW w:type="dxa" w:w="1943"/>
-          </w:tcPr>
-          <w:p>
-            <w:r>
-              <w:t>☐ Yes  ☐ No</w:t>
+            <w:tcW w:w="1943" w:type="dxa"/>
+          </w:tcPr>
+          <w:p>
+            <w:pPr>
+              <w:rPr>
+                <w:sz w:val="21"/>
+                <w:szCs w:val="21"/>
+              </w:rPr>
+            </w:pPr>
+            <w:r>
+              <w:rPr>
+                <w:sz w:val="21"/>
+                <w:szCs w:val="21"/>
+              </w:rPr>
+              <w:t xml:space="preserve">☐ </w:t>
+            </w:r>
+            <w:proofErr w:type="gramStart"/>
+            <w:r>
+              <w:rPr>
+                <w:sz w:val="21"/>
+                <w:szCs w:val="21"/>
+              </w:rPr>
+              <w:t>Yes  ☐</w:t>
+            </w:r>
+            <w:proofErr w:type="gramEnd"/>
+            <w:r>
+              <w:rPr>
+                <w:sz w:val="21"/>
+                <w:szCs w:val="21"/>
+              </w:rPr>
+              <w:t xml:space="preserve"> No</w:t>
             </w:r>
           </w:p>
         </w:tc>
       </w:tr>
+      <w:bookmarkEnd w:id="5"/>
     </w:tbl>
-    <w:p>
-      <w:pPr>
-        <w:pStyle w:val="Assessortext"/>
-      </w:pPr>
-    </w:p>
-    <w:bookmarkEnd w:id="5"/>
     <w:p/>
     <w:p>
       <w:pPr>
@@ -1697,256 +3073,696 @@
     <w:p>
       <w:pPr>
         <w:pStyle w:val="Assessortext"/>
-      </w:pPr>
-      <w:r>
+        <w:rPr>
+          <w:b/>
+          <w:bCs/>
+          <w:color w:val="000000" w:themeColor="text1"/>
+        </w:rPr>
+      </w:pPr>
+      <w:r>
+        <w:rPr>
+          <w:b/>
+          <w:bCs/>
+          <w:color w:val="000000" w:themeColor="text1"/>
+        </w:rPr>
         <w:t>The engagement and your role</w:t>
       </w:r>
     </w:p>
     <w:p>
       <w:pPr>
         <w:pStyle w:val="Assessortext"/>
-      </w:pPr>
-      <w:r>
+        <w:rPr>
+          <w:color w:val="000000" w:themeColor="text1"/>
+          <w:sz w:val="20"/>
+          <w:szCs w:val="20"/>
+        </w:rPr>
+      </w:pPr>
+      <w:r>
+        <w:rPr>
+          <w:color w:val="000000" w:themeColor="text1"/>
+          <w:sz w:val="20"/>
+          <w:szCs w:val="20"/>
+        </w:rPr>
         <w:t>YAT College is a Registered Training Organisation (RTO) based at 175 Cremorne Street, Cremorne VIC. YAT's mission-critical Learning Management System (LMS) — running on a single on-premises Windows Server 2016 / MySQL / DOODLE stack — is at the end of its hardware life and falls short of YAT's strategic availability target of 99.9%. YAT's ICT staff are highly capable on their current environment but lack cloud experience, which is why MTS has been engaged.</w:t>
       </w:r>
     </w:p>
     <w:p>
       <w:pPr>
         <w:pStyle w:val="Assessortext"/>
-      </w:pPr>
-      <w:r>
-        <w:t>You are an MP Tech Solutions (MTS) consultant reporting to Pat Lin (MTS Senior Consultant). Pat liaises with Sam Walker (YAT ICT Manager) for sign-offs. Sam will receive your Business Case and is your primary YAT-side stakeholder.</w:t>
-      </w:r>
-    </w:p>
-    <w:p>
-      <w:pPr>
-        <w:pStyle w:val="Assessortext"/>
-      </w:pPr>
-      <w:r>
+        <w:rPr>
+          <w:color w:val="000000" w:themeColor="text1"/>
+          <w:sz w:val="20"/>
+          <w:szCs w:val="20"/>
+        </w:rPr>
+      </w:pPr>
+    </w:p>
+    <w:p>
+      <w:pPr>
+        <w:pStyle w:val="Assessortext"/>
+        <w:rPr>
+          <w:color w:val="000000" w:themeColor="text1"/>
+          <w:sz w:val="20"/>
+          <w:szCs w:val="20"/>
+        </w:rPr>
+      </w:pPr>
+      <w:r>
+        <w:rPr>
+          <w:color w:val="000000" w:themeColor="text1"/>
+          <w:sz w:val="20"/>
+          <w:szCs w:val="20"/>
+        </w:rPr>
+        <w:t xml:space="preserve">You are an MP Tech Solutions (MTS) consultant reporting to Pat Lin (MTS Senior Consultant). Pat liaises with Sam Walker (YAT ICT Manager) for </w:t>
+      </w:r>
+      <w:proofErr w:type="gramStart"/>
+      <w:r>
+        <w:rPr>
+          <w:color w:val="000000" w:themeColor="text1"/>
+          <w:sz w:val="20"/>
+          <w:szCs w:val="20"/>
+        </w:rPr>
+        <w:t>sign-offs</w:t>
+      </w:r>
+      <w:proofErr w:type="gramEnd"/>
+      <w:r>
+        <w:rPr>
+          <w:color w:val="000000" w:themeColor="text1"/>
+          <w:sz w:val="20"/>
+          <w:szCs w:val="20"/>
+        </w:rPr>
+        <w:t>. Sam will receive your Business Case and is your primary YAT-side stakeholder.</w:t>
+      </w:r>
+    </w:p>
+    <w:p>
+      <w:pPr>
+        <w:pStyle w:val="Assessortext"/>
+        <w:rPr>
+          <w:color w:val="000000" w:themeColor="text1"/>
+          <w:sz w:val="20"/>
+          <w:szCs w:val="20"/>
+        </w:rPr>
+      </w:pPr>
+    </w:p>
+    <w:p>
+      <w:pPr>
+        <w:pStyle w:val="Assessortext"/>
+        <w:rPr>
+          <w:color w:val="000000" w:themeColor="text1"/>
+          <w:sz w:val="20"/>
+          <w:szCs w:val="20"/>
+        </w:rPr>
+      </w:pPr>
+      <w:r>
+        <w:rPr>
+          <w:color w:val="000000" w:themeColor="text1"/>
+          <w:sz w:val="20"/>
+          <w:szCs w:val="20"/>
+        </w:rPr>
         <w:t>AT1 is the analysis and planning phase of the engagement. The work you produce in AT1 flows into AT2 and AT3 of this cluster — the action plan approved at the end of AT1 becomes the brief for the build work in AT2.</w:t>
       </w:r>
     </w:p>
     <w:p>
       <w:pPr>
         <w:pStyle w:val="Heading2"/>
-      </w:pPr>
-      <w:r>
+        <w:rPr>
+          <w:sz w:val="20"/>
+          <w:szCs w:val="16"/>
+        </w:rPr>
+      </w:pPr>
+    </w:p>
+    <w:p>
+      <w:pPr>
+        <w:pStyle w:val="Heading2"/>
+        <w:rPr>
+          <w:color w:val="000000" w:themeColor="text1"/>
+        </w:rPr>
+      </w:pPr>
+      <w:r>
+        <w:rPr>
+          <w:color w:val="000000" w:themeColor="text1"/>
+        </w:rPr>
         <w:t>Part A — Business Case</w:t>
       </w:r>
     </w:p>
     <w:p>
       <w:pPr>
         <w:pStyle w:val="Assessortext"/>
-      </w:pPr>
-      <w:r>
+        <w:rPr>
+          <w:color w:val="000000" w:themeColor="text1"/>
+          <w:sz w:val="20"/>
+          <w:szCs w:val="20"/>
+        </w:rPr>
+      </w:pPr>
+      <w:r>
+        <w:rPr>
+          <w:color w:val="000000" w:themeColor="text1"/>
+          <w:sz w:val="20"/>
+          <w:szCs w:val="20"/>
+        </w:rPr>
         <w:t>Using the YAT Business Case template (download from the intranet's Templates section), populate every section. The Business Case is the primary written deliverable and must contain:</w:t>
       </w:r>
     </w:p>
     <w:p>
       <w:pPr>
         <w:pStyle w:val="Assessortext"/>
-      </w:pPr>
-      <w:r>
+        <w:rPr>
+          <w:color w:val="000000" w:themeColor="text1"/>
+          <w:sz w:val="20"/>
+          <w:szCs w:val="20"/>
+        </w:rPr>
+      </w:pPr>
+    </w:p>
+    <w:p>
+      <w:pPr>
+        <w:pStyle w:val="Assessortext"/>
+        <w:rPr>
+          <w:color w:val="000000" w:themeColor="text1"/>
+          <w:sz w:val="20"/>
+          <w:szCs w:val="20"/>
+        </w:rPr>
+      </w:pPr>
+      <w:r>
+        <w:rPr>
+          <w:color w:val="000000" w:themeColor="text1"/>
+          <w:sz w:val="20"/>
+          <w:szCs w:val="20"/>
+        </w:rPr>
         <w:t>§1 Executive Summary — a one-page summary of your recommendation (write last)</w:t>
       </w:r>
     </w:p>
     <w:p>
       <w:pPr>
         <w:pStyle w:val="Assessortext"/>
-      </w:pPr>
-      <w:r>
+        <w:rPr>
+          <w:color w:val="000000" w:themeColor="text1"/>
+          <w:sz w:val="20"/>
+          <w:szCs w:val="20"/>
+        </w:rPr>
+      </w:pPr>
+      <w:r>
+        <w:rPr>
+          <w:color w:val="000000" w:themeColor="text1"/>
+          <w:sz w:val="20"/>
+          <w:szCs w:val="20"/>
+        </w:rPr>
         <w:t>§2 Engagement context — who you are, the engagement, the decision being asked of the board</w:t>
       </w:r>
     </w:p>
     <w:p>
       <w:pPr>
         <w:pStyle w:val="Assessortext"/>
-      </w:pPr>
-      <w:r>
+        <w:rPr>
+          <w:color w:val="000000" w:themeColor="text1"/>
+          <w:sz w:val="20"/>
+          <w:szCs w:val="20"/>
+        </w:rPr>
+      </w:pPr>
+      <w:r>
+        <w:rPr>
+          <w:color w:val="000000" w:themeColor="text1"/>
+          <w:sz w:val="20"/>
+          <w:szCs w:val="20"/>
+        </w:rPr>
         <w:t>§3 Strategic Alignment Analysis — analyse YAT's ICT Strategic Plan against the industry environment and organisational objectives</w:t>
       </w:r>
     </w:p>
     <w:p>
       <w:pPr>
         <w:pStyle w:val="Assessortext"/>
-      </w:pPr>
-      <w:r>
+        <w:rPr>
+          <w:color w:val="000000" w:themeColor="text1"/>
+          <w:sz w:val="20"/>
+          <w:szCs w:val="20"/>
+        </w:rPr>
+      </w:pPr>
+      <w:r>
+        <w:rPr>
+          <w:color w:val="000000" w:themeColor="text1"/>
+          <w:sz w:val="20"/>
+          <w:szCs w:val="20"/>
+        </w:rPr>
         <w:t>§4 Current State of YAT's ICT — synthesised summary from the intranet materials (synthesis, not verbatim reproduction)</w:t>
       </w:r>
     </w:p>
     <w:p>
       <w:pPr>
         <w:pStyle w:val="Assessortext"/>
-      </w:pPr>
-      <w:r>
+        <w:rPr>
+          <w:color w:val="000000" w:themeColor="text1"/>
+          <w:sz w:val="20"/>
+          <w:szCs w:val="20"/>
+        </w:rPr>
+      </w:pPr>
+      <w:r>
+        <w:rPr>
+          <w:color w:val="000000" w:themeColor="text1"/>
+          <w:sz w:val="20"/>
+          <w:szCs w:val="20"/>
+        </w:rPr>
         <w:t>§5 Gap Analysis — gaps, improvement opportunities, proposed changes</w:t>
       </w:r>
     </w:p>
     <w:p>
       <w:pPr>
         <w:pStyle w:val="Assessortext"/>
-      </w:pPr>
-      <w:r>
+        <w:rPr>
+          <w:color w:val="000000" w:themeColor="text1"/>
+          <w:sz w:val="20"/>
+          <w:szCs w:val="20"/>
+        </w:rPr>
+      </w:pPr>
+      <w:r>
+        <w:rPr>
+          <w:color w:val="000000" w:themeColor="text1"/>
+          <w:sz w:val="20"/>
+          <w:szCs w:val="20"/>
+        </w:rPr>
         <w:t>§6 Options Considered and Evaluation — workload definition, options assessed (in-house renewal vs cloud migration to AWS), initial impact and difficulty assessment</w:t>
       </w:r>
     </w:p>
     <w:p>
       <w:pPr>
         <w:pStyle w:val="Assessortext"/>
-      </w:pPr>
-      <w:r>
+        <w:rPr>
+          <w:color w:val="000000" w:themeColor="text1"/>
+          <w:sz w:val="20"/>
+          <w:szCs w:val="20"/>
+        </w:rPr>
+      </w:pPr>
+      <w:r>
+        <w:rPr>
+          <w:color w:val="000000" w:themeColor="text1"/>
+          <w:sz w:val="20"/>
+          <w:szCs w:val="20"/>
+        </w:rPr>
         <w:t>§7 Cost-Benefit Analysis — assumptions, summary tables for both options, avoided-downtime benefit, comparison summary, Year-1 cash-flow comparison, sensitivity analysis. The detailed line items live in Appendix 1 of the same document.</w:t>
       </w:r>
     </w:p>
     <w:p>
       <w:pPr>
         <w:pStyle w:val="Assessortext"/>
-      </w:pPr>
-      <w:r>
+        <w:rPr>
+          <w:color w:val="000000" w:themeColor="text1"/>
+          <w:sz w:val="20"/>
+          <w:szCs w:val="20"/>
+        </w:rPr>
+      </w:pPr>
+      <w:r>
+        <w:rPr>
+          <w:color w:val="000000" w:themeColor="text1"/>
+          <w:sz w:val="20"/>
+          <w:szCs w:val="20"/>
+        </w:rPr>
         <w:t>§8 Risk and Impact Assessment — intangibles comparison and risk register for the recommended option</w:t>
       </w:r>
     </w:p>
     <w:p>
       <w:pPr>
         <w:pStyle w:val="Assessortext"/>
-      </w:pPr>
-      <w:r>
+        <w:rPr>
+          <w:color w:val="000000" w:themeColor="text1"/>
+          <w:sz w:val="20"/>
+          <w:szCs w:val="20"/>
+        </w:rPr>
+      </w:pPr>
+      <w:r>
+        <w:rPr>
+          <w:color w:val="000000" w:themeColor="text1"/>
+          <w:sz w:val="20"/>
+          <w:szCs w:val="20"/>
+        </w:rPr>
         <w:t>§9 Recommendation — your chosen option with rationale</w:t>
       </w:r>
     </w:p>
     <w:p>
       <w:pPr>
         <w:pStyle w:val="Assessortext"/>
-      </w:pPr>
-      <w:r>
+        <w:rPr>
+          <w:color w:val="000000" w:themeColor="text1"/>
+          <w:sz w:val="20"/>
+          <w:szCs w:val="20"/>
+        </w:rPr>
+      </w:pPr>
+      <w:r>
+        <w:rPr>
+          <w:color w:val="000000" w:themeColor="text1"/>
+          <w:sz w:val="20"/>
+          <w:szCs w:val="20"/>
+        </w:rPr>
         <w:t>§10 Action Plan — prioritised changes, implementation schedule, standards / targets / success metrics, implementation methods, alignment with YAT's change-management procedure, risk register</w:t>
       </w:r>
     </w:p>
     <w:p>
       <w:pPr>
         <w:pStyle w:val="Assessortext"/>
-      </w:pPr>
-      <w:r>
+        <w:rPr>
+          <w:color w:val="000000" w:themeColor="text1"/>
+          <w:sz w:val="20"/>
+          <w:szCs w:val="20"/>
+        </w:rPr>
+      </w:pPr>
+      <w:r>
+        <w:rPr>
+          <w:color w:val="000000" w:themeColor="text1"/>
+          <w:sz w:val="20"/>
+          <w:szCs w:val="20"/>
+        </w:rPr>
         <w:t>§11 Next Steps and Decision Requested — what you are asking the board to decide today</w:t>
       </w:r>
     </w:p>
     <w:p>
       <w:pPr>
         <w:pStyle w:val="Assessortext"/>
-      </w:pPr>
-      <w:r>
+        <w:rPr>
+          <w:color w:val="000000" w:themeColor="text1"/>
+          <w:sz w:val="20"/>
+          <w:szCs w:val="20"/>
+        </w:rPr>
+      </w:pPr>
+    </w:p>
+    <w:p>
+      <w:pPr>
+        <w:pStyle w:val="Assessortext"/>
+        <w:rPr>
+          <w:color w:val="000000" w:themeColor="text1"/>
+          <w:sz w:val="20"/>
+          <w:szCs w:val="20"/>
+        </w:rPr>
+      </w:pPr>
+      <w:r>
+        <w:rPr>
+          <w:color w:val="000000" w:themeColor="text1"/>
+          <w:sz w:val="20"/>
+          <w:szCs w:val="20"/>
+        </w:rPr>
         <w:t>Sign-off block — completed during/after your presentation</w:t>
       </w:r>
     </w:p>
     <w:p>
       <w:pPr>
         <w:pStyle w:val="Assessortext"/>
-      </w:pPr>
-      <w:r>
+        <w:rPr>
+          <w:color w:val="000000" w:themeColor="text1"/>
+          <w:sz w:val="20"/>
+          <w:szCs w:val="20"/>
+        </w:rPr>
+      </w:pPr>
+      <w:r>
+        <w:rPr>
+          <w:color w:val="000000" w:themeColor="text1"/>
+          <w:sz w:val="20"/>
+          <w:szCs w:val="20"/>
+        </w:rPr>
         <w:t>Appendix 1 — CBA detailed line items — every cost line you researched and computed</w:t>
       </w:r>
     </w:p>
     <w:p>
       <w:pPr>
         <w:pStyle w:val="Assessortext"/>
-      </w:pPr>
-      <w:r>
+        <w:rPr>
+          <w:color w:val="000000" w:themeColor="text1"/>
+          <w:sz w:val="20"/>
+          <w:szCs w:val="20"/>
+        </w:rPr>
+      </w:pPr>
+      <w:r>
+        <w:rPr>
+          <w:color w:val="000000" w:themeColor="text1"/>
+          <w:sz w:val="20"/>
+          <w:szCs w:val="20"/>
+        </w:rPr>
         <w:t>Appendix 2 — Knowledge Evidence — short-answer responses linking your work to underlying cloud and evaluation principles</w:t>
       </w:r>
     </w:p>
     <w:p>
       <w:pPr>
         <w:pStyle w:val="Assessortext"/>
-      </w:pPr>
-      <w:r>
+        <w:rPr>
+          <w:color w:val="000000" w:themeColor="text1"/>
+          <w:sz w:val="20"/>
+          <w:szCs w:val="20"/>
+        </w:rPr>
+      </w:pPr>
+      <w:r>
+        <w:rPr>
+          <w:color w:val="000000" w:themeColor="text1"/>
+          <w:sz w:val="20"/>
+          <w:szCs w:val="20"/>
+        </w:rPr>
         <w:t>Appendix 3 — Supporting Research — AWS Pricing Calculator export, citations</w:t>
       </w:r>
     </w:p>
     <w:p>
       <w:pPr>
         <w:pStyle w:val="Assessortext"/>
-      </w:pPr>
-      <w:r>
+        <w:rPr>
+          <w:color w:val="000000" w:themeColor="text1"/>
+          <w:sz w:val="20"/>
+          <w:szCs w:val="20"/>
+        </w:rPr>
+      </w:pPr>
+      <w:r>
+        <w:rPr>
+          <w:color w:val="000000" w:themeColor="text1"/>
+          <w:sz w:val="20"/>
+          <w:szCs w:val="20"/>
+        </w:rPr>
         <w:t>Appendix 4 — Feedback Record — completed using the YAT Feedback Record template during/after the presentation</w:t>
       </w:r>
     </w:p>
     <w:p>
       <w:pPr>
         <w:pStyle w:val="Assessortext"/>
-      </w:pPr>
-      <w:r>
+        <w:rPr>
+          <w:color w:val="000000" w:themeColor="text1"/>
+          <w:sz w:val="20"/>
+          <w:szCs w:val="20"/>
+        </w:rPr>
+      </w:pPr>
+    </w:p>
+    <w:p>
+      <w:pPr>
+        <w:pStyle w:val="Assessortext"/>
+        <w:rPr>
+          <w:color w:val="000000" w:themeColor="text1"/>
+          <w:sz w:val="20"/>
+          <w:szCs w:val="20"/>
+        </w:rPr>
+      </w:pPr>
+      <w:r>
+        <w:rPr>
+          <w:color w:val="000000" w:themeColor="text1"/>
+          <w:sz w:val="20"/>
+          <w:szCs w:val="20"/>
+        </w:rPr>
         <w:t>You will need to research AWS pricing yourself using the AWS Pricing Calculator (see Appendix 1 of the Business Case template for the structure your AWS line items must follow). YAT-internal cost figures for the on-prem option are provided in the scenario materials on the intranet.</w:t>
       </w:r>
     </w:p>
     <w:p>
       <w:pPr>
         <w:pStyle w:val="Assessortext"/>
-      </w:pPr>
-      <w:r>
+        <w:rPr>
+          <w:color w:val="000000" w:themeColor="text1"/>
+          <w:sz w:val="20"/>
+          <w:szCs w:val="20"/>
+        </w:rPr>
+      </w:pPr>
+    </w:p>
+    <w:p>
+      <w:pPr>
+        <w:pStyle w:val="Assessortext"/>
+        <w:rPr>
+          <w:b/>
+          <w:bCs/>
+          <w:color w:val="000000" w:themeColor="text1"/>
+          <w:sz w:val="20"/>
+          <w:szCs w:val="20"/>
+        </w:rPr>
+      </w:pPr>
+      <w:r>
+        <w:rPr>
+          <w:b/>
+          <w:bCs/>
+          <w:color w:val="000000" w:themeColor="text1"/>
+          <w:sz w:val="20"/>
+          <w:szCs w:val="20"/>
+        </w:rPr>
         <w:t>Resources for Part A — available on the YAT intranet</w:t>
       </w:r>
     </w:p>
     <w:p>
       <w:pPr>
         <w:pStyle w:val="Assessortext"/>
-      </w:pPr>
-      <w:r>
+        <w:rPr>
+          <w:color w:val="000000" w:themeColor="text1"/>
+          <w:sz w:val="20"/>
+          <w:szCs w:val="20"/>
+        </w:rPr>
+      </w:pPr>
+      <w:r>
+        <w:rPr>
+          <w:color w:val="000000" w:themeColor="text1"/>
+          <w:sz w:val="20"/>
+          <w:szCs w:val="20"/>
+        </w:rPr>
         <w:t>The YAT Business Case template (download from the intranet's Templates section)</w:t>
       </w:r>
     </w:p>
     <w:p>
       <w:pPr>
         <w:pStyle w:val="Assessortext"/>
-      </w:pPr>
-      <w:r>
+        <w:rPr>
+          <w:color w:val="000000" w:themeColor="text1"/>
+          <w:sz w:val="20"/>
+          <w:szCs w:val="20"/>
+        </w:rPr>
+      </w:pPr>
+      <w:r>
+        <w:rPr>
+          <w:color w:val="000000" w:themeColor="text1"/>
+          <w:sz w:val="20"/>
+          <w:szCs w:val="20"/>
+        </w:rPr>
+        <w:lastRenderedPageBreak/>
         <w:t>The YAT Feedback Record template (download from the intranet's Templates section)</w:t>
       </w:r>
     </w:p>
     <w:p>
       <w:pPr>
         <w:pStyle w:val="Assessortext"/>
-      </w:pPr>
-      <w:r>
+        <w:rPr>
+          <w:color w:val="000000" w:themeColor="text1"/>
+          <w:sz w:val="20"/>
+          <w:szCs w:val="20"/>
+        </w:rPr>
+      </w:pPr>
+      <w:r>
+        <w:rPr>
+          <w:color w:val="000000" w:themeColor="text1"/>
+          <w:sz w:val="20"/>
+          <w:szCs w:val="20"/>
+        </w:rPr>
         <w:t>The YAT scenario materials — strategic plan, current ICT environment description, organisational policies, role brief, ICT manager consultation notes, reference materials</w:t>
       </w:r>
     </w:p>
     <w:p>
       <w:pPr>
         <w:pStyle w:val="Assessortext"/>
-      </w:pPr>
-      <w:r>
+        <w:rPr>
+          <w:color w:val="000000" w:themeColor="text1"/>
+          <w:sz w:val="20"/>
+          <w:szCs w:val="20"/>
+        </w:rPr>
+      </w:pPr>
+      <w:r>
+        <w:rPr>
+          <w:color w:val="000000" w:themeColor="text1"/>
+          <w:sz w:val="20"/>
+          <w:szCs w:val="20"/>
+        </w:rPr>
         <w:t>The YAT Document Archive containing examples of previous business cases produced by MTS for YAT — review at least one example before starting your own as a reference for what a YAT business case looks like</w:t>
       </w:r>
     </w:p>
     <w:p>
       <w:pPr>
         <w:pStyle w:val="Assessortext"/>
-      </w:pPr>
-      <w:r>
+        <w:rPr>
+          <w:color w:val="000000" w:themeColor="text1"/>
+          <w:sz w:val="20"/>
+          <w:szCs w:val="20"/>
+        </w:rPr>
+      </w:pPr>
+    </w:p>
+    <w:p>
+      <w:pPr>
+        <w:pStyle w:val="Assessortext"/>
+        <w:rPr>
+          <w:b/>
+          <w:bCs/>
+          <w:color w:val="000000" w:themeColor="text1"/>
+          <w:sz w:val="20"/>
+          <w:szCs w:val="20"/>
+        </w:rPr>
+      </w:pPr>
+      <w:r>
+        <w:rPr>
+          <w:b/>
+          <w:bCs/>
+          <w:color w:val="000000" w:themeColor="text1"/>
+          <w:sz w:val="20"/>
+          <w:szCs w:val="20"/>
+        </w:rPr>
         <w:t>Resources for Part A — external</w:t>
       </w:r>
     </w:p>
     <w:p>
       <w:pPr>
         <w:pStyle w:val="Assessortext"/>
-      </w:pPr>
-      <w:r>
-        <w:t>AWS Pricing Calculator (calculator.aws) — to research the AWS cost line items for the cloud option</w:t>
-      </w:r>
-    </w:p>
-    <w:p>
-      <w:pPr>
-        <w:pStyle w:val="Assessortext"/>
-      </w:pPr>
-      <w:r>
+        <w:rPr>
+          <w:color w:val="000000" w:themeColor="text1"/>
+          <w:sz w:val="20"/>
+          <w:szCs w:val="20"/>
+        </w:rPr>
+      </w:pPr>
+      <w:r>
+        <w:rPr>
+          <w:color w:val="000000" w:themeColor="text1"/>
+          <w:sz w:val="20"/>
+          <w:szCs w:val="20"/>
+        </w:rPr>
+        <w:t>AWS Pricing Calculator (</w:t>
+      </w:r>
+      <w:proofErr w:type="spellStart"/>
+      <w:r>
+        <w:rPr>
+          <w:color w:val="000000" w:themeColor="text1"/>
+          <w:sz w:val="20"/>
+          <w:szCs w:val="20"/>
+        </w:rPr>
+        <w:t>calculator.aws</w:t>
+      </w:r>
+      <w:proofErr w:type="spellEnd"/>
+      <w:r>
+        <w:rPr>
+          <w:color w:val="000000" w:themeColor="text1"/>
+          <w:sz w:val="20"/>
+          <w:szCs w:val="20"/>
+        </w:rPr>
+        <w:t>) — to research the AWS cost line items for the cloud option</w:t>
+      </w:r>
+    </w:p>
+    <w:p>
+      <w:pPr>
+        <w:pStyle w:val="Assessortext"/>
+        <w:rPr>
+          <w:color w:val="000000" w:themeColor="text1"/>
+          <w:sz w:val="20"/>
+          <w:szCs w:val="20"/>
+        </w:rPr>
+      </w:pPr>
+      <w:r>
+        <w:rPr>
+          <w:color w:val="000000" w:themeColor="text1"/>
+          <w:sz w:val="20"/>
+          <w:szCs w:val="20"/>
+        </w:rPr>
         <w:t>AWS Academy Cloud Foundations [104469] + AWS Academy Cloud Architecting [172221] — authorised lab environments</w:t>
       </w:r>
     </w:p>
     <w:p>
       <w:pPr>
         <w:pStyle w:val="Assessortext"/>
-      </w:pPr>
-      <w:r>
+        <w:rPr>
+          <w:color w:val="000000" w:themeColor="text1"/>
+          <w:sz w:val="20"/>
+          <w:szCs w:val="20"/>
+        </w:rPr>
+      </w:pPr>
+      <w:r>
+        <w:rPr>
+          <w:color w:val="000000" w:themeColor="text1"/>
+          <w:sz w:val="20"/>
+          <w:szCs w:val="20"/>
+        </w:rPr>
         <w:t>Part A is submitted to the LMS as the populated Business Case (.docx) with all four appendices completed.</w:t>
       </w:r>
     </w:p>
@@ -1955,30 +3771,94 @@
         <w:pStyle w:val="Heading2"/>
       </w:pPr>
       <w:r>
+        <w:t>o the YAT board</w:t>
+      </w:r>
+    </w:p>
+    <w:p>
+      <w:pPr>
+        <w:pStyle w:val="Heading2"/>
+        <w:rPr>
+          <w:color w:val="000000" w:themeColor="text1"/>
+        </w:rPr>
+      </w:pPr>
+      <w:r>
+        <w:rPr>
+          <w:color w:val="000000" w:themeColor="text1"/>
+        </w:rPr>
         <w:t>Part B — Presentation to the YAT board</w:t>
       </w:r>
     </w:p>
     <w:p>
       <w:pPr>
         <w:pStyle w:val="Assessortext"/>
-      </w:pPr>
-      <w:r>
+        <w:rPr>
+          <w:color w:val="000000" w:themeColor="text1"/>
+          <w:sz w:val="20"/>
+          <w:szCs w:val="20"/>
+        </w:rPr>
+      </w:pPr>
+      <w:r>
+        <w:rPr>
+          <w:color w:val="000000" w:themeColor="text1"/>
+          <w:sz w:val="20"/>
+          <w:szCs w:val="20"/>
+        </w:rPr>
         <w:t>Using the YAT Board Presentation Deck template (download from the intranet's Templates section), prepare a deck that walks the YAT board through your Business Case. The deck is 8–10 slides plus speaker notes; each slide walks the board through one section of the Business Case.</w:t>
       </w:r>
     </w:p>
     <w:p>
       <w:pPr>
         <w:pStyle w:val="Assessortext"/>
-      </w:pPr>
-      <w:r>
+        <w:rPr>
+          <w:color w:val="000000" w:themeColor="text1"/>
+          <w:sz w:val="20"/>
+          <w:szCs w:val="20"/>
+        </w:rPr>
+      </w:pPr>
+    </w:p>
+    <w:p>
+      <w:pPr>
+        <w:pStyle w:val="Assessortext"/>
+        <w:rPr>
+          <w:color w:val="000000" w:themeColor="text1"/>
+          <w:sz w:val="20"/>
+          <w:szCs w:val="20"/>
+        </w:rPr>
+      </w:pPr>
+      <w:r>
+        <w:rPr>
+          <w:color w:val="000000" w:themeColor="text1"/>
+          <w:sz w:val="20"/>
+          <w:szCs w:val="20"/>
+        </w:rPr>
         <w:t>Review at least one example of a previous board presentation deck from the YAT Document Archive on the intranet — these accompany the previous business cases referenced for Part A — as a reference for what a YAT board presentation looks like in style, depth, and length.</w:t>
       </w:r>
     </w:p>
     <w:p>
       <w:pPr>
         <w:pStyle w:val="Assessortext"/>
-      </w:pPr>
-      <w:r>
+        <w:rPr>
+          <w:color w:val="000000" w:themeColor="text1"/>
+          <w:sz w:val="20"/>
+          <w:szCs w:val="20"/>
+        </w:rPr>
+      </w:pPr>
+    </w:p>
+    <w:p>
+      <w:pPr>
+        <w:pStyle w:val="Assessortext"/>
+        <w:rPr>
+          <w:color w:val="000000" w:themeColor="text1"/>
+          <w:sz w:val="20"/>
+          <w:szCs w:val="20"/>
+        </w:rPr>
+      </w:pPr>
+      <w:r>
+        <w:rPr>
+          <w:color w:val="000000" w:themeColor="text1"/>
+          <w:sz w:val="20"/>
+          <w:szCs w:val="20"/>
+        </w:rPr>
         <w:t>You will deliver the presentation to the YAT board, role-played by your assessor (as Sam Walker, YAT ICT Manager, and/or Pat Lin, MTS Senior Consultant) and a peer (as a board member).</w:t>
       </w:r>
     </w:p>
@@ -1986,183 +3866,523 @@
       <w:pPr>
         <w:pStyle w:val="Assessortext"/>
       </w:pPr>
-      <w:r>
+    </w:p>
+    <w:p>
+      <w:pPr>
+        <w:pStyle w:val="Assessortext"/>
+        <w:rPr>
+          <w:b/>
+          <w:bCs/>
+          <w:color w:val="000000" w:themeColor="text1"/>
+          <w:sz w:val="20"/>
+          <w:szCs w:val="20"/>
+        </w:rPr>
+      </w:pPr>
+      <w:r>
+        <w:rPr>
+          <w:b/>
+          <w:bCs/>
+          <w:color w:val="000000" w:themeColor="text1"/>
+          <w:sz w:val="20"/>
+          <w:szCs w:val="20"/>
+        </w:rPr>
         <w:t>The presentation event</w:t>
       </w:r>
     </w:p>
     <w:p>
       <w:pPr>
         <w:pStyle w:val="Assessortext"/>
-      </w:pPr>
-      <w:r>
+        <w:rPr>
+          <w:color w:val="000000" w:themeColor="text1"/>
+          <w:sz w:val="20"/>
+          <w:szCs w:val="20"/>
+        </w:rPr>
+      </w:pPr>
+      <w:r>
+        <w:rPr>
+          <w:color w:val="000000" w:themeColor="text1"/>
+          <w:sz w:val="20"/>
+          <w:szCs w:val="20"/>
+        </w:rPr>
         <w:t>Duration: 10–15 minutes of presenting + 5 minutes of board questions, feedback, and sign-off</w:t>
       </w:r>
     </w:p>
     <w:p>
       <w:pPr>
         <w:pStyle w:val="Assessortext"/>
-      </w:pPr>
-      <w:r>
+        <w:rPr>
+          <w:color w:val="000000" w:themeColor="text1"/>
+          <w:sz w:val="20"/>
+          <w:szCs w:val="20"/>
+        </w:rPr>
+      </w:pPr>
+      <w:r>
+        <w:rPr>
+          <w:color w:val="000000" w:themeColor="text1"/>
+          <w:sz w:val="20"/>
+          <w:szCs w:val="20"/>
+        </w:rPr>
         <w:t>Format: in-person on campus or via video conference (confirm with your assessor)</w:t>
       </w:r>
     </w:p>
     <w:p>
       <w:pPr>
         <w:pStyle w:val="Assessortext"/>
-      </w:pPr>
-      <w:r>
+        <w:rPr>
+          <w:color w:val="000000" w:themeColor="text1"/>
+          <w:sz w:val="20"/>
+          <w:szCs w:val="20"/>
+        </w:rPr>
+      </w:pPr>
+    </w:p>
+    <w:p>
+      <w:pPr>
+        <w:pStyle w:val="Assessortext"/>
+        <w:rPr>
+          <w:b/>
+          <w:bCs/>
+          <w:color w:val="000000" w:themeColor="text1"/>
+          <w:sz w:val="20"/>
+          <w:szCs w:val="20"/>
+        </w:rPr>
+      </w:pPr>
+      <w:r>
+        <w:rPr>
+          <w:b/>
+          <w:bCs/>
+          <w:color w:val="000000" w:themeColor="text1"/>
+          <w:sz w:val="20"/>
+          <w:szCs w:val="20"/>
+        </w:rPr>
         <w:t>Required artefacts at the event:</w:t>
       </w:r>
     </w:p>
     <w:p>
       <w:pPr>
         <w:pStyle w:val="Assessortext"/>
-      </w:pPr>
-      <w:r>
+        <w:rPr>
+          <w:color w:val="000000" w:themeColor="text1"/>
+          <w:sz w:val="20"/>
+          <w:szCs w:val="20"/>
+        </w:rPr>
+      </w:pPr>
+      <w:r>
+        <w:rPr>
+          <w:color w:val="000000" w:themeColor="text1"/>
+          <w:sz w:val="20"/>
+          <w:szCs w:val="20"/>
+        </w:rPr>
         <w:t>The completed Business Case submitted to the board at least 48 hours in advance</w:t>
       </w:r>
     </w:p>
     <w:p>
       <w:pPr>
         <w:pStyle w:val="Assessortext"/>
-      </w:pPr>
-      <w:r>
+        <w:rPr>
+          <w:color w:val="000000" w:themeColor="text1"/>
+          <w:sz w:val="20"/>
+          <w:szCs w:val="20"/>
+        </w:rPr>
+      </w:pPr>
+      <w:r>
+        <w:rPr>
+          <w:color w:val="000000" w:themeColor="text1"/>
+          <w:sz w:val="20"/>
+          <w:szCs w:val="20"/>
+        </w:rPr>
         <w:t>The deck with populated speaker notes</w:t>
       </w:r>
     </w:p>
     <w:p>
       <w:pPr>
         <w:pStyle w:val="Assessortext"/>
-      </w:pPr>
-      <w:r>
+        <w:rPr>
+          <w:color w:val="000000" w:themeColor="text1"/>
+          <w:sz w:val="20"/>
+          <w:szCs w:val="20"/>
+        </w:rPr>
+      </w:pPr>
+      <w:r>
+        <w:rPr>
+          <w:color w:val="000000" w:themeColor="text1"/>
+          <w:sz w:val="20"/>
+          <w:szCs w:val="20"/>
+        </w:rPr>
         <w:t>A printed or shared Feedback Record ready to be populated during/after the meeting (using the YAT Feedback Record template)</w:t>
       </w:r>
     </w:p>
     <w:p>
       <w:pPr>
         <w:pStyle w:val="Assessortext"/>
-      </w:pPr>
-      <w:r>
+        <w:rPr>
+          <w:color w:val="000000" w:themeColor="text1"/>
+          <w:sz w:val="20"/>
+          <w:szCs w:val="20"/>
+        </w:rPr>
+      </w:pPr>
+      <w:r>
+        <w:rPr>
+          <w:color w:val="000000" w:themeColor="text1"/>
+          <w:sz w:val="20"/>
+          <w:szCs w:val="20"/>
+        </w:rPr>
         <w:t>A printed or shared sign-off sheet for the board to sign at the end (the Sign-off block from the Business Case)</w:t>
       </w:r>
     </w:p>
     <w:p>
       <w:pPr>
         <w:pStyle w:val="Assessortext"/>
-      </w:pPr>
-      <w:r>
+        <w:rPr>
+          <w:color w:val="000000" w:themeColor="text1"/>
+          <w:sz w:val="20"/>
+          <w:szCs w:val="20"/>
+        </w:rPr>
+      </w:pPr>
+    </w:p>
+    <w:p>
+      <w:pPr>
+        <w:pStyle w:val="Assessortext"/>
+        <w:rPr>
+          <w:b/>
+          <w:bCs/>
+          <w:color w:val="000000" w:themeColor="text1"/>
+          <w:sz w:val="20"/>
+          <w:szCs w:val="20"/>
+        </w:rPr>
+      </w:pPr>
+      <w:r>
+        <w:rPr>
+          <w:b/>
+          <w:bCs/>
+          <w:color w:val="000000" w:themeColor="text1"/>
+          <w:sz w:val="20"/>
+          <w:szCs w:val="20"/>
+        </w:rPr>
         <w:t>During the event you will:</w:t>
       </w:r>
     </w:p>
     <w:p>
       <w:pPr>
         <w:pStyle w:val="Assessortext"/>
-      </w:pPr>
-      <w:r>
+        <w:rPr>
+          <w:color w:val="000000" w:themeColor="text1"/>
+          <w:sz w:val="20"/>
+          <w:szCs w:val="20"/>
+        </w:rPr>
+      </w:pPr>
+      <w:r>
+        <w:rPr>
+          <w:color w:val="000000" w:themeColor="text1"/>
+          <w:sz w:val="20"/>
+          <w:szCs w:val="20"/>
+        </w:rPr>
         <w:t>Walk the board through your Business Case using the deck</w:t>
       </w:r>
     </w:p>
     <w:p>
       <w:pPr>
         <w:pStyle w:val="Assessortext"/>
-      </w:pPr>
-      <w:r>
+        <w:rPr>
+          <w:color w:val="000000" w:themeColor="text1"/>
+          <w:sz w:val="20"/>
+          <w:szCs w:val="20"/>
+        </w:rPr>
+      </w:pPr>
+      <w:r>
+        <w:rPr>
+          <w:color w:val="000000" w:themeColor="text1"/>
+          <w:sz w:val="20"/>
+          <w:szCs w:val="20"/>
+        </w:rPr>
         <w:t>Answer the board's questions during Q&amp;A (the assessor's questions probe both the analysis and your underlying knowledge of cloud and evaluation principles)</w:t>
       </w:r>
     </w:p>
     <w:p>
       <w:pPr>
         <w:pStyle w:val="Assessortext"/>
-      </w:pPr>
-      <w:r>
+        <w:rPr>
+          <w:color w:val="000000" w:themeColor="text1"/>
+          <w:sz w:val="20"/>
+          <w:szCs w:val="20"/>
+        </w:rPr>
+      </w:pPr>
+      <w:r>
+        <w:rPr>
+          <w:color w:val="000000" w:themeColor="text1"/>
+          <w:sz w:val="20"/>
+          <w:szCs w:val="20"/>
+        </w:rPr>
         <w:t>Capture board feedback in the Feedback Record</w:t>
       </w:r>
     </w:p>
     <w:p>
       <w:pPr>
         <w:pStyle w:val="Assessortext"/>
-      </w:pPr>
-      <w:r>
+        <w:rPr>
+          <w:color w:val="000000" w:themeColor="text1"/>
+          <w:sz w:val="20"/>
+          <w:szCs w:val="20"/>
+        </w:rPr>
+      </w:pPr>
+      <w:r>
+        <w:rPr>
+          <w:color w:val="000000" w:themeColor="text1"/>
+          <w:sz w:val="20"/>
+          <w:szCs w:val="20"/>
+        </w:rPr>
         <w:t>Obtain the board's sign-off on the action plan in Business Case §10</w:t>
       </w:r>
     </w:p>
     <w:p>
       <w:pPr>
         <w:pStyle w:val="Assessortext"/>
-      </w:pPr>
-      <w:r>
+        <w:rPr>
+          <w:color w:val="000000" w:themeColor="text1"/>
+          <w:sz w:val="20"/>
+          <w:szCs w:val="20"/>
+        </w:rPr>
+      </w:pPr>
+    </w:p>
+    <w:p>
+      <w:pPr>
+        <w:pStyle w:val="Assessortext"/>
+        <w:rPr>
+          <w:color w:val="000000" w:themeColor="text1"/>
+          <w:sz w:val="20"/>
+          <w:szCs w:val="20"/>
+        </w:rPr>
+      </w:pPr>
+      <w:r>
+        <w:rPr>
+          <w:color w:val="000000" w:themeColor="text1"/>
+          <w:sz w:val="20"/>
+          <w:szCs w:val="20"/>
+        </w:rPr>
         <w:t>Part B is submitted to the LMS as the presentation deck (.pptx) with populated speaker notes. The completed Feedback Record and the signed Sign-off block are attached to the Business Case (as Appendix 4 and the Sign-off block respectively).</w:t>
       </w:r>
     </w:p>
     <w:p>
       <w:pPr>
         <w:pStyle w:val="Heading2"/>
-      </w:pPr>
-      <w:r>
+        <w:rPr>
+          <w:sz w:val="20"/>
+          <w:szCs w:val="16"/>
+        </w:rPr>
+      </w:pPr>
+    </w:p>
+    <w:p>
+      <w:pPr>
+        <w:pStyle w:val="Assessortext"/>
+        <w:rPr>
+          <w:b/>
+          <w:bCs/>
+          <w:color w:val="000000" w:themeColor="text1"/>
+          <w:sz w:val="20"/>
+          <w:szCs w:val="20"/>
+        </w:rPr>
+      </w:pPr>
+      <w:r>
+        <w:rPr>
+          <w:b/>
+          <w:bCs/>
+          <w:color w:val="000000" w:themeColor="text1"/>
+          <w:sz w:val="20"/>
+          <w:szCs w:val="20"/>
+        </w:rPr>
         <w:t>Tips for success</w:t>
       </w:r>
     </w:p>
     <w:p>
       <w:pPr>
         <w:pStyle w:val="Assessortext"/>
-      </w:pPr>
-      <w:r>
-        <w:t>Start with the scenario. Read the YAT intranet end-to-end before you start writing — particularly the ICT Strategic Plan, the current ICT environment, the role brief, and the ICT manager consultation notes.</w:t>
-      </w:r>
-    </w:p>
-    <w:p>
-      <w:pPr>
-        <w:pStyle w:val="Assessortext"/>
-      </w:pPr>
-      <w:r>
+        <w:numPr>
+          <w:ilvl w:val="0"/>
+          <w:numId w:val="3"/>
+        </w:numPr>
+        <w:rPr>
+          <w:color w:val="000000" w:themeColor="text1"/>
+          <w:sz w:val="20"/>
+          <w:szCs w:val="20"/>
+        </w:rPr>
+      </w:pPr>
+      <w:r>
+        <w:rPr>
+          <w:color w:val="000000" w:themeColor="text1"/>
+          <w:sz w:val="20"/>
+          <w:szCs w:val="20"/>
+        </w:rPr>
+        <w:t xml:space="preserve">Start with the scenario. Read the YAT intranet end-to-end before you start writing — particularly the ICT Strategic Plan, the current ICT environment, the role brief, and the ICT manager consultation </w:t>
+      </w:r>
+      <w:proofErr w:type="gramStart"/>
+      <w:r>
+        <w:rPr>
+          <w:color w:val="000000" w:themeColor="text1"/>
+          <w:sz w:val="20"/>
+          <w:szCs w:val="20"/>
+        </w:rPr>
+        <w:t>notes</w:t>
+      </w:r>
+      <w:proofErr w:type="gramEnd"/>
+      <w:r>
+        <w:rPr>
+          <w:color w:val="000000" w:themeColor="text1"/>
+          <w:sz w:val="20"/>
+          <w:szCs w:val="20"/>
+        </w:rPr>
+        <w:t>.</w:t>
+      </w:r>
+    </w:p>
+    <w:p>
+      <w:pPr>
+        <w:pStyle w:val="Assessortext"/>
+        <w:numPr>
+          <w:ilvl w:val="0"/>
+          <w:numId w:val="3"/>
+        </w:numPr>
+        <w:rPr>
+          <w:color w:val="000000" w:themeColor="text1"/>
+          <w:sz w:val="20"/>
+          <w:szCs w:val="20"/>
+        </w:rPr>
+      </w:pPr>
+      <w:r>
+        <w:rPr>
+          <w:color w:val="000000" w:themeColor="text1"/>
+          <w:sz w:val="20"/>
+          <w:szCs w:val="20"/>
+        </w:rPr>
         <w:t>Synthesise, don't copy. §4 (Current State) is the section most likely to drift into verbatim reproduction. Write it in your own words and focus on what's material to the migration.</w:t>
       </w:r>
     </w:p>
     <w:p>
       <w:pPr>
         <w:pStyle w:val="Assessortext"/>
-      </w:pPr>
-      <w:r>
+        <w:numPr>
+          <w:ilvl w:val="0"/>
+          <w:numId w:val="3"/>
+        </w:numPr>
+        <w:rPr>
+          <w:color w:val="000000" w:themeColor="text1"/>
+          <w:sz w:val="20"/>
+          <w:szCs w:val="20"/>
+        </w:rPr>
+      </w:pPr>
+      <w:r>
+        <w:rPr>
+          <w:color w:val="000000" w:themeColor="text1"/>
+          <w:sz w:val="20"/>
+          <w:szCs w:val="20"/>
+        </w:rPr>
         <w:t>Show your AWS pricing working. Generate an AWS Pricing Calculator estimate, export it, and attach it as Appendix 3. Numbers without evidence are not credible.</w:t>
       </w:r>
     </w:p>
     <w:p>
       <w:pPr>
         <w:pStyle w:val="Assessortext"/>
-      </w:pPr>
-      <w:r>
+        <w:numPr>
+          <w:ilvl w:val="0"/>
+          <w:numId w:val="3"/>
+        </w:numPr>
+        <w:rPr>
+          <w:color w:val="000000" w:themeColor="text1"/>
+          <w:sz w:val="20"/>
+          <w:szCs w:val="20"/>
+        </w:rPr>
+      </w:pPr>
+      <w:r>
+        <w:rPr>
+          <w:color w:val="000000" w:themeColor="text1"/>
+          <w:sz w:val="20"/>
+          <w:szCs w:val="20"/>
+        </w:rPr>
         <w:t>Sense-check your CBA totals. Year-1 outlay differences matter to senior management even when 5-year totals favour one option — make the cash-flow position visible.</w:t>
       </w:r>
     </w:p>
     <w:p>
       <w:pPr>
         <w:pStyle w:val="Assessortext"/>
-      </w:pPr>
-      <w:r>
+        <w:numPr>
+          <w:ilvl w:val="0"/>
+          <w:numId w:val="3"/>
+        </w:numPr>
+        <w:rPr>
+          <w:color w:val="000000" w:themeColor="text1"/>
+          <w:sz w:val="20"/>
+          <w:szCs w:val="20"/>
+        </w:rPr>
+      </w:pPr>
+      <w:r>
+        <w:rPr>
+          <w:color w:val="000000" w:themeColor="text1"/>
+          <w:sz w:val="20"/>
+          <w:szCs w:val="20"/>
+        </w:rPr>
         <w:t>Be honest in §8 Intangibles. A one-sided intangibles table — only positives for your preferred option — is less credible than an honest trade-off discussion.</w:t>
       </w:r>
     </w:p>
     <w:p>
       <w:pPr>
         <w:pStyle w:val="Assessortext"/>
-      </w:pPr>
-      <w:r>
+        <w:numPr>
+          <w:ilvl w:val="0"/>
+          <w:numId w:val="3"/>
+        </w:numPr>
+        <w:rPr>
+          <w:color w:val="000000" w:themeColor="text1"/>
+          <w:sz w:val="20"/>
+          <w:szCs w:val="20"/>
+        </w:rPr>
+      </w:pPr>
+      <w:r>
+        <w:rPr>
+          <w:color w:val="000000" w:themeColor="text1"/>
+          <w:sz w:val="20"/>
+          <w:szCs w:val="20"/>
+        </w:rPr>
         <w:t>The action plan is what the board approves. §10 is the most scrutinised section. Spend time on prioritisation, scheduling, and alignment with YAT's change-management procedure.</w:t>
       </w:r>
     </w:p>
     <w:p>
       <w:pPr>
         <w:pStyle w:val="Assessortext"/>
-      </w:pPr>
-      <w:r>
+        <w:numPr>
+          <w:ilvl w:val="0"/>
+          <w:numId w:val="3"/>
+        </w:numPr>
+        <w:rPr>
+          <w:color w:val="000000" w:themeColor="text1"/>
+          <w:sz w:val="20"/>
+          <w:szCs w:val="20"/>
+        </w:rPr>
+      </w:pPr>
+      <w:r>
+        <w:rPr>
+          <w:color w:val="000000" w:themeColor="text1"/>
+          <w:sz w:val="20"/>
+          <w:szCs w:val="20"/>
+        </w:rPr>
         <w:t>Prepare for the Q&amp;A. The assessor will probe both the analysis and your underlying knowledge of cloud and evaluation principles. The Q&amp;A is when your speaker preparation pays off.</w:t>
       </w:r>
     </w:p>
     <w:p>
       <w:pPr>
         <w:pStyle w:val="Assessortext"/>
-      </w:pPr>
-      <w:r>
+        <w:numPr>
+          <w:ilvl w:val="0"/>
+          <w:numId w:val="3"/>
+        </w:numPr>
+        <w:rPr>
+          <w:color w:val="000000" w:themeColor="text1"/>
+          <w:sz w:val="20"/>
+          <w:szCs w:val="20"/>
+        </w:rPr>
+      </w:pPr>
+      <w:r>
+        <w:rPr>
+          <w:color w:val="000000" w:themeColor="text1"/>
+          <w:sz w:val="20"/>
+          <w:szCs w:val="20"/>
+        </w:rPr>
         <w:t>Bring the sign-off sheet to the meeting. Sign-off is part of the assessment — you cannot achieve Satisfactory without it.</w:t>
       </w:r>
     </w:p>
@@ -2181,7 +4401,7 @@
 </file>
 
 <file path=word/endnotes.xml><?xml version="1.0" encoding="utf-8"?>
-<w:endnotes xmlns:wpc="http://schemas.microsoft.com/office/word/2010/wordprocessingCanvas" xmlns:cx="http://schemas.microsoft.com/office/drawing/2014/chartex" xmlns:cx1="http://schemas.microsoft.com/office/drawing/2015/9/8/chartex" xmlns:cx2="http://schemas.microsoft.com/office/drawing/2015/10/21/chartex" xmlns:cx3="http://schemas.microsoft.com/office/drawing/2016/5/9/chartex" xmlns:cx4="http://schemas.microsoft.com/office/drawing/2016/5/10/chartex" xmlns:cx5="http://schemas.microsoft.com/office/drawing/2016/5/11/chartex" xmlns:cx6="http://schemas.microsoft.com/office/drawing/2016/5/12/chartex" xmlns:cx7="http://schemas.microsoft.com/office/drawing/2016/5/13/chartex" xmlns:cx8="http://schemas.microsoft.com/office/drawing/2016/5/14/chartex" xmlns:mc="http://schemas.openxmlformats.org/markup-compatibility/2006" xmlns:aink="http://schemas.microsoft.com/office/drawing/2016/ink" xmlns:am3d="http://schemas.microsoft.com/office/drawing/2017/model3d" xmlns:o="urn:schemas-microsoft-com:office:office" xmlns:oel="http://schemas.microsoft.com/office/2019/extlst" xmlns:r="http://schemas.openxmlformats.org/officeDocument/2006/relationships" xmlns:m="http://schemas.openxmlformats.org/officeDocument/2006/math" xmlns:v="urn:schemas-microsoft-com:vml" xmlns:wp14="http://schemas.microsoft.com/office/word/2010/wordprocessingDrawing" xmlns:wp="http://schemas.openxmlformats.org/drawingml/2006/wordprocessingDrawing" xmlns:w10="urn:schemas-microsoft-com:office:word" xmlns:w="http://schemas.openxmlformats.org/wordprocessingml/2006/main" xmlns:w14="http://schemas.microsoft.com/office/word/2010/wordml" xmlns:w15="http://schemas.microsoft.com/office/word/2012/wordml" xmlns:w16cex="http://schemas.microsoft.com/office/word/2018/wordml/cex" xmlns:w16cid="http://schemas.microsoft.com/office/word/2016/wordml/cid" xmlns:w16="http://schemas.microsoft.com/office/word/2018/wordml" xmlns:w16sdtdh="http://schemas.microsoft.com/office/word/2020/wordml/sdtdatahash" xmlns:w16se="http://schemas.microsoft.com/office/word/2015/wordml/symex" xmlns:wpg="http://schemas.microsoft.com/office/word/2010/wordprocessingGroup" xmlns:wpi="http://schemas.microsoft.com/office/word/2010/wordprocessingInk" xmlns:wne="http://schemas.microsoft.com/office/word/2006/wordml" xmlns:wps="http://schemas.microsoft.com/office/word/2010/wordprocessingShape" mc:Ignorable="w14 w15 w16se w16cid w16 w16cex w16sdtdh wp14">
+<w:endnotes xmlns:wpc="http://schemas.microsoft.com/office/word/2010/wordprocessingCanvas" xmlns:cx="http://schemas.microsoft.com/office/drawing/2014/chartex" xmlns:cx1="http://schemas.microsoft.com/office/drawing/2015/9/8/chartex" xmlns:cx2="http://schemas.microsoft.com/office/drawing/2015/10/21/chartex" xmlns:cx3="http://schemas.microsoft.com/office/drawing/2016/5/9/chartex" xmlns:cx4="http://schemas.microsoft.com/office/drawing/2016/5/10/chartex" xmlns:cx5="http://schemas.microsoft.com/office/drawing/2016/5/11/chartex" xmlns:cx6="http://schemas.microsoft.com/office/drawing/2016/5/12/chartex" xmlns:cx7="http://schemas.microsoft.com/office/drawing/2016/5/13/chartex" xmlns:cx8="http://schemas.microsoft.com/office/drawing/2016/5/14/chartex" xmlns:mc="http://schemas.openxmlformats.org/markup-compatibility/2006" xmlns:m="http://schemas.openxmlformats.org/officeDocument/2006/math" xmlns:aink="http://schemas.microsoft.com/office/drawing/2016/ink" xmlns:am3d="http://schemas.microsoft.com/office/drawing/2017/model3d" xmlns:oel="http://schemas.microsoft.com/office/2019/extlst" xmlns:r="http://schemas.openxmlformats.org/officeDocument/2006/relationships" xmlns:wp14="http://schemas.microsoft.com/office/word/2010/wordprocessingDrawing" xmlns:wp="http://schemas.openxmlformats.org/drawingml/2006/wordprocessingDrawing" xmlns:wpg="http://schemas.microsoft.com/office/word/2010/wordprocessingGroup" xmlns:wpi="http://schemas.microsoft.com/office/word/2010/wordprocessingInk" xmlns:wps="http://schemas.microsoft.com/office/word/2010/wordprocessingShape" xmlns:o="urn:schemas-microsoft-com:office:office" xmlns:v="urn:schemas-microsoft-com:vml" xmlns:w10="urn:schemas-microsoft-com:office:word" xmlns:w="http://schemas.openxmlformats.org/wordprocessingml/2006/main" xmlns:w14="http://schemas.microsoft.com/office/word/2010/wordml" xmlns:w15="http://schemas.microsoft.com/office/word/2012/wordml" xmlns:w16cex="http://schemas.microsoft.com/office/word/2018/wordml/cex" xmlns:w16cid="http://schemas.microsoft.com/office/word/2016/wordml/cid" xmlns:w16="http://schemas.microsoft.com/office/word/2018/wordml" xmlns:w16sdtdh="http://schemas.microsoft.com/office/word/2020/wordml/sdtdatahash" xmlns:w16sdtfl="http://schemas.microsoft.com/office/word/2024/wordml/sdtformatlock" xmlns:w16se="http://schemas.microsoft.com/office/word/2015/wordml/symex" xmlns:w16du="http://schemas.microsoft.com/office/word/2023/wordml/word16du" xmlns:wne="http://schemas.microsoft.com/office/word/2006/wordml" mc:Ignorable="w14 w15 w16se w16cid w16 w16cex w16sdtdh w16sdtfl w16du wp14">
   <w:endnote w:type="separator" w:id="-1">
     <w:p>
       <w:r>
@@ -2200,7 +4420,7 @@
 </file>
 
 <file path=word/footer1.xml><?xml version="1.0" encoding="utf-8"?>
-<w:ftr xmlns:wpc="http://schemas.microsoft.com/office/word/2010/wordprocessingCanvas" xmlns:cx="http://schemas.microsoft.com/office/drawing/2014/chartex" xmlns:cx1="http://schemas.microsoft.com/office/drawing/2015/9/8/chartex" xmlns:cx2="http://schemas.microsoft.com/office/drawing/2015/10/21/chartex" xmlns:cx3="http://schemas.microsoft.com/office/drawing/2016/5/9/chartex" xmlns:cx4="http://schemas.microsoft.com/office/drawing/2016/5/10/chartex" xmlns:cx5="http://schemas.microsoft.com/office/drawing/2016/5/11/chartex" xmlns:cx6="http://schemas.microsoft.com/office/drawing/2016/5/12/chartex" xmlns:cx7="http://schemas.microsoft.com/office/drawing/2016/5/13/chartex" xmlns:cx8="http://schemas.microsoft.com/office/drawing/2016/5/14/chartex" xmlns:mc="http://schemas.openxmlformats.org/markup-compatibility/2006" xmlns:aink="http://schemas.microsoft.com/office/drawing/2016/ink" xmlns:am3d="http://schemas.microsoft.com/office/drawing/2017/model3d" xmlns:o="urn:schemas-microsoft-com:office:office" xmlns:oel="http://schemas.microsoft.com/office/2019/extlst" xmlns:r="http://schemas.openxmlformats.org/officeDocument/2006/relationships" xmlns:m="http://schemas.openxmlformats.org/officeDocument/2006/math" xmlns:v="urn:schemas-microsoft-com:vml" xmlns:wp14="http://schemas.microsoft.com/office/word/2010/wordprocessingDrawing" xmlns:wp="http://schemas.openxmlformats.org/drawingml/2006/wordprocessingDrawing" xmlns:w10="urn:schemas-microsoft-com:office:word" xmlns:w="http://schemas.openxmlformats.org/wordprocessingml/2006/main" xmlns:w14="http://schemas.microsoft.com/office/word/2010/wordml" xmlns:w15="http://schemas.microsoft.com/office/word/2012/wordml" xmlns:w16cex="http://schemas.microsoft.com/office/word/2018/wordml/cex" xmlns:w16cid="http://schemas.microsoft.com/office/word/2016/wordml/cid" xmlns:w16="http://schemas.microsoft.com/office/word/2018/wordml" xmlns:w16sdtdh="http://schemas.microsoft.com/office/word/2020/wordml/sdtdatahash" xmlns:w16se="http://schemas.microsoft.com/office/word/2015/wordml/symex" xmlns:wpg="http://schemas.microsoft.com/office/word/2010/wordprocessingGroup" xmlns:wpi="http://schemas.microsoft.com/office/word/2010/wordprocessingInk" xmlns:wne="http://schemas.microsoft.com/office/word/2006/wordml" xmlns:wps="http://schemas.microsoft.com/office/word/2010/wordprocessingShape" mc:Ignorable="w14 w15 w16se w16cid w16 w16cex w16sdtdh wp14">
+<w:ftr xmlns:wpc="http://schemas.microsoft.com/office/word/2010/wordprocessingCanvas" xmlns:cx="http://schemas.microsoft.com/office/drawing/2014/chartex" xmlns:cx1="http://schemas.microsoft.com/office/drawing/2015/9/8/chartex" xmlns:cx2="http://schemas.microsoft.com/office/drawing/2015/10/21/chartex" xmlns:cx3="http://schemas.microsoft.com/office/drawing/2016/5/9/chartex" xmlns:cx4="http://schemas.microsoft.com/office/drawing/2016/5/10/chartex" xmlns:cx5="http://schemas.microsoft.com/office/drawing/2016/5/11/chartex" xmlns:cx6="http://schemas.microsoft.com/office/drawing/2016/5/12/chartex" xmlns:cx7="http://schemas.microsoft.com/office/drawing/2016/5/13/chartex" xmlns:cx8="http://schemas.microsoft.com/office/drawing/2016/5/14/chartex" xmlns:mc="http://schemas.openxmlformats.org/markup-compatibility/2006" xmlns:m="http://schemas.openxmlformats.org/officeDocument/2006/math" xmlns:aink="http://schemas.microsoft.com/office/drawing/2016/ink" xmlns:am3d="http://schemas.microsoft.com/office/drawing/2017/model3d" xmlns:oel="http://schemas.microsoft.com/office/2019/extlst" xmlns:r="http://schemas.openxmlformats.org/officeDocument/2006/relationships" xmlns:wp14="http://schemas.microsoft.com/office/word/2010/wordprocessingDrawing" xmlns:wp="http://schemas.openxmlformats.org/drawingml/2006/wordprocessingDrawing" xmlns:wpg="http://schemas.microsoft.com/office/word/2010/wordprocessingGroup" xmlns:wpi="http://schemas.microsoft.com/office/word/2010/wordprocessingInk" xmlns:wps="http://schemas.microsoft.com/office/word/2010/wordprocessingShape" xmlns:o="urn:schemas-microsoft-com:office:office" xmlns:v="urn:schemas-microsoft-com:vml" xmlns:w10="urn:schemas-microsoft-com:office:word" xmlns:w="http://schemas.openxmlformats.org/wordprocessingml/2006/main" xmlns:w14="http://schemas.microsoft.com/office/word/2010/wordml" xmlns:w15="http://schemas.microsoft.com/office/word/2012/wordml" xmlns:w16cex="http://schemas.microsoft.com/office/word/2018/wordml/cex" xmlns:w16cid="http://schemas.microsoft.com/office/word/2016/wordml/cid" xmlns:w16="http://schemas.microsoft.com/office/word/2018/wordml" xmlns:w16sdtdh="http://schemas.microsoft.com/office/word/2020/wordml/sdtdatahash" xmlns:w16sdtfl="http://schemas.microsoft.com/office/word/2024/wordml/sdtformatlock" xmlns:w16se="http://schemas.microsoft.com/office/word/2015/wordml/symex" xmlns:w16du="http://schemas.microsoft.com/office/word/2023/wordml/word16du" xmlns:wne="http://schemas.microsoft.com/office/word/2006/wordml" mc:Ignorable="w14 w15 w16se w16cid w16 w16cex w16sdtdh w16sdtfl w16du wp14">
   <w:p>
     <w:pPr>
       <w:pStyle w:val="Footer"/>
@@ -2233,11 +4453,19 @@
     <w:r>
       <w:t>0</w:t>
     </w:r>
+    <w:proofErr w:type="gramStart"/>
     <w:r>
       <w:rPr>
         <w:rStyle w:val="FooterChar"/>
       </w:rPr>
-      <w:t xml:space="preserve">   (Template Version 1.3)</w:t>
+      <w:t xml:space="preserve">   (</w:t>
+    </w:r>
+    <w:proofErr w:type="gramEnd"/>
+    <w:r>
+      <w:rPr>
+        <w:rStyle w:val="FooterChar"/>
+      </w:rPr>
+      <w:t>Template Version 1.3)</w:t>
     </w:r>
     <w:r>
       <w:tab/>
@@ -2256,7 +4484,7 @@
       <w:rPr>
         <w:noProof/>
       </w:rPr>
-      <w:t>13 April 2022</w:t>
+      <w:t>9 July 2026</w:t>
     </w:r>
     <w:r>
       <w:fldChar w:fldCharType="end"/>
@@ -2299,7 +4527,7 @@
 </file>
 
 <file path=word/footnotes.xml><?xml version="1.0" encoding="utf-8"?>
-<w:footnotes xmlns:wpc="http://schemas.microsoft.com/office/word/2010/wordprocessingCanvas" xmlns:cx="http://schemas.microsoft.com/office/drawing/2014/chartex" xmlns:cx1="http://schemas.microsoft.com/office/drawing/2015/9/8/chartex" xmlns:cx2="http://schemas.microsoft.com/office/drawing/2015/10/21/chartex" xmlns:cx3="http://schemas.microsoft.com/office/drawing/2016/5/9/chartex" xmlns:cx4="http://schemas.microsoft.com/office/drawing/2016/5/10/chartex" xmlns:cx5="http://schemas.microsoft.com/office/drawing/2016/5/11/chartex" xmlns:cx6="http://schemas.microsoft.com/office/drawing/2016/5/12/chartex" xmlns:cx7="http://schemas.microsoft.com/office/drawing/2016/5/13/chartex" xmlns:cx8="http://schemas.microsoft.com/office/drawing/2016/5/14/chartex" xmlns:mc="http://schemas.openxmlformats.org/markup-compatibility/2006" xmlns:aink="http://schemas.microsoft.com/office/drawing/2016/ink" xmlns:am3d="http://schemas.microsoft.com/office/drawing/2017/model3d" xmlns:o="urn:schemas-microsoft-com:office:office" xmlns:oel="http://schemas.microsoft.com/office/2019/extlst" xmlns:r="http://schemas.openxmlformats.org/officeDocument/2006/relationships" xmlns:m="http://schemas.openxmlformats.org/officeDocument/2006/math" xmlns:v="urn:schemas-microsoft-com:vml" xmlns:wp14="http://schemas.microsoft.com/office/word/2010/wordprocessingDrawing" xmlns:wp="http://schemas.openxmlformats.org/drawingml/2006/wordprocessingDrawing" xmlns:w10="urn:schemas-microsoft-com:office:word" xmlns:w="http://schemas.openxmlformats.org/wordprocessingml/2006/main" xmlns:w14="http://schemas.microsoft.com/office/word/2010/wordml" xmlns:w15="http://schemas.microsoft.com/office/word/2012/wordml" xmlns:w16cex="http://schemas.microsoft.com/office/word/2018/wordml/cex" xmlns:w16cid="http://schemas.microsoft.com/office/word/2016/wordml/cid" xmlns:w16="http://schemas.microsoft.com/office/word/2018/wordml" xmlns:w16sdtdh="http://schemas.microsoft.com/office/word/2020/wordml/sdtdatahash" xmlns:w16se="http://schemas.microsoft.com/office/word/2015/wordml/symex" xmlns:wpg="http://schemas.microsoft.com/office/word/2010/wordprocessingGroup" xmlns:wpi="http://schemas.microsoft.com/office/word/2010/wordprocessingInk" xmlns:wne="http://schemas.microsoft.com/office/word/2006/wordml" xmlns:wps="http://schemas.microsoft.com/office/word/2010/wordprocessingShape" mc:Ignorable="w14 w15 w16se w16cid w16 w16cex w16sdtdh wp14">
+<w:footnotes xmlns:wpc="http://schemas.microsoft.com/office/word/2010/wordprocessingCanvas" xmlns:cx="http://schemas.microsoft.com/office/drawing/2014/chartex" xmlns:cx1="http://schemas.microsoft.com/office/drawing/2015/9/8/chartex" xmlns:cx2="http://schemas.microsoft.com/office/drawing/2015/10/21/chartex" xmlns:cx3="http://schemas.microsoft.com/office/drawing/2016/5/9/chartex" xmlns:cx4="http://schemas.microsoft.com/office/drawing/2016/5/10/chartex" xmlns:cx5="http://schemas.microsoft.com/office/drawing/2016/5/11/chartex" xmlns:cx6="http://schemas.microsoft.com/office/drawing/2016/5/12/chartex" xmlns:cx7="http://schemas.microsoft.com/office/drawing/2016/5/13/chartex" xmlns:cx8="http://schemas.microsoft.com/office/drawing/2016/5/14/chartex" xmlns:mc="http://schemas.openxmlformats.org/markup-compatibility/2006" xmlns:m="http://schemas.openxmlformats.org/officeDocument/2006/math" xmlns:aink="http://schemas.microsoft.com/office/drawing/2016/ink" xmlns:am3d="http://schemas.microsoft.com/office/drawing/2017/model3d" xmlns:oel="http://schemas.microsoft.com/office/2019/extlst" xmlns:r="http://schemas.openxmlformats.org/officeDocument/2006/relationships" xmlns:wp14="http://schemas.microsoft.com/office/word/2010/wordprocessingDrawing" xmlns:wp="http://schemas.openxmlformats.org/drawingml/2006/wordprocessingDrawing" xmlns:wpg="http://schemas.microsoft.com/office/word/2010/wordprocessingGroup" xmlns:wpi="http://schemas.microsoft.com/office/word/2010/wordprocessingInk" xmlns:wps="http://schemas.microsoft.com/office/word/2010/wordprocessingShape" xmlns:o="urn:schemas-microsoft-com:office:office" xmlns:v="urn:schemas-microsoft-com:vml" xmlns:w10="urn:schemas-microsoft-com:office:word" xmlns:w="http://schemas.openxmlformats.org/wordprocessingml/2006/main" xmlns:w14="http://schemas.microsoft.com/office/word/2010/wordml" xmlns:w15="http://schemas.microsoft.com/office/word/2012/wordml" xmlns:w16cex="http://schemas.microsoft.com/office/word/2018/wordml/cex" xmlns:w16cid="http://schemas.microsoft.com/office/word/2016/wordml/cid" xmlns:w16="http://schemas.microsoft.com/office/word/2018/wordml" xmlns:w16sdtdh="http://schemas.microsoft.com/office/word/2020/wordml/sdtdatahash" xmlns:w16sdtfl="http://schemas.microsoft.com/office/word/2024/wordml/sdtformatlock" xmlns:w16se="http://schemas.microsoft.com/office/word/2015/wordml/symex" xmlns:w16du="http://schemas.microsoft.com/office/word/2023/wordml/word16du" xmlns:wne="http://schemas.microsoft.com/office/word/2006/wordml" mc:Ignorable="w14 w15 w16se w16cid w16 w16cex w16sdtdh w16sdtfl w16du wp14">
   <w:footnote w:type="separator" w:id="-1">
     <w:p>
       <w:r>
@@ -2318,7 +4546,7 @@
 </file>
 
 <file path=word/header1.xml><?xml version="1.0" encoding="utf-8"?>
-<w:hdr xmlns:wpc="http://schemas.microsoft.com/office/word/2010/wordprocessingCanvas" xmlns:cx="http://schemas.microsoft.com/office/drawing/2014/chartex" xmlns:cx1="http://schemas.microsoft.com/office/drawing/2015/9/8/chartex" xmlns:cx2="http://schemas.microsoft.com/office/drawing/2015/10/21/chartex" xmlns:cx3="http://schemas.microsoft.com/office/drawing/2016/5/9/chartex" xmlns:cx4="http://schemas.microsoft.com/office/drawing/2016/5/10/chartex" xmlns:cx5="http://schemas.microsoft.com/office/drawing/2016/5/11/chartex" xmlns:cx6="http://schemas.microsoft.com/office/drawing/2016/5/12/chartex" xmlns:cx7="http://schemas.microsoft.com/office/drawing/2016/5/13/chartex" xmlns:cx8="http://schemas.microsoft.com/office/drawing/2016/5/14/chartex" xmlns:mc="http://schemas.openxmlformats.org/markup-compatibility/2006" xmlns:aink="http://schemas.microsoft.com/office/drawing/2016/ink" xmlns:am3d="http://schemas.microsoft.com/office/drawing/2017/model3d" xmlns:o="urn:schemas-microsoft-com:office:office" xmlns:oel="http://schemas.microsoft.com/office/2019/extlst" xmlns:r="http://schemas.openxmlformats.org/officeDocument/2006/relationships" xmlns:m="http://schemas.openxmlformats.org/officeDocument/2006/math" xmlns:v="urn:schemas-microsoft-com:vml" xmlns:wp14="http://schemas.microsoft.com/office/word/2010/wordprocessingDrawing" xmlns:wp="http://schemas.openxmlformats.org/drawingml/2006/wordprocessingDrawing" xmlns:w10="urn:schemas-microsoft-com:office:word" xmlns:w="http://schemas.openxmlformats.org/wordprocessingml/2006/main" xmlns:w14="http://schemas.microsoft.com/office/word/2010/wordml" xmlns:w15="http://schemas.microsoft.com/office/word/2012/wordml" xmlns:w16cex="http://schemas.microsoft.com/office/word/2018/wordml/cex" xmlns:w16cid="http://schemas.microsoft.com/office/word/2016/wordml/cid" xmlns:w16="http://schemas.microsoft.com/office/word/2018/wordml" xmlns:w16sdtdh="http://schemas.microsoft.com/office/word/2020/wordml/sdtdatahash" xmlns:w16se="http://schemas.microsoft.com/office/word/2015/wordml/symex" xmlns:wpg="http://schemas.microsoft.com/office/word/2010/wordprocessingGroup" xmlns:wpi="http://schemas.microsoft.com/office/word/2010/wordprocessingInk" xmlns:wne="http://schemas.microsoft.com/office/word/2006/wordml" xmlns:wps="http://schemas.microsoft.com/office/word/2010/wordprocessingShape" mc:Ignorable="w14 w15 w16se w16cid w16 w16cex w16sdtdh wp14">
+<w:hdr xmlns:wpc="http://schemas.microsoft.com/office/word/2010/wordprocessingCanvas" xmlns:cx="http://schemas.microsoft.com/office/drawing/2014/chartex" xmlns:cx1="http://schemas.microsoft.com/office/drawing/2015/9/8/chartex" xmlns:cx2="http://schemas.microsoft.com/office/drawing/2015/10/21/chartex" xmlns:cx3="http://schemas.microsoft.com/office/drawing/2016/5/9/chartex" xmlns:cx4="http://schemas.microsoft.com/office/drawing/2016/5/10/chartex" xmlns:cx5="http://schemas.microsoft.com/office/drawing/2016/5/11/chartex" xmlns:cx6="http://schemas.microsoft.com/office/drawing/2016/5/12/chartex" xmlns:cx7="http://schemas.microsoft.com/office/drawing/2016/5/13/chartex" xmlns:cx8="http://schemas.microsoft.com/office/drawing/2016/5/14/chartex" xmlns:mc="http://schemas.openxmlformats.org/markup-compatibility/2006" xmlns:m="http://schemas.openxmlformats.org/officeDocument/2006/math" xmlns:aink="http://schemas.microsoft.com/office/drawing/2016/ink" xmlns:am3d="http://schemas.microsoft.com/office/drawing/2017/model3d" xmlns:oel="http://schemas.microsoft.com/office/2019/extlst" xmlns:r="http://schemas.openxmlformats.org/officeDocument/2006/relationships" xmlns:wp14="http://schemas.microsoft.com/office/word/2010/wordprocessingDrawing" xmlns:wp="http://schemas.openxmlformats.org/drawingml/2006/wordprocessingDrawing" xmlns:wpg="http://schemas.microsoft.com/office/word/2010/wordprocessingGroup" xmlns:wpi="http://schemas.microsoft.com/office/word/2010/wordprocessingInk" xmlns:wps="http://schemas.microsoft.com/office/word/2010/wordprocessingShape" xmlns:o="urn:schemas-microsoft-com:office:office" xmlns:v="urn:schemas-microsoft-com:vml" xmlns:w10="urn:schemas-microsoft-com:office:word" xmlns:w="http://schemas.openxmlformats.org/wordprocessingml/2006/main" xmlns:w14="http://schemas.microsoft.com/office/word/2010/wordml" xmlns:w15="http://schemas.microsoft.com/office/word/2012/wordml" xmlns:w16cex="http://schemas.microsoft.com/office/word/2018/wordml/cex" xmlns:w16cid="http://schemas.microsoft.com/office/word/2016/wordml/cid" xmlns:w16="http://schemas.microsoft.com/office/word/2018/wordml" xmlns:w16sdtdh="http://schemas.microsoft.com/office/word/2020/wordml/sdtdatahash" xmlns:w16sdtfl="http://schemas.microsoft.com/office/word/2024/wordml/sdtformatlock" xmlns:w16se="http://schemas.microsoft.com/office/word/2015/wordml/symex" xmlns:w16du="http://schemas.microsoft.com/office/word/2023/wordml/word16du" xmlns:wne="http://schemas.microsoft.com/office/word/2006/wordml" mc:Ignorable="w14 w15 w16se w16cid w16 w16cex w16sdtdh w16sdtfl w16du wp14">
   <w:p>
     <w:pPr>
       <w:pStyle w:val="Header"/>
@@ -2409,8 +4637,7 @@
               <v:stroke joinstyle="miter"/>
               <v:path gradientshapeok="t" o:connecttype="rect"/>
             </v:shapetype>
-            <v:shape id="Text Box 2" o:spid="_x0000_s1026" type="#_x0000_t202" alt="OFFICIAL" style="position:absolute;margin-left:0;margin-top:0;width:34.95pt;height:34.95pt;z-index:251659264;visibility:visible;mso-wrap-style:none;mso-wrap-distance-left:0;mso-wrap-distance-top:0;mso-wrap-distance-right:0;mso-wrap-distance-bottom:0;mso-position-horizontal:center;mso-position-horizontal-relative:page;mso-position-vertical:top;mso-position-vertical-relative:page;v-text-anchor:top" o:gfxdata="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" filled="f" stroked="f">
-              <v:fill o:detectmouseclick="t"/>
+            <v:shape id="Text Box 2" o:spid="_x0000_s1026" type="#_x0000_t202" alt="OFFICIAL" style="position:absolute;margin-left:0;margin-top:0;width:34.95pt;height:34.95pt;z-index:251659264;visibility:visible;mso-wrap-style:none;mso-wrap-distance-left:0;mso-wrap-distance-top:0;mso-wrap-distance-right:0;mso-wrap-distance-bottom:0;mso-position-horizontal:center;mso-position-horizontal-relative:page;mso-position-vertical:top;mso-position-vertical-relative:page;v-text-anchor:top" o:gfxdata="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" filled="f" stroked="f">
               <v:textbox style="mso-fit-shape-to-text:t" inset="0,15pt,0,0">
                 <w:txbxContent>
                   <w:p>
@@ -2447,7 +4674,7 @@
 </file>
 
 <file path=word/header2.xml><?xml version="1.0" encoding="utf-8"?>
-<w:hdr xmlns:wpc="http://schemas.microsoft.com/office/word/2010/wordprocessingCanvas" xmlns:cx="http://schemas.microsoft.com/office/drawing/2014/chartex" xmlns:cx1="http://schemas.microsoft.com/office/drawing/2015/9/8/chartex" xmlns:cx2="http://schemas.microsoft.com/office/drawing/2015/10/21/chartex" xmlns:cx3="http://schemas.microsoft.com/office/drawing/2016/5/9/chartex" xmlns:cx4="http://schemas.microsoft.com/office/drawing/2016/5/10/chartex" xmlns:cx5="http://schemas.microsoft.com/office/drawing/2016/5/11/chartex" xmlns:cx6="http://schemas.microsoft.com/office/drawing/2016/5/12/chartex" xmlns:cx7="http://schemas.microsoft.com/office/drawing/2016/5/13/chartex" xmlns:cx8="http://schemas.microsoft.com/office/drawing/2016/5/14/chartex" xmlns:mc="http://schemas.openxmlformats.org/markup-compatibility/2006" xmlns:aink="http://schemas.microsoft.com/office/drawing/2016/ink" xmlns:am3d="http://schemas.microsoft.com/office/drawing/2017/model3d" xmlns:o="urn:schemas-microsoft-com:office:office" xmlns:oel="http://schemas.microsoft.com/office/2019/extlst" xmlns:r="http://schemas.openxmlformats.org/officeDocument/2006/relationships" xmlns:m="http://schemas.openxmlformats.org/officeDocument/2006/math" xmlns:v="urn:schemas-microsoft-com:vml" xmlns:wp14="http://schemas.microsoft.com/office/word/2010/wordprocessingDrawing" xmlns:wp="http://schemas.openxmlformats.org/drawingml/2006/wordprocessingDrawing" xmlns:w10="urn:schemas-microsoft-com:office:word" xmlns:w="http://schemas.openxmlformats.org/wordprocessingml/2006/main" xmlns:w14="http://schemas.microsoft.com/office/word/2010/wordml" xmlns:w15="http://schemas.microsoft.com/office/word/2012/wordml" xmlns:w16cex="http://schemas.microsoft.com/office/word/2018/wordml/cex" xmlns:w16cid="http://schemas.microsoft.com/office/word/2016/wordml/cid" xmlns:w16="http://schemas.microsoft.com/office/word/2018/wordml" xmlns:w16sdtdh="http://schemas.microsoft.com/office/word/2020/wordml/sdtdatahash" xmlns:w16se="http://schemas.microsoft.com/office/word/2015/wordml/symex" xmlns:wpg="http://schemas.microsoft.com/office/word/2010/wordprocessingGroup" xmlns:wpi="http://schemas.microsoft.com/office/word/2010/wordprocessingInk" xmlns:wne="http://schemas.microsoft.com/office/word/2006/wordml" xmlns:wps="http://schemas.microsoft.com/office/word/2010/wordprocessingShape" mc:Ignorable="w14 w15 w16se w16cid w16 w16cex w16sdtdh wp14">
+<w:hdr xmlns:wpc="http://schemas.microsoft.com/office/word/2010/wordprocessingCanvas" xmlns:cx="http://schemas.microsoft.com/office/drawing/2014/chartex" xmlns:cx1="http://schemas.microsoft.com/office/drawing/2015/9/8/chartex" xmlns:cx2="http://schemas.microsoft.com/office/drawing/2015/10/21/chartex" xmlns:cx3="http://schemas.microsoft.com/office/drawing/2016/5/9/chartex" xmlns:cx4="http://schemas.microsoft.com/office/drawing/2016/5/10/chartex" xmlns:cx5="http://schemas.microsoft.com/office/drawing/2016/5/11/chartex" xmlns:cx6="http://schemas.microsoft.com/office/drawing/2016/5/12/chartex" xmlns:cx7="http://schemas.microsoft.com/office/drawing/2016/5/13/chartex" xmlns:cx8="http://schemas.microsoft.com/office/drawing/2016/5/14/chartex" xmlns:mc="http://schemas.openxmlformats.org/markup-compatibility/2006" xmlns:m="http://schemas.openxmlformats.org/officeDocument/2006/math" xmlns:aink="http://schemas.microsoft.com/office/drawing/2016/ink" xmlns:am3d="http://schemas.microsoft.com/office/drawing/2017/model3d" xmlns:oel="http://schemas.microsoft.com/office/2019/extlst" xmlns:r="http://schemas.openxmlformats.org/officeDocument/2006/relationships" xmlns:wp14="http://schemas.microsoft.com/office/word/2010/wordprocessingDrawing" xmlns:wp="http://schemas.openxmlformats.org/drawingml/2006/wordprocessingDrawing" xmlns:wpg="http://schemas.microsoft.com/office/word/2010/wordprocessingGroup" xmlns:wpi="http://schemas.microsoft.com/office/word/2010/wordprocessingInk" xmlns:wps="http://schemas.microsoft.com/office/word/2010/wordprocessingShape" xmlns:o="urn:schemas-microsoft-com:office:office" xmlns:v="urn:schemas-microsoft-com:vml" xmlns:w10="urn:schemas-microsoft-com:office:word" xmlns:w="http://schemas.openxmlformats.org/wordprocessingml/2006/main" xmlns:w14="http://schemas.microsoft.com/office/word/2010/wordml" xmlns:w15="http://schemas.microsoft.com/office/word/2012/wordml" xmlns:w16cex="http://schemas.microsoft.com/office/word/2018/wordml/cex" xmlns:w16cid="http://schemas.microsoft.com/office/word/2016/wordml/cid" xmlns:w16="http://schemas.microsoft.com/office/word/2018/wordml" xmlns:w16sdtdh="http://schemas.microsoft.com/office/word/2020/wordml/sdtdatahash" xmlns:w16sdtfl="http://schemas.microsoft.com/office/word/2024/wordml/sdtformatlock" xmlns:w16se="http://schemas.microsoft.com/office/word/2015/wordml/symex" xmlns:w16du="http://schemas.microsoft.com/office/word/2023/wordml/word16du" xmlns:wne="http://schemas.microsoft.com/office/word/2006/wordml" mc:Ignorable="w14 w15 w16se w16cid w16 w16cex w16sdtdh w16sdtfl w16du wp14">
   <w:p>
     <w:pPr>
       <w:pStyle w:val="Header"/>
@@ -2538,8 +4765,7 @@
               <v:stroke joinstyle="miter"/>
               <v:path gradientshapeok="t" o:connecttype="rect"/>
             </v:shapetype>
-            <v:shape id="Text Box 3" o:spid="_x0000_s1027" type="#_x0000_t202" alt="OFFICIAL" style="position:absolute;margin-left:0;margin-top:0;width:34.95pt;height:34.95pt;z-index:251660288;visibility:visible;mso-wrap-style:none;mso-wrap-distance-left:0;mso-wrap-distance-top:0;mso-wrap-distance-right:0;mso-wrap-distance-bottom:0;mso-position-horizontal:center;mso-position-horizontal-relative:page;mso-position-vertical:top;mso-position-vertical-relative:page;v-text-anchor:top" o:gfxdata="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" filled="f" stroked="f">
-              <v:fill o:detectmouseclick="t"/>
+            <v:shape id="Text Box 3" o:spid="_x0000_s1027" type="#_x0000_t202" alt="OFFICIAL" style="position:absolute;margin-left:0;margin-top:0;width:34.95pt;height:34.95pt;z-index:251660288;visibility:visible;mso-wrap-style:none;mso-wrap-distance-left:0;mso-wrap-distance-top:0;mso-wrap-distance-right:0;mso-wrap-distance-bottom:0;mso-position-horizontal:center;mso-position-horizontal-relative:page;mso-position-vertical:top;mso-position-vertical-relative:page;v-text-anchor:top" o:gfxdata="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" filled="f" stroked="f">
               <v:textbox style="mso-fit-shape-to-text:t" inset="0,15pt,0,0">
                 <w:txbxContent>
                   <w:p>
@@ -2576,7 +4802,7 @@
 </file>
 
 <file path=word/header3.xml><?xml version="1.0" encoding="utf-8"?>
-<w:hdr xmlns:wpc="http://schemas.microsoft.com/office/word/2010/wordprocessingCanvas" xmlns:cx="http://schemas.microsoft.com/office/drawing/2014/chartex" xmlns:cx1="http://schemas.microsoft.com/office/drawing/2015/9/8/chartex" xmlns:cx2="http://schemas.microsoft.com/office/drawing/2015/10/21/chartex" xmlns:cx3="http://schemas.microsoft.com/office/drawing/2016/5/9/chartex" xmlns:cx4="http://schemas.microsoft.com/office/drawing/2016/5/10/chartex" xmlns:cx5="http://schemas.microsoft.com/office/drawing/2016/5/11/chartex" xmlns:cx6="http://schemas.microsoft.com/office/drawing/2016/5/12/chartex" xmlns:cx7="http://schemas.microsoft.com/office/drawing/2016/5/13/chartex" xmlns:cx8="http://schemas.microsoft.com/office/drawing/2016/5/14/chartex" xmlns:mc="http://schemas.openxmlformats.org/markup-compatibility/2006" xmlns:aink="http://schemas.microsoft.com/office/drawing/2016/ink" xmlns:am3d="http://schemas.microsoft.com/office/drawing/2017/model3d" xmlns:o="urn:schemas-microsoft-com:office:office" xmlns:oel="http://schemas.microsoft.com/office/2019/extlst" xmlns:r="http://schemas.openxmlformats.org/officeDocument/2006/relationships" xmlns:m="http://schemas.openxmlformats.org/officeDocument/2006/math" xmlns:v="urn:schemas-microsoft-com:vml" xmlns:wp14="http://schemas.microsoft.com/office/word/2010/wordprocessingDrawing" xmlns:wp="http://schemas.openxmlformats.org/drawingml/2006/wordprocessingDrawing" xmlns:w10="urn:schemas-microsoft-com:office:word" xmlns:w="http://schemas.openxmlformats.org/wordprocessingml/2006/main" xmlns:w14="http://schemas.microsoft.com/office/word/2010/wordml" xmlns:w15="http://schemas.microsoft.com/office/word/2012/wordml" xmlns:w16cex="http://schemas.microsoft.com/office/word/2018/wordml/cex" xmlns:w16cid="http://schemas.microsoft.com/office/word/2016/wordml/cid" xmlns:w16="http://schemas.microsoft.com/office/word/2018/wordml" xmlns:w16sdtdh="http://schemas.microsoft.com/office/word/2020/wordml/sdtdatahash" xmlns:w16se="http://schemas.microsoft.com/office/word/2015/wordml/symex" xmlns:wpg="http://schemas.microsoft.com/office/word/2010/wordprocessingGroup" xmlns:wpi="http://schemas.microsoft.com/office/word/2010/wordprocessingInk" xmlns:wne="http://schemas.microsoft.com/office/word/2006/wordml" xmlns:wps="http://schemas.microsoft.com/office/word/2010/wordprocessingShape" mc:Ignorable="w14 w15 w16se w16cid w16 w16cex w16sdtdh wp14">
+<w:hdr xmlns:wpc="http://schemas.microsoft.com/office/word/2010/wordprocessingCanvas" xmlns:cx="http://schemas.microsoft.com/office/drawing/2014/chartex" xmlns:cx1="http://schemas.microsoft.com/office/drawing/2015/9/8/chartex" xmlns:cx2="http://schemas.microsoft.com/office/drawing/2015/10/21/chartex" xmlns:cx3="http://schemas.microsoft.com/office/drawing/2016/5/9/chartex" xmlns:cx4="http://schemas.microsoft.com/office/drawing/2016/5/10/chartex" xmlns:cx5="http://schemas.microsoft.com/office/drawing/2016/5/11/chartex" xmlns:cx6="http://schemas.microsoft.com/office/drawing/2016/5/12/chartex" xmlns:cx7="http://schemas.microsoft.com/office/drawing/2016/5/13/chartex" xmlns:cx8="http://schemas.microsoft.com/office/drawing/2016/5/14/chartex" xmlns:mc="http://schemas.openxmlformats.org/markup-compatibility/2006" xmlns:m="http://schemas.openxmlformats.org/officeDocument/2006/math" xmlns:aink="http://schemas.microsoft.com/office/drawing/2016/ink" xmlns:am3d="http://schemas.microsoft.com/office/drawing/2017/model3d" xmlns:oel="http://schemas.microsoft.com/office/2019/extlst" xmlns:r="http://schemas.openxmlformats.org/officeDocument/2006/relationships" xmlns:wp14="http://schemas.microsoft.com/office/word/2010/wordprocessingDrawing" xmlns:wp="http://schemas.openxmlformats.org/drawingml/2006/wordprocessingDrawing" xmlns:wpg="http://schemas.microsoft.com/office/word/2010/wordprocessingGroup" xmlns:wpi="http://schemas.microsoft.com/office/word/2010/wordprocessingInk" xmlns:wps="http://schemas.microsoft.com/office/word/2010/wordprocessingShape" xmlns:o="urn:schemas-microsoft-com:office:office" xmlns:v="urn:schemas-microsoft-com:vml" xmlns:w10="urn:schemas-microsoft-com:office:word" xmlns:w="http://schemas.openxmlformats.org/wordprocessingml/2006/main" xmlns:w14="http://schemas.microsoft.com/office/word/2010/wordml" xmlns:w15="http://schemas.microsoft.com/office/word/2012/wordml" xmlns:w16cex="http://schemas.microsoft.com/office/word/2018/wordml/cex" xmlns:w16cid="http://schemas.microsoft.com/office/word/2016/wordml/cid" xmlns:w16="http://schemas.microsoft.com/office/word/2018/wordml" xmlns:w16sdtdh="http://schemas.microsoft.com/office/word/2020/wordml/sdtdatahash" xmlns:w16sdtfl="http://schemas.microsoft.com/office/word/2024/wordml/sdtformatlock" xmlns:w16se="http://schemas.microsoft.com/office/word/2015/wordml/symex" xmlns:w16du="http://schemas.microsoft.com/office/word/2023/wordml/word16du" xmlns:wne="http://schemas.microsoft.com/office/word/2006/wordml" mc:Ignorable="w14 w15 w16se w16cid w16 w16cex w16sdtdh w16sdtfl w16du wp14">
   <w:p>
     <w:pPr>
       <w:pStyle w:val="Header"/>
@@ -2667,8 +4893,7 @@
               <v:stroke joinstyle="miter"/>
               <v:path gradientshapeok="t" o:connecttype="rect"/>
             </v:shapetype>
-            <v:shape id="Text Box 1" o:spid="_x0000_s1028" type="#_x0000_t202" alt="OFFICIAL" style="position:absolute;margin-left:0;margin-top:0;width:34.95pt;height:34.95pt;z-index:251658240;visibility:visible;mso-wrap-style:none;mso-wrap-distance-left:0;mso-wrap-distance-top:0;mso-wrap-distance-right:0;mso-wrap-distance-bottom:0;mso-position-horizontal:center;mso-position-horizontal-relative:page;mso-position-vertical:top;mso-position-vertical-relative:page;v-text-anchor:top" o:gfxdata="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" filled="f" stroked="f">
-              <v:fill o:detectmouseclick="t"/>
+            <v:shape id="Text Box 1" o:spid="_x0000_s1028" type="#_x0000_t202" alt="OFFICIAL" style="position:absolute;margin-left:0;margin-top:0;width:34.95pt;height:34.95pt;z-index:251658240;visibility:visible;mso-wrap-style:none;mso-wrap-distance-left:0;mso-wrap-distance-top:0;mso-wrap-distance-right:0;mso-wrap-distance-bottom:0;mso-position-horizontal:center;mso-position-horizontal-relative:page;mso-position-vertical:top;mso-position-vertical-relative:page;v-text-anchor:top" o:gfxdata="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" filled="f" stroked="f">
               <v:textbox style="mso-fit-shape-to-text:t" inset="0,15pt,0,0">
                 <w:txbxContent>
                   <w:p>
@@ -2705,7 +4930,7 @@
 </file>
 
 <file path=word/numbering.xml><?xml version="1.0" encoding="utf-8"?>
-<w:numbering xmlns:wpc="http://schemas.microsoft.com/office/word/2010/wordprocessingCanvas" xmlns:cx="http://schemas.microsoft.com/office/drawing/2014/chartex" xmlns:cx1="http://schemas.microsoft.com/office/drawing/2015/9/8/chartex" xmlns:cx2="http://schemas.microsoft.com/office/drawing/2015/10/21/chartex" xmlns:cx3="http://schemas.microsoft.com/office/drawing/2016/5/9/chartex" xmlns:cx4="http://schemas.microsoft.com/office/drawing/2016/5/10/chartex" xmlns:cx5="http://schemas.microsoft.com/office/drawing/2016/5/11/chartex" xmlns:cx6="http://schemas.microsoft.com/office/drawing/2016/5/12/chartex" xmlns:cx7="http://schemas.microsoft.com/office/drawing/2016/5/13/chartex" xmlns:cx8="http://schemas.microsoft.com/office/drawing/2016/5/14/chartex" xmlns:mc="http://schemas.openxmlformats.org/markup-compatibility/2006" xmlns:aink="http://schemas.microsoft.com/office/drawing/2016/ink" xmlns:am3d="http://schemas.microsoft.com/office/drawing/2017/model3d" xmlns:o="urn:schemas-microsoft-com:office:office" xmlns:oel="http://schemas.microsoft.com/office/2019/extlst" xmlns:r="http://schemas.openxmlformats.org/officeDocument/2006/relationships" xmlns:m="http://schemas.openxmlformats.org/officeDocument/2006/math" xmlns:v="urn:schemas-microsoft-com:vml" xmlns:wp14="http://schemas.microsoft.com/office/word/2010/wordprocessingDrawing" xmlns:wp="http://schemas.openxmlformats.org/drawingml/2006/wordprocessingDrawing" xmlns:w10="urn:schemas-microsoft-com:office:word" xmlns:w="http://schemas.openxmlformats.org/wordprocessingml/2006/main" xmlns:w14="http://schemas.microsoft.com/office/word/2010/wordml" xmlns:w15="http://schemas.microsoft.com/office/word/2012/wordml" xmlns:w16cex="http://schemas.microsoft.com/office/word/2018/wordml/cex" xmlns:w16cid="http://schemas.microsoft.com/office/word/2016/wordml/cid" xmlns:w16="http://schemas.microsoft.com/office/word/2018/wordml" xmlns:w16sdtdh="http://schemas.microsoft.com/office/word/2020/wordml/sdtdatahash" xmlns:w16se="http://schemas.microsoft.com/office/word/2015/wordml/symex" xmlns:wpg="http://schemas.microsoft.com/office/word/2010/wordprocessingGroup" xmlns:wpi="http://schemas.microsoft.com/office/word/2010/wordprocessingInk" xmlns:wne="http://schemas.microsoft.com/office/word/2006/wordml" xmlns:wps="http://schemas.microsoft.com/office/word/2010/wordprocessingShape" mc:Ignorable="w14 w15 w16se w16cid w16 w16cex w16sdtdh wp14">
+<w:numbering xmlns:wpc="http://schemas.microsoft.com/office/word/2010/wordprocessingCanvas" xmlns:cx="http://schemas.microsoft.com/office/drawing/2014/chartex" xmlns:cx1="http://schemas.microsoft.com/office/drawing/2015/9/8/chartex" xmlns:cx2="http://schemas.microsoft.com/office/drawing/2015/10/21/chartex" xmlns:cx3="http://schemas.microsoft.com/office/drawing/2016/5/9/chartex" xmlns:cx4="http://schemas.microsoft.com/office/drawing/2016/5/10/chartex" xmlns:cx5="http://schemas.microsoft.com/office/drawing/2016/5/11/chartex" xmlns:cx6="http://schemas.microsoft.com/office/drawing/2016/5/12/chartex" xmlns:cx7="http://schemas.microsoft.com/office/drawing/2016/5/13/chartex" xmlns:cx8="http://schemas.microsoft.com/office/drawing/2016/5/14/chartex" xmlns:mc="http://schemas.openxmlformats.org/markup-compatibility/2006" xmlns:m="http://schemas.openxmlformats.org/officeDocument/2006/math" xmlns:aink="http://schemas.microsoft.com/office/drawing/2016/ink" xmlns:am3d="http://schemas.microsoft.com/office/drawing/2017/model3d" xmlns:oel="http://schemas.microsoft.com/office/2019/extlst" xmlns:r="http://schemas.openxmlformats.org/officeDocument/2006/relationships" xmlns:wp14="http://schemas.microsoft.com/office/word/2010/wordprocessingDrawing" xmlns:wp="http://schemas.openxmlformats.org/drawingml/2006/wordprocessingDrawing" xmlns:wpg="http://schemas.microsoft.com/office/word/2010/wordprocessingGroup" xmlns:wpi="http://schemas.microsoft.com/office/word/2010/wordprocessingInk" xmlns:wps="http://schemas.microsoft.com/office/word/2010/wordprocessingShape" xmlns:o="urn:schemas-microsoft-com:office:office" xmlns:v="urn:schemas-microsoft-com:vml" xmlns:w10="urn:schemas-microsoft-com:office:word" xmlns:w="http://schemas.openxmlformats.org/wordprocessingml/2006/main" xmlns:w14="http://schemas.microsoft.com/office/word/2010/wordml" xmlns:w15="http://schemas.microsoft.com/office/word/2012/wordml" xmlns:w16cex="http://schemas.microsoft.com/office/word/2018/wordml/cex" xmlns:w16cid="http://schemas.microsoft.com/office/word/2016/wordml/cid" xmlns:w16="http://schemas.microsoft.com/office/word/2018/wordml" xmlns:w16sdtdh="http://schemas.microsoft.com/office/word/2020/wordml/sdtdatahash" xmlns:w16sdtfl="http://schemas.microsoft.com/office/word/2024/wordml/sdtformatlock" xmlns:w16se="http://schemas.microsoft.com/office/word/2015/wordml/symex" xmlns:w16du="http://schemas.microsoft.com/office/word/2023/wordml/word16du" xmlns:wne="http://schemas.microsoft.com/office/word/2006/wordml" mc:Ignorable="w14 w15 w16se w16cid w16 w16cex w16sdtdh w16sdtfl w16du wp14">
   <w:abstractNum w:abstractNumId="0" w15:restartNumberingAfterBreak="0">
     <w:nsid w:val="006715F6"/>
     <w:multiLevelType w:val="hybridMultilevel"/>
@@ -2820,6 +5045,119 @@
     </w:lvl>
   </w:abstractNum>
   <w:abstractNum w:abstractNumId="1" w15:restartNumberingAfterBreak="0">
+    <w:nsid w:val="52A426C2"/>
+    <w:multiLevelType w:val="hybridMultilevel"/>
+    <w:tmpl w:val="1CF66DFC"/>
+    <w:lvl w:ilvl="0" w:tplc="08090001">
+      <w:start w:val="1"/>
+      <w:numFmt w:val="bullet"/>
+      <w:lvlText w:val=""/>
+      <w:lvlJc w:val="left"/>
+      <w:pPr>
+        <w:ind w:left="360" w:hanging="360"/>
+      </w:pPr>
+      <w:rPr>
+        <w:rFonts w:ascii="Symbol" w:hAnsi="Symbol" w:hint="default"/>
+      </w:rPr>
+    </w:lvl>
+    <w:lvl w:ilvl="1" w:tplc="08090003" w:tentative="1">
+      <w:start w:val="1"/>
+      <w:numFmt w:val="bullet"/>
+      <w:lvlText w:val="o"/>
+      <w:lvlJc w:val="left"/>
+      <w:pPr>
+        <w:ind w:left="1080" w:hanging="360"/>
+      </w:pPr>
+      <w:rPr>
+        <w:rFonts w:ascii="Courier New" w:hAnsi="Courier New" w:cs="Courier New" w:hint="default"/>
+      </w:rPr>
+    </w:lvl>
+    <w:lvl w:ilvl="2" w:tplc="08090005" w:tentative="1">
+      <w:start w:val="1"/>
+      <w:numFmt w:val="bullet"/>
+      <w:lvlText w:val=""/>
+      <w:lvlJc w:val="left"/>
+      <w:pPr>
+        <w:ind w:left="1800" w:hanging="360"/>
+      </w:pPr>
+      <w:rPr>
+        <w:rFonts w:ascii="Wingdings" w:hAnsi="Wingdings" w:hint="default"/>
+      </w:rPr>
+    </w:lvl>
+    <w:lvl w:ilvl="3" w:tplc="08090001" w:tentative="1">
+      <w:start w:val="1"/>
+      <w:numFmt w:val="bullet"/>
+      <w:lvlText w:val=""/>
+      <w:lvlJc w:val="left"/>
+      <w:pPr>
+        <w:ind w:left="2520" w:hanging="360"/>
+      </w:pPr>
+      <w:rPr>
+        <w:rFonts w:ascii="Symbol" w:hAnsi="Symbol" w:hint="default"/>
+      </w:rPr>
+    </w:lvl>
+    <w:lvl w:ilvl="4" w:tplc="08090003" w:tentative="1">
+      <w:start w:val="1"/>
+      <w:numFmt w:val="bullet"/>
+      <w:lvlText w:val="o"/>
+      <w:lvlJc w:val="left"/>
+      <w:pPr>
+        <w:ind w:left="3240" w:hanging="360"/>
+      </w:pPr>
+      <w:rPr>
+        <w:rFonts w:ascii="Courier New" w:hAnsi="Courier New" w:cs="Courier New" w:hint="default"/>
+      </w:rPr>
+    </w:lvl>
+    <w:lvl w:ilvl="5" w:tplc="08090005" w:tentative="1">
+      <w:start w:val="1"/>
+      <w:numFmt w:val="bullet"/>
+      <w:lvlText w:val=""/>
+      <w:lvlJc w:val="left"/>
+      <w:pPr>
+        <w:ind w:left="3960" w:hanging="360"/>
+      </w:pPr>
+      <w:rPr>
+        <w:rFonts w:ascii="Wingdings" w:hAnsi="Wingdings" w:hint="default"/>
+      </w:rPr>
+    </w:lvl>
+    <w:lvl w:ilvl="6" w:tplc="08090001" w:tentative="1">
+      <w:start w:val="1"/>
+      <w:numFmt w:val="bullet"/>
+      <w:lvlText w:val=""/>
+      <w:lvlJc w:val="left"/>
+      <w:pPr>
+        <w:ind w:left="4680" w:hanging="360"/>
+      </w:pPr>
+      <w:rPr>
+        <w:rFonts w:ascii="Symbol" w:hAnsi="Symbol" w:hint="default"/>
+      </w:rPr>
+    </w:lvl>
+    <w:lvl w:ilvl="7" w:tplc="08090003" w:tentative="1">
+      <w:start w:val="1"/>
+      <w:numFmt w:val="bullet"/>
+      <w:lvlText w:val="o"/>
+      <w:lvlJc w:val="left"/>
+      <w:pPr>
+        <w:ind w:left="5400" w:hanging="360"/>
+      </w:pPr>
+      <w:rPr>
+        <w:rFonts w:ascii="Courier New" w:hAnsi="Courier New" w:cs="Courier New" w:hint="default"/>
+      </w:rPr>
+    </w:lvl>
+    <w:lvl w:ilvl="8" w:tplc="08090005" w:tentative="1">
+      <w:start w:val="1"/>
+      <w:numFmt w:val="bullet"/>
+      <w:lvlText w:val=""/>
+      <w:lvlJc w:val="left"/>
+      <w:pPr>
+        <w:ind w:left="6120" w:hanging="360"/>
+      </w:pPr>
+      <w:rPr>
+        <w:rFonts w:ascii="Wingdings" w:hAnsi="Wingdings" w:hint="default"/>
+      </w:rPr>
+    </w:lvl>
+  </w:abstractNum>
+  <w:abstractNum w:abstractNumId="2" w15:restartNumberingAfterBreak="0">
     <w:nsid w:val="6AF16D4A"/>
     <w:multiLevelType w:val="hybridMultilevel"/>
     <w:tmpl w:val="170C928A"/>
@@ -2936,6 +5274,9 @@
     <w:abstractNumId w:val="0"/>
   </w:num>
   <w:num w:numId="2" w16cid:durableId="1511336736">
+    <w:abstractNumId w:val="2"/>
+  </w:num>
+  <w:num w:numId="3" w16cid:durableId="1906331781">
     <w:abstractNumId w:val="1"/>
   </w:num>
   <w:numIdMacAtCleanup w:val="2"/>
@@ -2943,7 +5284,7 @@
 </file>
 
 <file path=word/styles.xml><?xml version="1.0" encoding="utf-8"?>
-<w:styles xmlns:mc="http://schemas.openxmlformats.org/markup-compatibility/2006" xmlns:r="http://schemas.openxmlformats.org/officeDocument/2006/relationships" xmlns:w="http://schemas.openxmlformats.org/wordprocessingml/2006/main" xmlns:w14="http://schemas.microsoft.com/office/word/2010/wordml" xmlns:w15="http://schemas.microsoft.com/office/word/2012/wordml" xmlns:w16cex="http://schemas.microsoft.com/office/word/2018/wordml/cex" xmlns:w16cid="http://schemas.microsoft.com/office/word/2016/wordml/cid" xmlns:w16="http://schemas.microsoft.com/office/word/2018/wordml" xmlns:w16sdtdh="http://schemas.microsoft.com/office/word/2020/wordml/sdtdatahash" xmlns:w16se="http://schemas.microsoft.com/office/word/2015/wordml/symex" mc:Ignorable="w14 w15 w16se w16cid w16 w16cex w16sdtdh">
+<w:styles xmlns:mc="http://schemas.openxmlformats.org/markup-compatibility/2006" xmlns:r="http://schemas.openxmlformats.org/officeDocument/2006/relationships" xmlns:w="http://schemas.openxmlformats.org/wordprocessingml/2006/main" xmlns:w14="http://schemas.microsoft.com/office/word/2010/wordml" xmlns:w15="http://schemas.microsoft.com/office/word/2012/wordml" xmlns:w16cex="http://schemas.microsoft.com/office/word/2018/wordml/cex" xmlns:w16cid="http://schemas.microsoft.com/office/word/2016/wordml/cid" xmlns:w16="http://schemas.microsoft.com/office/word/2018/wordml" xmlns:w16sdtdh="http://schemas.microsoft.com/office/word/2020/wordml/sdtdatahash" xmlns:w16sdtfl="http://schemas.microsoft.com/office/word/2024/wordml/sdtformatlock" xmlns:w16se="http://schemas.microsoft.com/office/word/2015/wordml/symex" xmlns:w16du="http://schemas.microsoft.com/office/word/2023/wordml/word16du" mc:Ignorable="w14 w15 w16se w16cid w16 w16cex w16sdtdh w16sdtfl w16du">
   <w:docDefaults>
     <w:rPrDefault>
       <w:rPr>
@@ -4491,7 +6832,22 @@
 </file>
 
 <file path=customXml/itemProps3.xml><?xml version="1.0" encoding="utf-8"?>
-<ds:datastoreItem xmlns:ds="http://schemas.openxmlformats.org/officeDocument/2006/customXml" ds:itemID="{A160A6A7-E4CF-4464-8769-5D74BD27FF60}"/>
+<ds:datastoreItem xmlns:ds="http://schemas.openxmlformats.org/officeDocument/2006/customXml" ds:itemID="{A160A6A7-E4CF-4464-8769-5D74BD27FF60}">
+  <ds:schemaRefs>
+    <ds:schemaRef ds:uri="http://schemas.microsoft.com/office/2006/metadata/contentType"/>
+    <ds:schemaRef ds:uri="http://schemas.microsoft.com/office/2006/metadata/properties/metaAttributes"/>
+    <ds:schemaRef ds:uri="http://www.w3.org/2001/XMLSchema"/>
+    <ds:schemaRef ds:uri="http://schemas.microsoft.com/office/2006/metadata/properties"/>
+    <ds:schemaRef ds:uri="bef73783-b83a-4f38-94d5-1aaaa1b3b0a2"/>
+    <ds:schemaRef ds:uri="2933ac1b-cace-482f-bed9-bf9b7d80f34a"/>
+    <ds:schemaRef ds:uri="http://schemas.microsoft.com/office/2006/documentManagement/types"/>
+    <ds:schemaRef ds:uri="http://schemas.microsoft.com/office/infopath/2007/PartnerControls"/>
+    <ds:schemaRef ds:uri="http://schemas.openxmlformats.org/package/2006/metadata/core-properties"/>
+    <ds:schemaRef ds:uri="http://purl.org/dc/elements/1.1/"/>
+    <ds:schemaRef ds:uri="http://purl.org/dc/terms/"/>
+    <ds:schemaRef ds:uri="http://schemas.microsoft.com/internal/obd"/>
+  </ds:schemaRefs>
+</ds:datastoreItem>
 </file>
 
 <file path=customXml/itemProps4.xml><?xml version="1.0" encoding="utf-8"?>

</xml_diff>

<commit_message>
assessments(s1-cl1): AT1 student instrument — manual pre-delivery change
Manual change to the approved AT1-BusinessCase-Student.docx before delivery.
Committed in place at user direction (finalised-assessment change-control guard
consciously overridden for this edit).

Co-Authored-By: Claude Opus 4.8 (1M context) <noreply@anthropic.com>
</commit_message>
<xml_diff>
--- a/S1-CL1-Cloud-Design-Build/assessments/AT1/AT1-BusinessCase-Student.docx
+++ b/S1-CL1-Cloud-Design-Build/assessments/AT1/AT1-BusinessCase-Student.docx
@@ -1,6 +1,6 @@
 
 <file path=word/document.xml><?xml version="1.0" encoding="utf-8"?>
-<w:document xmlns:wpc="http://schemas.microsoft.com/office/word/2010/wordprocessingCanvas" xmlns:cx="http://schemas.microsoft.com/office/drawing/2014/chartex" xmlns:cx1="http://schemas.microsoft.com/office/drawing/2015/9/8/chartex" xmlns:cx2="http://schemas.microsoft.com/office/drawing/2015/10/21/chartex" xmlns:cx3="http://schemas.microsoft.com/office/drawing/2016/5/9/chartex" xmlns:cx4="http://schemas.microsoft.com/office/drawing/2016/5/10/chartex" xmlns:cx5="http://schemas.microsoft.com/office/drawing/2016/5/11/chartex" xmlns:cx6="http://schemas.microsoft.com/office/drawing/2016/5/12/chartex" xmlns:cx7="http://schemas.microsoft.com/office/drawing/2016/5/13/chartex" xmlns:cx8="http://schemas.microsoft.com/office/drawing/2016/5/14/chartex" xmlns:mc="http://schemas.openxmlformats.org/markup-compatibility/2006" xmlns:m="http://schemas.openxmlformats.org/officeDocument/2006/math" xmlns:aink="http://schemas.microsoft.com/office/drawing/2016/ink" xmlns:am3d="http://schemas.microsoft.com/office/drawing/2017/model3d" xmlns:oel="http://schemas.microsoft.com/office/2019/extlst" xmlns:r="http://schemas.openxmlformats.org/officeDocument/2006/relationships" xmlns:wp14="http://schemas.microsoft.com/office/word/2010/wordprocessingDrawing" xmlns:wp="http://schemas.openxmlformats.org/drawingml/2006/wordprocessingDrawing" xmlns:wpg="http://schemas.microsoft.com/office/word/2010/wordprocessingGroup" xmlns:wpi="http://schemas.microsoft.com/office/word/2010/wordprocessingInk" xmlns:wps="http://schemas.microsoft.com/office/word/2010/wordprocessingShape" xmlns:o="urn:schemas-microsoft-com:office:office" xmlns:v="urn:schemas-microsoft-com:vml" xmlns:w10="urn:schemas-microsoft-com:office:word" xmlns:w="http://schemas.openxmlformats.org/wordprocessingml/2006/main" xmlns:w14="http://schemas.microsoft.com/office/word/2010/wordml" xmlns:w15="http://schemas.microsoft.com/office/word/2012/wordml" xmlns:w16cex="http://schemas.microsoft.com/office/word/2018/wordml/cex" xmlns:w16cid="http://schemas.microsoft.com/office/word/2016/wordml/cid" xmlns:w16="http://schemas.microsoft.com/office/word/2018/wordml" xmlns:w16sdtdh="http://schemas.microsoft.com/office/word/2020/wordml/sdtdatahash" xmlns:w16sdtfl="http://schemas.microsoft.com/office/word/2024/wordml/sdtformatlock" xmlns:w16se="http://schemas.microsoft.com/office/word/2015/wordml/symex" xmlns:w16du="http://schemas.microsoft.com/office/word/2023/wordml/word16du" xmlns:wne="http://schemas.microsoft.com/office/word/2006/wordml" mc:Ignorable="w14 w15 w16se w16cid w16 w16cex w16sdtdh w16sdtfl w16du wp14">
+<w:document xmlns:wpc="http://schemas.microsoft.com/office/word/2010/wordprocessingCanvas" xmlns:cx="http://schemas.microsoft.com/office/drawing/2014/chartex" xmlns:cx1="http://schemas.microsoft.com/office/drawing/2015/9/8/chartex" xmlns:cx2="http://schemas.microsoft.com/office/drawing/2015/10/21/chartex" xmlns:cx3="http://schemas.microsoft.com/office/drawing/2016/5/9/chartex" xmlns:cx4="http://schemas.microsoft.com/office/drawing/2016/5/10/chartex" xmlns:cx5="http://schemas.microsoft.com/office/drawing/2016/5/11/chartex" xmlns:cx6="http://schemas.microsoft.com/office/drawing/2016/5/12/chartex" xmlns:cx7="http://schemas.microsoft.com/office/drawing/2016/5/13/chartex" xmlns:cx8="http://schemas.microsoft.com/office/drawing/2016/5/14/chartex" xmlns:mc="http://schemas.openxmlformats.org/markup-compatibility/2006" xmlns:m="http://schemas.openxmlformats.org/officeDocument/2006/math" xmlns:aink="http://schemas.microsoft.com/office/drawing/2016/ink" xmlns:am3d="http://schemas.microsoft.com/office/drawing/2017/model3d" xmlns:oel="http://schemas.microsoft.com/office/2019/extlst" xmlns:r="http://schemas.openxmlformats.org/officeDocument/2006/relationships" xmlns:wp14="http://schemas.microsoft.com/office/word/2010/wordprocessingDrawing" xmlns:wp="http://schemas.openxmlformats.org/drawingml/2006/wordprocessingDrawing" xmlns:wpg="http://schemas.microsoft.com/office/word/2010/wordprocessingGroup" xmlns:wpi="http://schemas.microsoft.com/office/word/2010/wordprocessingInk" xmlns:wps="http://schemas.microsoft.com/office/word/2010/wordprocessingShape" xmlns:o="urn:schemas-microsoft-com:office:office" xmlns:v="urn:schemas-microsoft-com:vml" xmlns:w10="urn:schemas-microsoft-com:office:word" xmlns:w="http://schemas.openxmlformats.org/wordprocessingml/2006/main" xmlns:w14="http://schemas.microsoft.com/office/word/2010/wordml" xmlns:w15="http://schemas.microsoft.com/office/word/2012/wordml" xmlns:w16cei="http://schemas.microsoft.com/office/word/2026/wordml/cei" xmlns:w16cex="http://schemas.microsoft.com/office/word/2018/wordml/cex" xmlns:w16cid="http://schemas.microsoft.com/office/word/2016/wordml/cid" xmlns:w16="http://schemas.microsoft.com/office/word/2018/wordml" xmlns:w16sdtdh="http://schemas.microsoft.com/office/word/2020/wordml/sdtdatahash" xmlns:w16sdtfl="http://schemas.microsoft.com/office/word/2024/wordml/sdtformatlock" xmlns:w16se="http://schemas.microsoft.com/office/word/2015/wordml/symex" xmlns:w16du="http://schemas.microsoft.com/office/word/2023/wordml/word16du" xmlns:wne="http://schemas.microsoft.com/office/word/2006/wordml" mc:Ignorable="w14 w15 w16se w16cid w16 w16cex w16sdtdh w16sdtfl w16du wp14">
   <w:body>
     <w:p>
       <w:pPr>
@@ -3193,7 +3193,23 @@
           <w:sz w:val="20"/>
           <w:szCs w:val="20"/>
         </w:rPr>
-        <w:t>AT1 is the analysis and planning phase of the engagement. The work you produce in AT1 flows into AT2 and AT3 of this cluster — the action plan approved at the end of AT1 becomes the brief for the build work in AT2.</w:t>
+        <w:t xml:space="preserve">AT1 is the analysis and planning phase of the engagement. The work you produce in AT1 flows into AT2 and AT3 of this cluster — the action plan approved at the end of AT1 </w:t>
+      </w:r>
+      <w:r>
+        <w:rPr>
+          <w:color w:val="000000" w:themeColor="text1"/>
+          <w:sz w:val="20"/>
+          <w:szCs w:val="20"/>
+        </w:rPr>
+        <w:t xml:space="preserve">feeds into </w:t>
+      </w:r>
+      <w:r>
+        <w:rPr>
+          <w:color w:val="000000" w:themeColor="text1"/>
+          <w:sz w:val="20"/>
+          <w:szCs w:val="20"/>
+        </w:rPr>
+        <w:t>the brief for the build work in AT2.</w:t>
       </w:r>
     </w:p>
     <w:p>
@@ -3630,6 +3646,14 @@
         </w:rPr>
         <w:t>You will need to research AWS pricing yourself using the AWS Pricing Calculator (see Appendix 1 of the Business Case template for the structure your AWS line items must follow). YAT-internal cost figures for the on-prem option are provided in the scenario materials on the intranet.</w:t>
       </w:r>
+      <w:r>
+        <w:rPr>
+          <w:color w:val="000000" w:themeColor="text1"/>
+          <w:sz w:val="20"/>
+          <w:szCs w:val="20"/>
+        </w:rPr>
+        <w:t xml:space="preserve"> Record the settings used or screenshots of the pricing tool setup in appendix 3 of the business case template.</w:t>
+      </w:r>
     </w:p>
     <w:p>
       <w:pPr>
@@ -3670,7 +3694,6 @@
           <w:sz w:val="20"/>
           <w:szCs w:val="20"/>
         </w:rPr>
-        <w:lastRenderedPageBreak/>
         <w:t>Resources for Part A — available on the YAT intranet</w:t>
       </w:r>
     </w:p>
@@ -4056,26 +4079,52 @@
           <w:sz w:val="20"/>
           <w:szCs w:val="20"/>
         </w:rPr>
-        <w:t>The completed Business Case submitted to the board at least 48 hours in advance</w:t>
-      </w:r>
-    </w:p>
-    <w:p>
-      <w:pPr>
-        <w:pStyle w:val="Assessortext"/>
-        <w:rPr>
-          <w:color w:val="000000" w:themeColor="text1"/>
-          <w:sz w:val="20"/>
-          <w:szCs w:val="20"/>
-        </w:rPr>
-      </w:pPr>
-      <w:r>
-        <w:rPr>
-          <w:color w:val="000000" w:themeColor="text1"/>
-          <w:sz w:val="20"/>
-          <w:szCs w:val="20"/>
-        </w:rPr>
-        <w:t>The deck with populated speaker notes</w:t>
-      </w:r>
+        <w:t>The completed Business Case</w:t>
+      </w:r>
+    </w:p>
+    <w:p>
+      <w:pPr>
+        <w:pStyle w:val="Assessortext"/>
+        <w:rPr>
+          <w:color w:val="000000" w:themeColor="text1"/>
+          <w:sz w:val="20"/>
+          <w:szCs w:val="20"/>
+        </w:rPr>
+      </w:pPr>
+      <w:r>
+        <w:rPr>
+          <w:color w:val="000000" w:themeColor="text1"/>
+          <w:sz w:val="20"/>
+          <w:szCs w:val="20"/>
+        </w:rPr>
+        <w:t xml:space="preserve">The deck </w:t>
+      </w:r>
+      <w:r>
+        <w:rPr>
+          <w:color w:val="000000" w:themeColor="text1"/>
+          <w:sz w:val="20"/>
+          <w:szCs w:val="20"/>
+        </w:rPr>
+        <w:t>and</w:t>
+      </w:r>
+      <w:r>
+        <w:rPr>
+          <w:color w:val="000000" w:themeColor="text1"/>
+          <w:sz w:val="20"/>
+          <w:szCs w:val="20"/>
+        </w:rPr>
+        <w:t xml:space="preserve"> speaker </w:t>
+      </w:r>
+      <w:proofErr w:type="gramStart"/>
+      <w:r>
+        <w:rPr>
+          <w:color w:val="000000" w:themeColor="text1"/>
+          <w:sz w:val="20"/>
+          <w:szCs w:val="20"/>
+        </w:rPr>
+        <w:t>notes</w:t>
+      </w:r>
+      <w:proofErr w:type="gramEnd"/>
     </w:p>
     <w:p>
       <w:pPr>
@@ -4508,7 +4557,7 @@
 </file>
 
 <file path=word/endnotes.xml><?xml version="1.0" encoding="utf-8"?>
-<w:endnotes xmlns:wpc="http://schemas.microsoft.com/office/word/2010/wordprocessingCanvas" xmlns:cx="http://schemas.microsoft.com/office/drawing/2014/chartex" xmlns:cx1="http://schemas.microsoft.com/office/drawing/2015/9/8/chartex" xmlns:cx2="http://schemas.microsoft.com/office/drawing/2015/10/21/chartex" xmlns:cx3="http://schemas.microsoft.com/office/drawing/2016/5/9/chartex" xmlns:cx4="http://schemas.microsoft.com/office/drawing/2016/5/10/chartex" xmlns:cx5="http://schemas.microsoft.com/office/drawing/2016/5/11/chartex" xmlns:cx6="http://schemas.microsoft.com/office/drawing/2016/5/12/chartex" xmlns:cx7="http://schemas.microsoft.com/office/drawing/2016/5/13/chartex" xmlns:cx8="http://schemas.microsoft.com/office/drawing/2016/5/14/chartex" xmlns:mc="http://schemas.openxmlformats.org/markup-compatibility/2006" xmlns:m="http://schemas.openxmlformats.org/officeDocument/2006/math" xmlns:aink="http://schemas.microsoft.com/office/drawing/2016/ink" xmlns:am3d="http://schemas.microsoft.com/office/drawing/2017/model3d" xmlns:oel="http://schemas.microsoft.com/office/2019/extlst" xmlns:r="http://schemas.openxmlformats.org/officeDocument/2006/relationships" xmlns:wp14="http://schemas.microsoft.com/office/word/2010/wordprocessingDrawing" xmlns:wp="http://schemas.openxmlformats.org/drawingml/2006/wordprocessingDrawing" xmlns:wpg="http://schemas.microsoft.com/office/word/2010/wordprocessingGroup" xmlns:wpi="http://schemas.microsoft.com/office/word/2010/wordprocessingInk" xmlns:wps="http://schemas.microsoft.com/office/word/2010/wordprocessingShape" xmlns:o="urn:schemas-microsoft-com:office:office" xmlns:v="urn:schemas-microsoft-com:vml" xmlns:w10="urn:schemas-microsoft-com:office:word" xmlns:w="http://schemas.openxmlformats.org/wordprocessingml/2006/main" xmlns:w14="http://schemas.microsoft.com/office/word/2010/wordml" xmlns:w15="http://schemas.microsoft.com/office/word/2012/wordml" xmlns:w16cex="http://schemas.microsoft.com/office/word/2018/wordml/cex" xmlns:w16cid="http://schemas.microsoft.com/office/word/2016/wordml/cid" xmlns:w16="http://schemas.microsoft.com/office/word/2018/wordml" xmlns:w16sdtdh="http://schemas.microsoft.com/office/word/2020/wordml/sdtdatahash" xmlns:w16sdtfl="http://schemas.microsoft.com/office/word/2024/wordml/sdtformatlock" xmlns:w16se="http://schemas.microsoft.com/office/word/2015/wordml/symex" xmlns:w16du="http://schemas.microsoft.com/office/word/2023/wordml/word16du" xmlns:wne="http://schemas.microsoft.com/office/word/2006/wordml" mc:Ignorable="w14 w15 w16se w16cid w16 w16cex w16sdtdh w16sdtfl w16du wp14">
+<w:endnotes xmlns:wpc="http://schemas.microsoft.com/office/word/2010/wordprocessingCanvas" xmlns:cx="http://schemas.microsoft.com/office/drawing/2014/chartex" xmlns:cx1="http://schemas.microsoft.com/office/drawing/2015/9/8/chartex" xmlns:cx2="http://schemas.microsoft.com/office/drawing/2015/10/21/chartex" xmlns:cx3="http://schemas.microsoft.com/office/drawing/2016/5/9/chartex" xmlns:cx4="http://schemas.microsoft.com/office/drawing/2016/5/10/chartex" xmlns:cx5="http://schemas.microsoft.com/office/drawing/2016/5/11/chartex" xmlns:cx6="http://schemas.microsoft.com/office/drawing/2016/5/12/chartex" xmlns:cx7="http://schemas.microsoft.com/office/drawing/2016/5/13/chartex" xmlns:cx8="http://schemas.microsoft.com/office/drawing/2016/5/14/chartex" xmlns:mc="http://schemas.openxmlformats.org/markup-compatibility/2006" xmlns:m="http://schemas.openxmlformats.org/officeDocument/2006/math" xmlns:aink="http://schemas.microsoft.com/office/drawing/2016/ink" xmlns:am3d="http://schemas.microsoft.com/office/drawing/2017/model3d" xmlns:oel="http://schemas.microsoft.com/office/2019/extlst" xmlns:r="http://schemas.openxmlformats.org/officeDocument/2006/relationships" xmlns:wp14="http://schemas.microsoft.com/office/word/2010/wordprocessingDrawing" xmlns:wp="http://schemas.openxmlformats.org/drawingml/2006/wordprocessingDrawing" xmlns:wpg="http://schemas.microsoft.com/office/word/2010/wordprocessingGroup" xmlns:wpi="http://schemas.microsoft.com/office/word/2010/wordprocessingInk" xmlns:wps="http://schemas.microsoft.com/office/word/2010/wordprocessingShape" xmlns:o="urn:schemas-microsoft-com:office:office" xmlns:v="urn:schemas-microsoft-com:vml" xmlns:w10="urn:schemas-microsoft-com:office:word" xmlns:w="http://schemas.openxmlformats.org/wordprocessingml/2006/main" xmlns:w14="http://schemas.microsoft.com/office/word/2010/wordml" xmlns:w15="http://schemas.microsoft.com/office/word/2012/wordml" xmlns:w16cei="http://schemas.microsoft.com/office/word/2026/wordml/cei" xmlns:w16cex="http://schemas.microsoft.com/office/word/2018/wordml/cex" xmlns:w16cid="http://schemas.microsoft.com/office/word/2016/wordml/cid" xmlns:w16="http://schemas.microsoft.com/office/word/2018/wordml" xmlns:w16sdtdh="http://schemas.microsoft.com/office/word/2020/wordml/sdtdatahash" xmlns:w16sdtfl="http://schemas.microsoft.com/office/word/2024/wordml/sdtformatlock" xmlns:w16se="http://schemas.microsoft.com/office/word/2015/wordml/symex" xmlns:w16du="http://schemas.microsoft.com/office/word/2023/wordml/word16du" xmlns:wne="http://schemas.microsoft.com/office/word/2006/wordml" mc:Ignorable="w14 w15 w16se w16cid w16 w16cex w16sdtdh w16sdtfl w16du wp14">
   <w:endnote w:type="separator" w:id="-1">
     <w:p>
       <w:r>
@@ -4527,7 +4576,7 @@
 </file>
 
 <file path=word/footer1.xml><?xml version="1.0" encoding="utf-8"?>
-<w:ftr xmlns:wpc="http://schemas.microsoft.com/office/word/2010/wordprocessingCanvas" xmlns:cx="http://schemas.microsoft.com/office/drawing/2014/chartex" xmlns:cx1="http://schemas.microsoft.com/office/drawing/2015/9/8/chartex" xmlns:cx2="http://schemas.microsoft.com/office/drawing/2015/10/21/chartex" xmlns:cx3="http://schemas.microsoft.com/office/drawing/2016/5/9/chartex" xmlns:cx4="http://schemas.microsoft.com/office/drawing/2016/5/10/chartex" xmlns:cx5="http://schemas.microsoft.com/office/drawing/2016/5/11/chartex" xmlns:cx6="http://schemas.microsoft.com/office/drawing/2016/5/12/chartex" xmlns:cx7="http://schemas.microsoft.com/office/drawing/2016/5/13/chartex" xmlns:cx8="http://schemas.microsoft.com/office/drawing/2016/5/14/chartex" xmlns:mc="http://schemas.openxmlformats.org/markup-compatibility/2006" xmlns:m="http://schemas.openxmlformats.org/officeDocument/2006/math" xmlns:aink="http://schemas.microsoft.com/office/drawing/2016/ink" xmlns:am3d="http://schemas.microsoft.com/office/drawing/2017/model3d" xmlns:oel="http://schemas.microsoft.com/office/2019/extlst" xmlns:r="http://schemas.openxmlformats.org/officeDocument/2006/relationships" xmlns:wp14="http://schemas.microsoft.com/office/word/2010/wordprocessingDrawing" xmlns:wp="http://schemas.openxmlformats.org/drawingml/2006/wordprocessingDrawing" xmlns:wpg="http://schemas.microsoft.com/office/word/2010/wordprocessingGroup" xmlns:wpi="http://schemas.microsoft.com/office/word/2010/wordprocessingInk" xmlns:wps="http://schemas.microsoft.com/office/word/2010/wordprocessingShape" xmlns:o="urn:schemas-microsoft-com:office:office" xmlns:v="urn:schemas-microsoft-com:vml" xmlns:w10="urn:schemas-microsoft-com:office:word" xmlns:w="http://schemas.openxmlformats.org/wordprocessingml/2006/main" xmlns:w14="http://schemas.microsoft.com/office/word/2010/wordml" xmlns:w15="http://schemas.microsoft.com/office/word/2012/wordml" xmlns:w16cex="http://schemas.microsoft.com/office/word/2018/wordml/cex" xmlns:w16cid="http://schemas.microsoft.com/office/word/2016/wordml/cid" xmlns:w16="http://schemas.microsoft.com/office/word/2018/wordml" xmlns:w16sdtdh="http://schemas.microsoft.com/office/word/2020/wordml/sdtdatahash" xmlns:w16sdtfl="http://schemas.microsoft.com/office/word/2024/wordml/sdtformatlock" xmlns:w16se="http://schemas.microsoft.com/office/word/2015/wordml/symex" xmlns:w16du="http://schemas.microsoft.com/office/word/2023/wordml/word16du" xmlns:wne="http://schemas.microsoft.com/office/word/2006/wordml" mc:Ignorable="w14 w15 w16se w16cid w16 w16cex w16sdtdh w16sdtfl w16du wp14">
+<w:ftr xmlns:wpc="http://schemas.microsoft.com/office/word/2010/wordprocessingCanvas" xmlns:cx="http://schemas.microsoft.com/office/drawing/2014/chartex" xmlns:cx1="http://schemas.microsoft.com/office/drawing/2015/9/8/chartex" xmlns:cx2="http://schemas.microsoft.com/office/drawing/2015/10/21/chartex" xmlns:cx3="http://schemas.microsoft.com/office/drawing/2016/5/9/chartex" xmlns:cx4="http://schemas.microsoft.com/office/drawing/2016/5/10/chartex" xmlns:cx5="http://schemas.microsoft.com/office/drawing/2016/5/11/chartex" xmlns:cx6="http://schemas.microsoft.com/office/drawing/2016/5/12/chartex" xmlns:cx7="http://schemas.microsoft.com/office/drawing/2016/5/13/chartex" xmlns:cx8="http://schemas.microsoft.com/office/drawing/2016/5/14/chartex" xmlns:mc="http://schemas.openxmlformats.org/markup-compatibility/2006" xmlns:m="http://schemas.openxmlformats.org/officeDocument/2006/math" xmlns:aink="http://schemas.microsoft.com/office/drawing/2016/ink" xmlns:am3d="http://schemas.microsoft.com/office/drawing/2017/model3d" xmlns:oel="http://schemas.microsoft.com/office/2019/extlst" xmlns:r="http://schemas.openxmlformats.org/officeDocument/2006/relationships" xmlns:wp14="http://schemas.microsoft.com/office/word/2010/wordprocessingDrawing" xmlns:wp="http://schemas.openxmlformats.org/drawingml/2006/wordprocessingDrawing" xmlns:wpg="http://schemas.microsoft.com/office/word/2010/wordprocessingGroup" xmlns:wpi="http://schemas.microsoft.com/office/word/2010/wordprocessingInk" xmlns:wps="http://schemas.microsoft.com/office/word/2010/wordprocessingShape" xmlns:o="urn:schemas-microsoft-com:office:office" xmlns:v="urn:schemas-microsoft-com:vml" xmlns:w10="urn:schemas-microsoft-com:office:word" xmlns:w="http://schemas.openxmlformats.org/wordprocessingml/2006/main" xmlns:w14="http://schemas.microsoft.com/office/word/2010/wordml" xmlns:w15="http://schemas.microsoft.com/office/word/2012/wordml" xmlns:w16cei="http://schemas.microsoft.com/office/word/2026/wordml/cei" xmlns:w16cex="http://schemas.microsoft.com/office/word/2018/wordml/cex" xmlns:w16cid="http://schemas.microsoft.com/office/word/2016/wordml/cid" xmlns:w16="http://schemas.microsoft.com/office/word/2018/wordml" xmlns:w16sdtdh="http://schemas.microsoft.com/office/word/2020/wordml/sdtdatahash" xmlns:w16sdtfl="http://schemas.microsoft.com/office/word/2024/wordml/sdtformatlock" xmlns:w16se="http://schemas.microsoft.com/office/word/2015/wordml/symex" xmlns:w16du="http://schemas.microsoft.com/office/word/2023/wordml/word16du" xmlns:wne="http://schemas.microsoft.com/office/word/2006/wordml" mc:Ignorable="w14 w15 w16se w16cid w16 w16cex w16sdtdh w16sdtfl w16du wp14">
   <w:p>
     <w:pPr>
       <w:pStyle w:val="Footer"/>
@@ -4634,7 +4683,7 @@
 </file>
 
 <file path=word/footnotes.xml><?xml version="1.0" encoding="utf-8"?>
-<w:footnotes xmlns:wpc="http://schemas.microsoft.com/office/word/2010/wordprocessingCanvas" xmlns:cx="http://schemas.microsoft.com/office/drawing/2014/chartex" xmlns:cx1="http://schemas.microsoft.com/office/drawing/2015/9/8/chartex" xmlns:cx2="http://schemas.microsoft.com/office/drawing/2015/10/21/chartex" xmlns:cx3="http://schemas.microsoft.com/office/drawing/2016/5/9/chartex" xmlns:cx4="http://schemas.microsoft.com/office/drawing/2016/5/10/chartex" xmlns:cx5="http://schemas.microsoft.com/office/drawing/2016/5/11/chartex" xmlns:cx6="http://schemas.microsoft.com/office/drawing/2016/5/12/chartex" xmlns:cx7="http://schemas.microsoft.com/office/drawing/2016/5/13/chartex" xmlns:cx8="http://schemas.microsoft.com/office/drawing/2016/5/14/chartex" xmlns:mc="http://schemas.openxmlformats.org/markup-compatibility/2006" xmlns:m="http://schemas.openxmlformats.org/officeDocument/2006/math" xmlns:aink="http://schemas.microsoft.com/office/drawing/2016/ink" xmlns:am3d="http://schemas.microsoft.com/office/drawing/2017/model3d" xmlns:oel="http://schemas.microsoft.com/office/2019/extlst" xmlns:r="http://schemas.openxmlformats.org/officeDocument/2006/relationships" xmlns:wp14="http://schemas.microsoft.com/office/word/2010/wordprocessingDrawing" xmlns:wp="http://schemas.openxmlformats.org/drawingml/2006/wordprocessingDrawing" xmlns:wpg="http://schemas.microsoft.com/office/word/2010/wordprocessingGroup" xmlns:wpi="http://schemas.microsoft.com/office/word/2010/wordprocessingInk" xmlns:wps="http://schemas.microsoft.com/office/word/2010/wordprocessingShape" xmlns:o="urn:schemas-microsoft-com:office:office" xmlns:v="urn:schemas-microsoft-com:vml" xmlns:w10="urn:schemas-microsoft-com:office:word" xmlns:w="http://schemas.openxmlformats.org/wordprocessingml/2006/main" xmlns:w14="http://schemas.microsoft.com/office/word/2010/wordml" xmlns:w15="http://schemas.microsoft.com/office/word/2012/wordml" xmlns:w16cex="http://schemas.microsoft.com/office/word/2018/wordml/cex" xmlns:w16cid="http://schemas.microsoft.com/office/word/2016/wordml/cid" xmlns:w16="http://schemas.microsoft.com/office/word/2018/wordml" xmlns:w16sdtdh="http://schemas.microsoft.com/office/word/2020/wordml/sdtdatahash" xmlns:w16sdtfl="http://schemas.microsoft.com/office/word/2024/wordml/sdtformatlock" xmlns:w16se="http://schemas.microsoft.com/office/word/2015/wordml/symex" xmlns:w16du="http://schemas.microsoft.com/office/word/2023/wordml/word16du" xmlns:wne="http://schemas.microsoft.com/office/word/2006/wordml" mc:Ignorable="w14 w15 w16se w16cid w16 w16cex w16sdtdh w16sdtfl w16du wp14">
+<w:footnotes xmlns:wpc="http://schemas.microsoft.com/office/word/2010/wordprocessingCanvas" xmlns:cx="http://schemas.microsoft.com/office/drawing/2014/chartex" xmlns:cx1="http://schemas.microsoft.com/office/drawing/2015/9/8/chartex" xmlns:cx2="http://schemas.microsoft.com/office/drawing/2015/10/21/chartex" xmlns:cx3="http://schemas.microsoft.com/office/drawing/2016/5/9/chartex" xmlns:cx4="http://schemas.microsoft.com/office/drawing/2016/5/10/chartex" xmlns:cx5="http://schemas.microsoft.com/office/drawing/2016/5/11/chartex" xmlns:cx6="http://schemas.microsoft.com/office/drawing/2016/5/12/chartex" xmlns:cx7="http://schemas.microsoft.com/office/drawing/2016/5/13/chartex" xmlns:cx8="http://schemas.microsoft.com/office/drawing/2016/5/14/chartex" xmlns:mc="http://schemas.openxmlformats.org/markup-compatibility/2006" xmlns:m="http://schemas.openxmlformats.org/officeDocument/2006/math" xmlns:aink="http://schemas.microsoft.com/office/drawing/2016/ink" xmlns:am3d="http://schemas.microsoft.com/office/drawing/2017/model3d" xmlns:oel="http://schemas.microsoft.com/office/2019/extlst" xmlns:r="http://schemas.openxmlformats.org/officeDocument/2006/relationships" xmlns:wp14="http://schemas.microsoft.com/office/word/2010/wordprocessingDrawing" xmlns:wp="http://schemas.openxmlformats.org/drawingml/2006/wordprocessingDrawing" xmlns:wpg="http://schemas.microsoft.com/office/word/2010/wordprocessingGroup" xmlns:wpi="http://schemas.microsoft.com/office/word/2010/wordprocessingInk" xmlns:wps="http://schemas.microsoft.com/office/word/2010/wordprocessingShape" xmlns:o="urn:schemas-microsoft-com:office:office" xmlns:v="urn:schemas-microsoft-com:vml" xmlns:w10="urn:schemas-microsoft-com:office:word" xmlns:w="http://schemas.openxmlformats.org/wordprocessingml/2006/main" xmlns:w14="http://schemas.microsoft.com/office/word/2010/wordml" xmlns:w15="http://schemas.microsoft.com/office/word/2012/wordml" xmlns:w16cei="http://schemas.microsoft.com/office/word/2026/wordml/cei" xmlns:w16cex="http://schemas.microsoft.com/office/word/2018/wordml/cex" xmlns:w16cid="http://schemas.microsoft.com/office/word/2016/wordml/cid" xmlns:w16="http://schemas.microsoft.com/office/word/2018/wordml" xmlns:w16sdtdh="http://schemas.microsoft.com/office/word/2020/wordml/sdtdatahash" xmlns:w16sdtfl="http://schemas.microsoft.com/office/word/2024/wordml/sdtformatlock" xmlns:w16se="http://schemas.microsoft.com/office/word/2015/wordml/symex" xmlns:w16du="http://schemas.microsoft.com/office/word/2023/wordml/word16du" xmlns:wne="http://schemas.microsoft.com/office/word/2006/wordml" mc:Ignorable="w14 w15 w16se w16cid w16 w16cex w16sdtdh w16sdtfl w16du wp14">
   <w:footnote w:type="separator" w:id="-1">
     <w:p>
       <w:r>
@@ -4653,7 +4702,7 @@
 </file>
 
 <file path=word/header1.xml><?xml version="1.0" encoding="utf-8"?>
-<w:hdr xmlns:wpc="http://schemas.microsoft.com/office/word/2010/wordprocessingCanvas" xmlns:cx="http://schemas.microsoft.com/office/drawing/2014/chartex" xmlns:cx1="http://schemas.microsoft.com/office/drawing/2015/9/8/chartex" xmlns:cx2="http://schemas.microsoft.com/office/drawing/2015/10/21/chartex" xmlns:cx3="http://schemas.microsoft.com/office/drawing/2016/5/9/chartex" xmlns:cx4="http://schemas.microsoft.com/office/drawing/2016/5/10/chartex" xmlns:cx5="http://schemas.microsoft.com/office/drawing/2016/5/11/chartex" xmlns:cx6="http://schemas.microsoft.com/office/drawing/2016/5/12/chartex" xmlns:cx7="http://schemas.microsoft.com/office/drawing/2016/5/13/chartex" xmlns:cx8="http://schemas.microsoft.com/office/drawing/2016/5/14/chartex" xmlns:mc="http://schemas.openxmlformats.org/markup-compatibility/2006" xmlns:m="http://schemas.openxmlformats.org/officeDocument/2006/math" xmlns:aink="http://schemas.microsoft.com/office/drawing/2016/ink" xmlns:am3d="http://schemas.microsoft.com/office/drawing/2017/model3d" xmlns:oel="http://schemas.microsoft.com/office/2019/extlst" xmlns:r="http://schemas.openxmlformats.org/officeDocument/2006/relationships" xmlns:wp14="http://schemas.microsoft.com/office/word/2010/wordprocessingDrawing" xmlns:wp="http://schemas.openxmlformats.org/drawingml/2006/wordprocessingDrawing" xmlns:wpg="http://schemas.microsoft.com/office/word/2010/wordprocessingGroup" xmlns:wpi="http://schemas.microsoft.com/office/word/2010/wordprocessingInk" xmlns:wps="http://schemas.microsoft.com/office/word/2010/wordprocessingShape" xmlns:o="urn:schemas-microsoft-com:office:office" xmlns:v="urn:schemas-microsoft-com:vml" xmlns:w10="urn:schemas-microsoft-com:office:word" xmlns:w="http://schemas.openxmlformats.org/wordprocessingml/2006/main" xmlns:w14="http://schemas.microsoft.com/office/word/2010/wordml" xmlns:w15="http://schemas.microsoft.com/office/word/2012/wordml" xmlns:w16cex="http://schemas.microsoft.com/office/word/2018/wordml/cex" xmlns:w16cid="http://schemas.microsoft.com/office/word/2016/wordml/cid" xmlns:w16="http://schemas.microsoft.com/office/word/2018/wordml" xmlns:w16sdtdh="http://schemas.microsoft.com/office/word/2020/wordml/sdtdatahash" xmlns:w16sdtfl="http://schemas.microsoft.com/office/word/2024/wordml/sdtformatlock" xmlns:w16se="http://schemas.microsoft.com/office/word/2015/wordml/symex" xmlns:w16du="http://schemas.microsoft.com/office/word/2023/wordml/word16du" xmlns:wne="http://schemas.microsoft.com/office/word/2006/wordml" mc:Ignorable="w14 w15 w16se w16cid w16 w16cex w16sdtdh w16sdtfl w16du wp14">
+<w:hdr xmlns:wpc="http://schemas.microsoft.com/office/word/2010/wordprocessingCanvas" xmlns:cx="http://schemas.microsoft.com/office/drawing/2014/chartex" xmlns:cx1="http://schemas.microsoft.com/office/drawing/2015/9/8/chartex" xmlns:cx2="http://schemas.microsoft.com/office/drawing/2015/10/21/chartex" xmlns:cx3="http://schemas.microsoft.com/office/drawing/2016/5/9/chartex" xmlns:cx4="http://schemas.microsoft.com/office/drawing/2016/5/10/chartex" xmlns:cx5="http://schemas.microsoft.com/office/drawing/2016/5/11/chartex" xmlns:cx6="http://schemas.microsoft.com/office/drawing/2016/5/12/chartex" xmlns:cx7="http://schemas.microsoft.com/office/drawing/2016/5/13/chartex" xmlns:cx8="http://schemas.microsoft.com/office/drawing/2016/5/14/chartex" xmlns:mc="http://schemas.openxmlformats.org/markup-compatibility/2006" xmlns:m="http://schemas.openxmlformats.org/officeDocument/2006/math" xmlns:aink="http://schemas.microsoft.com/office/drawing/2016/ink" xmlns:am3d="http://schemas.microsoft.com/office/drawing/2017/model3d" xmlns:oel="http://schemas.microsoft.com/office/2019/extlst" xmlns:r="http://schemas.openxmlformats.org/officeDocument/2006/relationships" xmlns:wp14="http://schemas.microsoft.com/office/word/2010/wordprocessingDrawing" xmlns:wp="http://schemas.openxmlformats.org/drawingml/2006/wordprocessingDrawing" xmlns:wpg="http://schemas.microsoft.com/office/word/2010/wordprocessingGroup" xmlns:wpi="http://schemas.microsoft.com/office/word/2010/wordprocessingInk" xmlns:wps="http://schemas.microsoft.com/office/word/2010/wordprocessingShape" xmlns:o="urn:schemas-microsoft-com:office:office" xmlns:v="urn:schemas-microsoft-com:vml" xmlns:w10="urn:schemas-microsoft-com:office:word" xmlns:w="http://schemas.openxmlformats.org/wordprocessingml/2006/main" xmlns:w14="http://schemas.microsoft.com/office/word/2010/wordml" xmlns:w15="http://schemas.microsoft.com/office/word/2012/wordml" xmlns:w16cei="http://schemas.microsoft.com/office/word/2026/wordml/cei" xmlns:w16cex="http://schemas.microsoft.com/office/word/2018/wordml/cex" xmlns:w16cid="http://schemas.microsoft.com/office/word/2016/wordml/cid" xmlns:w16="http://schemas.microsoft.com/office/word/2018/wordml" xmlns:w16sdtdh="http://schemas.microsoft.com/office/word/2020/wordml/sdtdatahash" xmlns:w16sdtfl="http://schemas.microsoft.com/office/word/2024/wordml/sdtformatlock" xmlns:w16se="http://schemas.microsoft.com/office/word/2015/wordml/symex" xmlns:w16du="http://schemas.microsoft.com/office/word/2023/wordml/word16du" xmlns:wne="http://schemas.microsoft.com/office/word/2006/wordml" mc:Ignorable="w14 w15 w16se w16cid w16 w16cex w16sdtdh w16sdtfl w16du wp14">
   <w:p>
     <w:pPr>
       <w:pStyle w:val="Header"/>
@@ -4781,7 +4830,7 @@
 </file>
 
 <file path=word/header2.xml><?xml version="1.0" encoding="utf-8"?>
-<w:hdr xmlns:wpc="http://schemas.microsoft.com/office/word/2010/wordprocessingCanvas" xmlns:cx="http://schemas.microsoft.com/office/drawing/2014/chartex" xmlns:cx1="http://schemas.microsoft.com/office/drawing/2015/9/8/chartex" xmlns:cx2="http://schemas.microsoft.com/office/drawing/2015/10/21/chartex" xmlns:cx3="http://schemas.microsoft.com/office/drawing/2016/5/9/chartex" xmlns:cx4="http://schemas.microsoft.com/office/drawing/2016/5/10/chartex" xmlns:cx5="http://schemas.microsoft.com/office/drawing/2016/5/11/chartex" xmlns:cx6="http://schemas.microsoft.com/office/drawing/2016/5/12/chartex" xmlns:cx7="http://schemas.microsoft.com/office/drawing/2016/5/13/chartex" xmlns:cx8="http://schemas.microsoft.com/office/drawing/2016/5/14/chartex" xmlns:mc="http://schemas.openxmlformats.org/markup-compatibility/2006" xmlns:m="http://schemas.openxmlformats.org/officeDocument/2006/math" xmlns:aink="http://schemas.microsoft.com/office/drawing/2016/ink" xmlns:am3d="http://schemas.microsoft.com/office/drawing/2017/model3d" xmlns:oel="http://schemas.microsoft.com/office/2019/extlst" xmlns:r="http://schemas.openxmlformats.org/officeDocument/2006/relationships" xmlns:wp14="http://schemas.microsoft.com/office/word/2010/wordprocessingDrawing" xmlns:wp="http://schemas.openxmlformats.org/drawingml/2006/wordprocessingDrawing" xmlns:wpg="http://schemas.microsoft.com/office/word/2010/wordprocessingGroup" xmlns:wpi="http://schemas.microsoft.com/office/word/2010/wordprocessingInk" xmlns:wps="http://schemas.microsoft.com/office/word/2010/wordprocessingShape" xmlns:o="urn:schemas-microsoft-com:office:office" xmlns:v="urn:schemas-microsoft-com:vml" xmlns:w10="urn:schemas-microsoft-com:office:word" xmlns:w="http://schemas.openxmlformats.org/wordprocessingml/2006/main" xmlns:w14="http://schemas.microsoft.com/office/word/2010/wordml" xmlns:w15="http://schemas.microsoft.com/office/word/2012/wordml" xmlns:w16cex="http://schemas.microsoft.com/office/word/2018/wordml/cex" xmlns:w16cid="http://schemas.microsoft.com/office/word/2016/wordml/cid" xmlns:w16="http://schemas.microsoft.com/office/word/2018/wordml" xmlns:w16sdtdh="http://schemas.microsoft.com/office/word/2020/wordml/sdtdatahash" xmlns:w16sdtfl="http://schemas.microsoft.com/office/word/2024/wordml/sdtformatlock" xmlns:w16se="http://schemas.microsoft.com/office/word/2015/wordml/symex" xmlns:w16du="http://schemas.microsoft.com/office/word/2023/wordml/word16du" xmlns:wne="http://schemas.microsoft.com/office/word/2006/wordml" mc:Ignorable="w14 w15 w16se w16cid w16 w16cex w16sdtdh w16sdtfl w16du wp14">
+<w:hdr xmlns:wpc="http://schemas.microsoft.com/office/word/2010/wordprocessingCanvas" xmlns:cx="http://schemas.microsoft.com/office/drawing/2014/chartex" xmlns:cx1="http://schemas.microsoft.com/office/drawing/2015/9/8/chartex" xmlns:cx2="http://schemas.microsoft.com/office/drawing/2015/10/21/chartex" xmlns:cx3="http://schemas.microsoft.com/office/drawing/2016/5/9/chartex" xmlns:cx4="http://schemas.microsoft.com/office/drawing/2016/5/10/chartex" xmlns:cx5="http://schemas.microsoft.com/office/drawing/2016/5/11/chartex" xmlns:cx6="http://schemas.microsoft.com/office/drawing/2016/5/12/chartex" xmlns:cx7="http://schemas.microsoft.com/office/drawing/2016/5/13/chartex" xmlns:cx8="http://schemas.microsoft.com/office/drawing/2016/5/14/chartex" xmlns:mc="http://schemas.openxmlformats.org/markup-compatibility/2006" xmlns:m="http://schemas.openxmlformats.org/officeDocument/2006/math" xmlns:aink="http://schemas.microsoft.com/office/drawing/2016/ink" xmlns:am3d="http://schemas.microsoft.com/office/drawing/2017/model3d" xmlns:oel="http://schemas.microsoft.com/office/2019/extlst" xmlns:r="http://schemas.openxmlformats.org/officeDocument/2006/relationships" xmlns:wp14="http://schemas.microsoft.com/office/word/2010/wordprocessingDrawing" xmlns:wp="http://schemas.openxmlformats.org/drawingml/2006/wordprocessingDrawing" xmlns:wpg="http://schemas.microsoft.com/office/word/2010/wordprocessingGroup" xmlns:wpi="http://schemas.microsoft.com/office/word/2010/wordprocessingInk" xmlns:wps="http://schemas.microsoft.com/office/word/2010/wordprocessingShape" xmlns:o="urn:schemas-microsoft-com:office:office" xmlns:v="urn:schemas-microsoft-com:vml" xmlns:w10="urn:schemas-microsoft-com:office:word" xmlns:w="http://schemas.openxmlformats.org/wordprocessingml/2006/main" xmlns:w14="http://schemas.microsoft.com/office/word/2010/wordml" xmlns:w15="http://schemas.microsoft.com/office/word/2012/wordml" xmlns:w16cei="http://schemas.microsoft.com/office/word/2026/wordml/cei" xmlns:w16cex="http://schemas.microsoft.com/office/word/2018/wordml/cex" xmlns:w16cid="http://schemas.microsoft.com/office/word/2016/wordml/cid" xmlns:w16="http://schemas.microsoft.com/office/word/2018/wordml" xmlns:w16sdtdh="http://schemas.microsoft.com/office/word/2020/wordml/sdtdatahash" xmlns:w16sdtfl="http://schemas.microsoft.com/office/word/2024/wordml/sdtformatlock" xmlns:w16se="http://schemas.microsoft.com/office/word/2015/wordml/symex" xmlns:w16du="http://schemas.microsoft.com/office/word/2023/wordml/word16du" xmlns:wne="http://schemas.microsoft.com/office/word/2006/wordml" mc:Ignorable="w14 w15 w16se w16cid w16 w16cex w16sdtdh w16sdtfl w16du wp14">
   <w:p>
     <w:pPr>
       <w:pStyle w:val="Header"/>
@@ -4909,7 +4958,7 @@
 </file>
 
 <file path=word/header3.xml><?xml version="1.0" encoding="utf-8"?>
-<w:hdr xmlns:wpc="http://schemas.microsoft.com/office/word/2010/wordprocessingCanvas" xmlns:cx="http://schemas.microsoft.com/office/drawing/2014/chartex" xmlns:cx1="http://schemas.microsoft.com/office/drawing/2015/9/8/chartex" xmlns:cx2="http://schemas.microsoft.com/office/drawing/2015/10/21/chartex" xmlns:cx3="http://schemas.microsoft.com/office/drawing/2016/5/9/chartex" xmlns:cx4="http://schemas.microsoft.com/office/drawing/2016/5/10/chartex" xmlns:cx5="http://schemas.microsoft.com/office/drawing/2016/5/11/chartex" xmlns:cx6="http://schemas.microsoft.com/office/drawing/2016/5/12/chartex" xmlns:cx7="http://schemas.microsoft.com/office/drawing/2016/5/13/chartex" xmlns:cx8="http://schemas.microsoft.com/office/drawing/2016/5/14/chartex" xmlns:mc="http://schemas.openxmlformats.org/markup-compatibility/2006" xmlns:m="http://schemas.openxmlformats.org/officeDocument/2006/math" xmlns:aink="http://schemas.microsoft.com/office/drawing/2016/ink" xmlns:am3d="http://schemas.microsoft.com/office/drawing/2017/model3d" xmlns:oel="http://schemas.microsoft.com/office/2019/extlst" xmlns:r="http://schemas.openxmlformats.org/officeDocument/2006/relationships" xmlns:wp14="http://schemas.microsoft.com/office/word/2010/wordprocessingDrawing" xmlns:wp="http://schemas.openxmlformats.org/drawingml/2006/wordprocessingDrawing" xmlns:wpg="http://schemas.microsoft.com/office/word/2010/wordprocessingGroup" xmlns:wpi="http://schemas.microsoft.com/office/word/2010/wordprocessingInk" xmlns:wps="http://schemas.microsoft.com/office/word/2010/wordprocessingShape" xmlns:o="urn:schemas-microsoft-com:office:office" xmlns:v="urn:schemas-microsoft-com:vml" xmlns:w10="urn:schemas-microsoft-com:office:word" xmlns:w="http://schemas.openxmlformats.org/wordprocessingml/2006/main" xmlns:w14="http://schemas.microsoft.com/office/word/2010/wordml" xmlns:w15="http://schemas.microsoft.com/office/word/2012/wordml" xmlns:w16cex="http://schemas.microsoft.com/office/word/2018/wordml/cex" xmlns:w16cid="http://schemas.microsoft.com/office/word/2016/wordml/cid" xmlns:w16="http://schemas.microsoft.com/office/word/2018/wordml" xmlns:w16sdtdh="http://schemas.microsoft.com/office/word/2020/wordml/sdtdatahash" xmlns:w16sdtfl="http://schemas.microsoft.com/office/word/2024/wordml/sdtformatlock" xmlns:w16se="http://schemas.microsoft.com/office/word/2015/wordml/symex" xmlns:w16du="http://schemas.microsoft.com/office/word/2023/wordml/word16du" xmlns:wne="http://schemas.microsoft.com/office/word/2006/wordml" mc:Ignorable="w14 w15 w16se w16cid w16 w16cex w16sdtdh w16sdtfl w16du wp14">
+<w:hdr xmlns:wpc="http://schemas.microsoft.com/office/word/2010/wordprocessingCanvas" xmlns:cx="http://schemas.microsoft.com/office/drawing/2014/chartex" xmlns:cx1="http://schemas.microsoft.com/office/drawing/2015/9/8/chartex" xmlns:cx2="http://schemas.microsoft.com/office/drawing/2015/10/21/chartex" xmlns:cx3="http://schemas.microsoft.com/office/drawing/2016/5/9/chartex" xmlns:cx4="http://schemas.microsoft.com/office/drawing/2016/5/10/chartex" xmlns:cx5="http://schemas.microsoft.com/office/drawing/2016/5/11/chartex" xmlns:cx6="http://schemas.microsoft.com/office/drawing/2016/5/12/chartex" xmlns:cx7="http://schemas.microsoft.com/office/drawing/2016/5/13/chartex" xmlns:cx8="http://schemas.microsoft.com/office/drawing/2016/5/14/chartex" xmlns:mc="http://schemas.openxmlformats.org/markup-compatibility/2006" xmlns:m="http://schemas.openxmlformats.org/officeDocument/2006/math" xmlns:aink="http://schemas.microsoft.com/office/drawing/2016/ink" xmlns:am3d="http://schemas.microsoft.com/office/drawing/2017/model3d" xmlns:oel="http://schemas.microsoft.com/office/2019/extlst" xmlns:r="http://schemas.openxmlformats.org/officeDocument/2006/relationships" xmlns:wp14="http://schemas.microsoft.com/office/word/2010/wordprocessingDrawing" xmlns:wp="http://schemas.openxmlformats.org/drawingml/2006/wordprocessingDrawing" xmlns:wpg="http://schemas.microsoft.com/office/word/2010/wordprocessingGroup" xmlns:wpi="http://schemas.microsoft.com/office/word/2010/wordprocessingInk" xmlns:wps="http://schemas.microsoft.com/office/word/2010/wordprocessingShape" xmlns:o="urn:schemas-microsoft-com:office:office" xmlns:v="urn:schemas-microsoft-com:vml" xmlns:w10="urn:schemas-microsoft-com:office:word" xmlns:w="http://schemas.openxmlformats.org/wordprocessingml/2006/main" xmlns:w14="http://schemas.microsoft.com/office/word/2010/wordml" xmlns:w15="http://schemas.microsoft.com/office/word/2012/wordml" xmlns:w16cei="http://schemas.microsoft.com/office/word/2026/wordml/cei" xmlns:w16cex="http://schemas.microsoft.com/office/word/2018/wordml/cex" xmlns:w16cid="http://schemas.microsoft.com/office/word/2016/wordml/cid" xmlns:w16="http://schemas.microsoft.com/office/word/2018/wordml" xmlns:w16sdtdh="http://schemas.microsoft.com/office/word/2020/wordml/sdtdatahash" xmlns:w16sdtfl="http://schemas.microsoft.com/office/word/2024/wordml/sdtformatlock" xmlns:w16se="http://schemas.microsoft.com/office/word/2015/wordml/symex" xmlns:w16du="http://schemas.microsoft.com/office/word/2023/wordml/word16du" xmlns:wne="http://schemas.microsoft.com/office/word/2006/wordml" mc:Ignorable="w14 w15 w16se w16cid w16 w16cex w16sdtdh w16sdtfl w16du wp14">
   <w:p>
     <w:pPr>
       <w:pStyle w:val="Header"/>
@@ -5037,7 +5086,7 @@
 </file>
 
 <file path=word/numbering.xml><?xml version="1.0" encoding="utf-8"?>
-<w:numbering xmlns:wpc="http://schemas.microsoft.com/office/word/2010/wordprocessingCanvas" xmlns:cx="http://schemas.microsoft.com/office/drawing/2014/chartex" xmlns:cx1="http://schemas.microsoft.com/office/drawing/2015/9/8/chartex" xmlns:cx2="http://schemas.microsoft.com/office/drawing/2015/10/21/chartex" xmlns:cx3="http://schemas.microsoft.com/office/drawing/2016/5/9/chartex" xmlns:cx4="http://schemas.microsoft.com/office/drawing/2016/5/10/chartex" xmlns:cx5="http://schemas.microsoft.com/office/drawing/2016/5/11/chartex" xmlns:cx6="http://schemas.microsoft.com/office/drawing/2016/5/12/chartex" xmlns:cx7="http://schemas.microsoft.com/office/drawing/2016/5/13/chartex" xmlns:cx8="http://schemas.microsoft.com/office/drawing/2016/5/14/chartex" xmlns:mc="http://schemas.openxmlformats.org/markup-compatibility/2006" xmlns:m="http://schemas.openxmlformats.org/officeDocument/2006/math" xmlns:aink="http://schemas.microsoft.com/office/drawing/2016/ink" xmlns:am3d="http://schemas.microsoft.com/office/drawing/2017/model3d" xmlns:oel="http://schemas.microsoft.com/office/2019/extlst" xmlns:r="http://schemas.openxmlformats.org/officeDocument/2006/relationships" xmlns:wp14="http://schemas.microsoft.com/office/word/2010/wordprocessingDrawing" xmlns:wp="http://schemas.openxmlformats.org/drawingml/2006/wordprocessingDrawing" xmlns:wpg="http://schemas.microsoft.com/office/word/2010/wordprocessingGroup" xmlns:wpi="http://schemas.microsoft.com/office/word/2010/wordprocessingInk" xmlns:wps="http://schemas.microsoft.com/office/word/2010/wordprocessingShape" xmlns:o="urn:schemas-microsoft-com:office:office" xmlns:v="urn:schemas-microsoft-com:vml" xmlns:w10="urn:schemas-microsoft-com:office:word" xmlns:w="http://schemas.openxmlformats.org/wordprocessingml/2006/main" xmlns:w14="http://schemas.microsoft.com/office/word/2010/wordml" xmlns:w15="http://schemas.microsoft.com/office/word/2012/wordml" xmlns:w16cex="http://schemas.microsoft.com/office/word/2018/wordml/cex" xmlns:w16cid="http://schemas.microsoft.com/office/word/2016/wordml/cid" xmlns:w16="http://schemas.microsoft.com/office/word/2018/wordml" xmlns:w16sdtdh="http://schemas.microsoft.com/office/word/2020/wordml/sdtdatahash" xmlns:w16sdtfl="http://schemas.microsoft.com/office/word/2024/wordml/sdtformatlock" xmlns:w16se="http://schemas.microsoft.com/office/word/2015/wordml/symex" xmlns:w16du="http://schemas.microsoft.com/office/word/2023/wordml/word16du" xmlns:wne="http://schemas.microsoft.com/office/word/2006/wordml" mc:Ignorable="w14 w15 w16se w16cid w16 w16cex w16sdtdh w16sdtfl w16du wp14">
+<w:numbering xmlns:wpc="http://schemas.microsoft.com/office/word/2010/wordprocessingCanvas" xmlns:cx="http://schemas.microsoft.com/office/drawing/2014/chartex" xmlns:cx1="http://schemas.microsoft.com/office/drawing/2015/9/8/chartex" xmlns:cx2="http://schemas.microsoft.com/office/drawing/2015/10/21/chartex" xmlns:cx3="http://schemas.microsoft.com/office/drawing/2016/5/9/chartex" xmlns:cx4="http://schemas.microsoft.com/office/drawing/2016/5/10/chartex" xmlns:cx5="http://schemas.microsoft.com/office/drawing/2016/5/11/chartex" xmlns:cx6="http://schemas.microsoft.com/office/drawing/2016/5/12/chartex" xmlns:cx7="http://schemas.microsoft.com/office/drawing/2016/5/13/chartex" xmlns:cx8="http://schemas.microsoft.com/office/drawing/2016/5/14/chartex" xmlns:mc="http://schemas.openxmlformats.org/markup-compatibility/2006" xmlns:m="http://schemas.openxmlformats.org/officeDocument/2006/math" xmlns:aink="http://schemas.microsoft.com/office/drawing/2016/ink" xmlns:am3d="http://schemas.microsoft.com/office/drawing/2017/model3d" xmlns:oel="http://schemas.microsoft.com/office/2019/extlst" xmlns:r="http://schemas.openxmlformats.org/officeDocument/2006/relationships" xmlns:wp14="http://schemas.microsoft.com/office/word/2010/wordprocessingDrawing" xmlns:wp="http://schemas.openxmlformats.org/drawingml/2006/wordprocessingDrawing" xmlns:wpg="http://schemas.microsoft.com/office/word/2010/wordprocessingGroup" xmlns:wpi="http://schemas.microsoft.com/office/word/2010/wordprocessingInk" xmlns:wps="http://schemas.microsoft.com/office/word/2010/wordprocessingShape" xmlns:o="urn:schemas-microsoft-com:office:office" xmlns:v="urn:schemas-microsoft-com:vml" xmlns:w10="urn:schemas-microsoft-com:office:word" xmlns:w="http://schemas.openxmlformats.org/wordprocessingml/2006/main" xmlns:w14="http://schemas.microsoft.com/office/word/2010/wordml" xmlns:w15="http://schemas.microsoft.com/office/word/2012/wordml" xmlns:w16cei="http://schemas.microsoft.com/office/word/2026/wordml/cei" xmlns:w16cex="http://schemas.microsoft.com/office/word/2018/wordml/cex" xmlns:w16cid="http://schemas.microsoft.com/office/word/2016/wordml/cid" xmlns:w16="http://schemas.microsoft.com/office/word/2018/wordml" xmlns:w16sdtdh="http://schemas.microsoft.com/office/word/2020/wordml/sdtdatahash" xmlns:w16sdtfl="http://schemas.microsoft.com/office/word/2024/wordml/sdtformatlock" xmlns:w16se="http://schemas.microsoft.com/office/word/2015/wordml/symex" xmlns:w16du="http://schemas.microsoft.com/office/word/2023/wordml/word16du" xmlns:wne="http://schemas.microsoft.com/office/word/2006/wordml" mc:Ignorable="w14 w15 w16se w16cid w16 w16cex w16sdtdh w16sdtfl w16du wp14">
   <w:abstractNum w:abstractNumId="0" w15:restartNumberingAfterBreak="0">
     <w:nsid w:val="006715F6"/>
     <w:multiLevelType w:val="hybridMultilevel"/>
@@ -6673,38 +6722,6 @@
 </file>
 
 <file path=customXml/item1.xml><?xml version="1.0" encoding="utf-8"?>
-<?mso-contentType ?>
-<FormTemplates xmlns="http://schemas.microsoft.com/sharepoint/v3/contenttype/forms">
-  <Display>DocumentLibraryForm</Display>
-  <Edit>DocumentLibraryForm</Edit>
-  <New>DocumentLibraryForm</New>
-</FormTemplates>
-</file>
-
-<file path=customXml/item2.xml><?xml version="1.0" encoding="utf-8"?>
-<p:properties xmlns:p="http://schemas.microsoft.com/office/2006/metadata/properties" xmlns:xsi="http://www.w3.org/2001/XMLSchema-instance" xmlns:pc="http://schemas.microsoft.com/office/infopath/2007/PartnerControls">
-  <documentManagement>
-    <Category0 xmlns="bef73783-b83a-4f38-94d5-1aaaa1b3b0a2">1</Category0>
-    <i0f84bba906045b4af568ee102a52dcb xmlns="2933ac1b-cace-482f-bed9-bf9b7d80f34a">
-      <Terms xmlns="http://schemas.microsoft.com/office/infopath/2007/PartnerControls">
-        <TermInfo xmlns="http://schemas.microsoft.com/office/infopath/2007/PartnerControls">
-          <TermName xmlns="http://schemas.microsoft.com/office/infopath/2007/PartnerControls">Corporate Records</TermName>
-          <TermId xmlns="http://schemas.microsoft.com/office/infopath/2007/PartnerControls">2c702203-4f28-4769-bfc5-dad5ef3425c7</TermId>
-        </TermInfo>
-      </Terms>
-    </i0f84bba906045b4af568ee102a52dcb>
-    <TaxCatchAll xmlns="2933ac1b-cace-482f-bed9-bf9b7d80f34a">
-      <Value>1</Value>
-    </TaxCatchAll>
-  </documentManagement>
-</p:properties>
-</file>
-
-<file path=customXml/item3.xml><?xml version="1.0" encoding="utf-8"?>
-<b:Sources xmlns:b="http://schemas.openxmlformats.org/officeDocument/2006/bibliography" xmlns="http://schemas.openxmlformats.org/officeDocument/2006/bibliography" SelectedStyle="\APA.XSL" StyleName="APA"/>
-</file>
-
-<file path=customXml/item4.xml><?xml version="1.0" encoding="utf-8"?>
 <ct:contentTypeSchema xmlns:ct="http://schemas.microsoft.com/office/2006/metadata/contentType" xmlns:ma="http://schemas.microsoft.com/office/2006/metadata/properties/metaAttributes" ct:_="" ma:_="" ma:contentTypeName="Document" ma:contentTypeID="0x010100D17E1B4D89D91D49A316865B50B76B78" ma:contentTypeVersion="26" ma:contentTypeDescription="Create a new document." ma:contentTypeScope="" ma:versionID="2e43e94bda34b09537a48d601b321f81">
   <xsd:schema xmlns:xsd="http://www.w3.org/2001/XMLSchema" xmlns:xs="http://www.w3.org/2001/XMLSchema" xmlns:p="http://schemas.microsoft.com/office/2006/metadata/properties" xmlns:ns2="bef73783-b83a-4f38-94d5-1aaaa1b3b0a2" xmlns:ns3="2933ac1b-cace-482f-bed9-bf9b7d80f34a" targetNamespace="http://schemas.microsoft.com/office/2006/metadata/properties" ma:root="true" ma:fieldsID="68ad2338b471bae35515ce7eaf1f964b" ns2:_="" ns3:_="">
     <xsd:import namespace="bef73783-b83a-4f38-94d5-1aaaa1b3b0a2"/>
@@ -6919,34 +6936,39 @@
 </ct:contentTypeSchema>
 </file>
 
-<file path=customXml/itemProps1.xml><?xml version="1.0" encoding="utf-8"?>
-<ds:datastoreItem xmlns:ds="http://schemas.openxmlformats.org/officeDocument/2006/customXml" ds:itemID="{4B9B4C3B-E5DA-4AAF-B815-18D3ADD5B483}">
-  <ds:schemaRefs>
-    <ds:schemaRef ds:uri="http://schemas.microsoft.com/sharepoint/v3/contenttype/forms"/>
-  </ds:schemaRefs>
-</ds:datastoreItem>
+<file path=customXml/item2.xml><?xml version="1.0" encoding="utf-8"?>
+<b:Sources xmlns:b="http://schemas.openxmlformats.org/officeDocument/2006/bibliography" xmlns="http://schemas.openxmlformats.org/officeDocument/2006/bibliography" SelectedStyle="\APA.XSL" StyleName="APA"/>
 </file>
 
-<file path=customXml/itemProps2.xml><?xml version="1.0" encoding="utf-8"?>
-<ds:datastoreItem xmlns:ds="http://schemas.openxmlformats.org/officeDocument/2006/customXml" ds:itemID="{964363DD-6ED8-48FA-9DAB-FFE1A6F5C7B6}">
-  <ds:schemaRefs>
-    <ds:schemaRef ds:uri="http://schemas.microsoft.com/office/2006/metadata/properties"/>
-    <ds:schemaRef ds:uri="http://schemas.microsoft.com/office/infopath/2007/PartnerControls"/>
-    <ds:schemaRef ds:uri="bef73783-b83a-4f38-94d5-1aaaa1b3b0a2"/>
-    <ds:schemaRef ds:uri="2933ac1b-cace-482f-bed9-bf9b7d80f34a"/>
-  </ds:schemaRefs>
-</ds:datastoreItem>
+<file path=customXml/item3.xml><?xml version="1.0" encoding="utf-8"?>
+<p:properties xmlns:p="http://schemas.microsoft.com/office/2006/metadata/properties" xmlns:xsi="http://www.w3.org/2001/XMLSchema-instance" xmlns:pc="http://schemas.microsoft.com/office/infopath/2007/PartnerControls">
+  <documentManagement>
+    <Category0 xmlns="bef73783-b83a-4f38-94d5-1aaaa1b3b0a2">1</Category0>
+    <i0f84bba906045b4af568ee102a52dcb xmlns="2933ac1b-cace-482f-bed9-bf9b7d80f34a">
+      <Terms xmlns="http://schemas.microsoft.com/office/infopath/2007/PartnerControls">
+        <TermInfo xmlns="http://schemas.microsoft.com/office/infopath/2007/PartnerControls">
+          <TermName xmlns="http://schemas.microsoft.com/office/infopath/2007/PartnerControls">Corporate Records</TermName>
+          <TermId xmlns="http://schemas.microsoft.com/office/infopath/2007/PartnerControls">2c702203-4f28-4769-bfc5-dad5ef3425c7</TermId>
+        </TermInfo>
+      </Terms>
+    </i0f84bba906045b4af568ee102a52dcb>
+    <TaxCatchAll xmlns="2933ac1b-cace-482f-bed9-bf9b7d80f34a">
+      <Value>1</Value>
+    </TaxCatchAll>
+  </documentManagement>
+</p:properties>
 </file>
 
-<file path=customXml/itemProps3.xml><?xml version="1.0" encoding="utf-8"?>
-<ds:datastoreItem xmlns:ds="http://schemas.openxmlformats.org/officeDocument/2006/customXml" ds:itemID="{B00AC358-B62E-4B92-87CA-9C4642B1F30B}">
-  <ds:schemaRefs>
-    <ds:schemaRef ds:uri="http://schemas.openxmlformats.org/officeDocument/2006/bibliography"/>
-  </ds:schemaRefs>
-</ds:datastoreItem>
+<file path=customXml/item4.xml><?xml version="1.0" encoding="utf-8"?>
+<?mso-contentType ?>
+<FormTemplates xmlns="http://schemas.microsoft.com/sharepoint/v3/contenttype/forms">
+  <Display>DocumentLibraryForm</Display>
+  <Edit>DocumentLibraryForm</Edit>
+  <New>DocumentLibraryForm</New>
+</FormTemplates>
 </file>
 
-<file path=customXml/itemProps4.xml><?xml version="1.0" encoding="utf-8"?>
+<file path=customXml/itemProps1.xml><?xml version="1.0" encoding="utf-8"?>
 <ds:datastoreItem xmlns:ds="http://schemas.openxmlformats.org/officeDocument/2006/customXml" ds:itemID="{A160A6A7-E4CF-4464-8769-5D74BD27FF60}">
   <ds:schemaRefs>
     <ds:schemaRef ds:uri="http://schemas.microsoft.com/office/2006/metadata/contentType"/>
@@ -6963,4 +6985,31 @@
     <ds:schemaRef ds:uri="http://schemas.microsoft.com/internal/obd"/>
   </ds:schemaRefs>
 </ds:datastoreItem>
+</file>
+
+<file path=customXml/itemProps2.xml><?xml version="1.0" encoding="utf-8"?>
+<ds:datastoreItem xmlns:ds="http://schemas.openxmlformats.org/officeDocument/2006/customXml" ds:itemID="{B00AC358-B62E-4B92-87CA-9C4642B1F30B}">
+  <ds:schemaRefs>
+    <ds:schemaRef ds:uri="http://schemas.openxmlformats.org/officeDocument/2006/bibliography"/>
+  </ds:schemaRefs>
+</ds:datastoreItem>
+</file>
+
+<file path=customXml/itemProps3.xml><?xml version="1.0" encoding="utf-8"?>
+<ds:datastoreItem xmlns:ds="http://schemas.openxmlformats.org/officeDocument/2006/customXml" ds:itemID="{964363DD-6ED8-48FA-9DAB-FFE1A6F5C7B6}">
+  <ds:schemaRefs>
+    <ds:schemaRef ds:uri="http://schemas.microsoft.com/office/2006/metadata/properties"/>
+    <ds:schemaRef ds:uri="http://schemas.microsoft.com/office/infopath/2007/PartnerControls"/>
+    <ds:schemaRef ds:uri="bef73783-b83a-4f38-94d5-1aaaa1b3b0a2"/>
+    <ds:schemaRef ds:uri="2933ac1b-cace-482f-bed9-bf9b7d80f34a"/>
+  </ds:schemaRefs>
+</ds:datastoreItem>
+</file>
+
+<file path=customXml/itemProps4.xml><?xml version="1.0" encoding="utf-8"?>
+<ds:datastoreItem xmlns:ds="http://schemas.openxmlformats.org/officeDocument/2006/customXml" ds:itemID="{4B9B4C3B-E5DA-4AAF-B815-18D3ADD5B483}">
+  <ds:schemaRefs>
+    <ds:schemaRef ds:uri="http://schemas.microsoft.com/sharepoint/v3/contenttype/forms"/>
+  </ds:schemaRefs>
+</ds:datastoreItem>
 </file>
</xml_diff>